<commit_message>
docs(report): update TP figures with Spin, race, efficiency and GitHub evidence
</commit_message>
<xml_diff>
--- a/Documentos/CC65-TP-202620-U201714492.docx
+++ b/Documentos/CC65-TP-202620-U201714492.docx
@@ -492,7 +492,7 @@
           <w:b/>
           <w:noProof/>
         </w:rPr>
-        <w:instrText xml:space="preserve"> PAGEREF _Toc241968037 \h </w:instrText>
+        <w:instrText xml:space="preserve"> PAGEREF _Toc242038945 \h </w:instrText>
       </w:r>
       <w:r>
         <w:rPr>
@@ -567,7 +567,7 @@
           <w:b/>
           <w:noProof/>
         </w:rPr>
-        <w:instrText xml:space="preserve"> PAGEREF _Toc241968038 \h </w:instrText>
+        <w:instrText xml:space="preserve"> PAGEREF _Toc242038946 \h </w:instrText>
       </w:r>
       <w:r>
         <w:rPr>
@@ -637,7 +637,7 @@
         <w:rPr>
           <w:noProof/>
         </w:rPr>
-        <w:instrText xml:space="preserve"> PAGEREF _Toc241968039 \h </w:instrText>
+        <w:instrText xml:space="preserve"> PAGEREF _Toc242038947 \h </w:instrText>
       </w:r>
       <w:r>
         <w:rPr>
@@ -703,7 +703,7 @@
         <w:rPr>
           <w:noProof/>
         </w:rPr>
-        <w:instrText xml:space="preserve"> PAGEREF _Toc241968040 \h </w:instrText>
+        <w:instrText xml:space="preserve"> PAGEREF _Toc242038948 \h </w:instrText>
       </w:r>
       <w:r>
         <w:rPr>
@@ -774,7 +774,7 @@
           <w:b/>
           <w:noProof/>
         </w:rPr>
-        <w:instrText xml:space="preserve"> PAGEREF _Toc241968041 \h </w:instrText>
+        <w:instrText xml:space="preserve"> PAGEREF _Toc242038949 \h </w:instrText>
       </w:r>
       <w:r>
         <w:rPr>
@@ -844,7 +844,7 @@
         <w:rPr>
           <w:noProof/>
         </w:rPr>
-        <w:instrText xml:space="preserve"> PAGEREF _Toc241968042 \h </w:instrText>
+        <w:instrText xml:space="preserve"> PAGEREF _Toc242038950 \h </w:instrText>
       </w:r>
       <w:r>
         <w:rPr>
@@ -910,7 +910,7 @@
         <w:rPr>
           <w:noProof/>
         </w:rPr>
-        <w:instrText xml:space="preserve"> PAGEREF _Toc241968043 \h </w:instrText>
+        <w:instrText xml:space="preserve"> PAGEREF _Toc242038951 \h </w:instrText>
       </w:r>
       <w:r>
         <w:rPr>
@@ -976,7 +976,7 @@
         <w:rPr>
           <w:noProof/>
         </w:rPr>
-        <w:instrText xml:space="preserve"> PAGEREF _Toc241968044 \h </w:instrText>
+        <w:instrText xml:space="preserve"> PAGEREF _Toc242038952 \h </w:instrText>
       </w:r>
       <w:r>
         <w:rPr>
@@ -1042,7 +1042,7 @@
         <w:rPr>
           <w:noProof/>
         </w:rPr>
-        <w:instrText xml:space="preserve"> PAGEREF _Toc241968045 \h </w:instrText>
+        <w:instrText xml:space="preserve"> PAGEREF _Toc242038953 \h </w:instrText>
       </w:r>
       <w:r>
         <w:rPr>
@@ -1108,7 +1108,7 @@
         <w:rPr>
           <w:noProof/>
         </w:rPr>
-        <w:instrText xml:space="preserve"> PAGEREF _Toc241968046 \h </w:instrText>
+        <w:instrText xml:space="preserve"> PAGEREF _Toc242038954 \h </w:instrText>
       </w:r>
       <w:r>
         <w:rPr>
@@ -1174,7 +1174,7 @@
         <w:rPr>
           <w:noProof/>
         </w:rPr>
-        <w:instrText xml:space="preserve"> PAGEREF _Toc241968047 \h </w:instrText>
+        <w:instrText xml:space="preserve"> PAGEREF _Toc242038955 \h </w:instrText>
       </w:r>
       <w:r>
         <w:rPr>
@@ -1240,7 +1240,7 @@
         <w:rPr>
           <w:noProof/>
         </w:rPr>
-        <w:instrText xml:space="preserve"> PAGEREF _Toc241968048 \h </w:instrText>
+        <w:instrText xml:space="preserve"> PAGEREF _Toc242038956 \h </w:instrText>
       </w:r>
       <w:r>
         <w:rPr>
@@ -1306,7 +1306,7 @@
         <w:rPr>
           <w:noProof/>
         </w:rPr>
-        <w:instrText xml:space="preserve"> PAGEREF _Toc241968049 \h </w:instrText>
+        <w:instrText xml:space="preserve"> PAGEREF _Toc242038957 \h </w:instrText>
       </w:r>
       <w:r>
         <w:rPr>
@@ -1377,7 +1377,7 @@
           <w:b/>
           <w:noProof/>
         </w:rPr>
-        <w:instrText xml:space="preserve"> PAGEREF _Toc241968050 \h </w:instrText>
+        <w:instrText xml:space="preserve"> PAGEREF _Toc242038958 \h </w:instrText>
       </w:r>
       <w:r>
         <w:rPr>
@@ -1447,7 +1447,7 @@
         <w:rPr>
           <w:noProof/>
         </w:rPr>
-        <w:instrText xml:space="preserve"> PAGEREF _Toc241968051 \h </w:instrText>
+        <w:instrText xml:space="preserve"> PAGEREF _Toc242038959 \h </w:instrText>
       </w:r>
       <w:r>
         <w:rPr>
@@ -1513,7 +1513,7 @@
         <w:rPr>
           <w:noProof/>
         </w:rPr>
-        <w:instrText xml:space="preserve"> PAGEREF _Toc241968052 \h </w:instrText>
+        <w:instrText xml:space="preserve"> PAGEREF _Toc242038960 \h </w:instrText>
       </w:r>
       <w:r>
         <w:rPr>
@@ -1584,7 +1584,7 @@
           <w:b/>
           <w:noProof/>
         </w:rPr>
-        <w:instrText xml:space="preserve"> PAGEREF _Toc241968053 \h </w:instrText>
+        <w:instrText xml:space="preserve"> PAGEREF _Toc242038961 \h </w:instrText>
       </w:r>
       <w:r>
         <w:rPr>
@@ -1654,7 +1654,7 @@
         <w:rPr>
           <w:noProof/>
         </w:rPr>
-        <w:instrText xml:space="preserve"> PAGEREF _Toc241968054 \h </w:instrText>
+        <w:instrText xml:space="preserve"> PAGEREF _Toc242038962 \h </w:instrText>
       </w:r>
       <w:r>
         <w:rPr>
@@ -1720,7 +1720,7 @@
         <w:rPr>
           <w:noProof/>
         </w:rPr>
-        <w:instrText xml:space="preserve"> PAGEREF _Toc241968055 \h </w:instrText>
+        <w:instrText xml:space="preserve"> PAGEREF _Toc242038963 \h </w:instrText>
       </w:r>
       <w:r>
         <w:rPr>
@@ -1791,7 +1791,7 @@
           <w:b/>
           <w:noProof/>
         </w:rPr>
-        <w:instrText xml:space="preserve"> PAGEREF _Toc241968056 \h </w:instrText>
+        <w:instrText xml:space="preserve"> PAGEREF _Toc242038964 \h </w:instrText>
       </w:r>
       <w:r>
         <w:rPr>
@@ -1860,7 +1860,7 @@
         <w:rPr>
           <w:noProof/>
         </w:rPr>
-        <w:instrText xml:space="preserve"> PAGEREF _Toc241968057 \h </w:instrText>
+        <w:instrText xml:space="preserve"> PAGEREF _Toc242038965 \h </w:instrText>
       </w:r>
       <w:r>
         <w:rPr>
@@ -1925,7 +1925,7 @@
         <w:rPr>
           <w:noProof/>
         </w:rPr>
-        <w:instrText xml:space="preserve"> PAGEREF _Toc241968058 \h </w:instrText>
+        <w:instrText xml:space="preserve"> PAGEREF _Toc242038966 \h </w:instrText>
       </w:r>
       <w:r>
         <w:rPr>
@@ -1990,7 +1990,7 @@
         <w:rPr>
           <w:noProof/>
         </w:rPr>
-        <w:instrText xml:space="preserve"> PAGEREF _Toc241968059 \h </w:instrText>
+        <w:instrText xml:space="preserve"> PAGEREF _Toc242038967 \h </w:instrText>
       </w:r>
       <w:r>
         <w:rPr>
@@ -2055,7 +2055,7 @@
         <w:rPr>
           <w:noProof/>
         </w:rPr>
-        <w:instrText xml:space="preserve"> PAGEREF _Toc241968060 \h </w:instrText>
+        <w:instrText xml:space="preserve"> PAGEREF _Toc242038968 \h </w:instrText>
       </w:r>
       <w:r>
         <w:rPr>
@@ -2126,7 +2126,7 @@
           <w:b/>
           <w:noProof/>
         </w:rPr>
-        <w:instrText xml:space="preserve"> PAGEREF _Toc241968061 \h </w:instrText>
+        <w:instrText xml:space="preserve"> PAGEREF _Toc242038969 \h </w:instrText>
       </w:r>
       <w:r>
         <w:rPr>
@@ -2195,7 +2195,7 @@
         <w:rPr>
           <w:noProof/>
         </w:rPr>
-        <w:instrText xml:space="preserve"> PAGEREF _Toc241968062 \h </w:instrText>
+        <w:instrText xml:space="preserve"> PAGEREF _Toc242038970 \h </w:instrText>
       </w:r>
       <w:r>
         <w:rPr>
@@ -2260,7 +2260,7 @@
         <w:rPr>
           <w:noProof/>
         </w:rPr>
-        <w:instrText xml:space="preserve"> PAGEREF _Toc241968063 \h </w:instrText>
+        <w:instrText xml:space="preserve"> PAGEREF _Toc242038971 \h </w:instrText>
       </w:r>
       <w:r>
         <w:rPr>
@@ -2325,7 +2325,7 @@
         <w:rPr>
           <w:noProof/>
         </w:rPr>
-        <w:instrText xml:space="preserve"> PAGEREF _Toc241968064 \h </w:instrText>
+        <w:instrText xml:space="preserve"> PAGEREF _Toc242038972 \h </w:instrText>
       </w:r>
       <w:r>
         <w:rPr>
@@ -2390,7 +2390,7 @@
         <w:rPr>
           <w:noProof/>
         </w:rPr>
-        <w:instrText xml:space="preserve"> PAGEREF _Toc241968065 \h </w:instrText>
+        <w:instrText xml:space="preserve"> PAGEREF _Toc242038973 \h </w:instrText>
       </w:r>
       <w:r>
         <w:rPr>
@@ -2455,7 +2455,7 @@
         <w:rPr>
           <w:noProof/>
         </w:rPr>
-        <w:instrText xml:space="preserve"> PAGEREF _Toc241968066 \h </w:instrText>
+        <w:instrText xml:space="preserve"> PAGEREF _Toc242038974 \h </w:instrText>
       </w:r>
       <w:r>
         <w:rPr>
@@ -2526,7 +2526,7 @@
           <w:b/>
           <w:noProof/>
         </w:rPr>
-        <w:instrText xml:space="preserve"> PAGEREF _Toc241968067 \h </w:instrText>
+        <w:instrText xml:space="preserve"> PAGEREF _Toc242038975 \h </w:instrText>
       </w:r>
       <w:r>
         <w:rPr>
@@ -2595,7 +2595,7 @@
         <w:rPr>
           <w:noProof/>
         </w:rPr>
-        <w:instrText xml:space="preserve"> PAGEREF _Toc241968068 \h </w:instrText>
+        <w:instrText xml:space="preserve"> PAGEREF _Toc242038976 \h </w:instrText>
       </w:r>
       <w:r>
         <w:rPr>
@@ -2660,7 +2660,7 @@
         <w:rPr>
           <w:noProof/>
         </w:rPr>
-        <w:instrText xml:space="preserve"> PAGEREF _Toc241968069 \h </w:instrText>
+        <w:instrText xml:space="preserve"> PAGEREF _Toc242038977 \h </w:instrText>
       </w:r>
       <w:r>
         <w:rPr>
@@ -2725,7 +2725,7 @@
         <w:rPr>
           <w:noProof/>
         </w:rPr>
-        <w:instrText xml:space="preserve"> PAGEREF _Toc241968070 \h </w:instrText>
+        <w:instrText xml:space="preserve"> PAGEREF _Toc242038978 \h </w:instrText>
       </w:r>
       <w:r>
         <w:rPr>
@@ -2791,7 +2791,7 @@
         <w:rPr>
           <w:noProof/>
         </w:rPr>
-        <w:instrText xml:space="preserve"> PAGEREF _Toc241968071 \h </w:instrText>
+        <w:instrText xml:space="preserve"> PAGEREF _Toc242038979 \h </w:instrText>
       </w:r>
       <w:r>
         <w:rPr>
@@ -2862,7 +2862,7 @@
           <w:b/>
           <w:noProof/>
         </w:rPr>
-        <w:instrText xml:space="preserve"> PAGEREF _Toc241968072 \h </w:instrText>
+        <w:instrText xml:space="preserve"> PAGEREF _Toc242038980 \h </w:instrText>
       </w:r>
       <w:r>
         <w:rPr>
@@ -2931,7 +2931,7 @@
         <w:rPr>
           <w:noProof/>
         </w:rPr>
-        <w:instrText xml:space="preserve"> PAGEREF _Toc241968073 \h </w:instrText>
+        <w:instrText xml:space="preserve"> PAGEREF _Toc242038981 \h </w:instrText>
       </w:r>
       <w:r>
         <w:rPr>
@@ -2996,7 +2996,7 @@
         <w:rPr>
           <w:noProof/>
         </w:rPr>
-        <w:instrText xml:space="preserve"> PAGEREF _Toc241968074 \h </w:instrText>
+        <w:instrText xml:space="preserve"> PAGEREF _Toc242038982 \h </w:instrText>
       </w:r>
       <w:r>
         <w:rPr>
@@ -3061,7 +3061,7 @@
         <w:rPr>
           <w:noProof/>
         </w:rPr>
-        <w:instrText xml:space="preserve"> PAGEREF _Toc241968075 \h </w:instrText>
+        <w:instrText xml:space="preserve"> PAGEREF _Toc242038983 \h </w:instrText>
       </w:r>
       <w:r>
         <w:rPr>
@@ -3126,7 +3126,7 @@
         <w:rPr>
           <w:noProof/>
         </w:rPr>
-        <w:instrText xml:space="preserve"> PAGEREF _Toc241968076 \h </w:instrText>
+        <w:instrText xml:space="preserve"> PAGEREF _Toc242038984 \h </w:instrText>
       </w:r>
       <w:r>
         <w:rPr>
@@ -3197,7 +3197,7 @@
           <w:b/>
           <w:noProof/>
         </w:rPr>
-        <w:instrText xml:space="preserve"> PAGEREF _Toc241968077 \h </w:instrText>
+        <w:instrText xml:space="preserve"> PAGEREF _Toc242038985 \h </w:instrText>
       </w:r>
       <w:r>
         <w:rPr>
@@ -3266,7 +3266,7 @@
         <w:rPr>
           <w:noProof/>
         </w:rPr>
-        <w:instrText xml:space="preserve"> PAGEREF _Toc241968078 \h </w:instrText>
+        <w:instrText xml:space="preserve"> PAGEREF _Toc242038986 \h </w:instrText>
       </w:r>
       <w:r>
         <w:rPr>
@@ -3331,7 +3331,7 @@
         <w:rPr>
           <w:noProof/>
         </w:rPr>
-        <w:instrText xml:space="preserve"> PAGEREF _Toc241968079 \h </w:instrText>
+        <w:instrText xml:space="preserve"> PAGEREF _Toc242038987 \h </w:instrText>
       </w:r>
       <w:r>
         <w:rPr>
@@ -3348,7 +3348,7 @@
         <w:rPr>
           <w:noProof/>
         </w:rPr>
-        <w:t>41</w:t>
+        <w:t>42</w:t>
       </w:r>
       <w:r>
         <w:rPr>
@@ -3396,7 +3396,7 @@
         <w:rPr>
           <w:noProof/>
         </w:rPr>
-        <w:instrText xml:space="preserve"> PAGEREF _Toc241968080 \h </w:instrText>
+        <w:instrText xml:space="preserve"> PAGEREF _Toc242038988 \h </w:instrText>
       </w:r>
       <w:r>
         <w:rPr>
@@ -3462,7 +3462,7 @@
         <w:rPr>
           <w:noProof/>
         </w:rPr>
-        <w:instrText xml:space="preserve"> PAGEREF _Toc241968081 \h </w:instrText>
+        <w:instrText xml:space="preserve"> PAGEREF _Toc242038989 \h </w:instrText>
       </w:r>
       <w:r>
         <w:rPr>
@@ -3479,7 +3479,7 @@
         <w:rPr>
           <w:noProof/>
         </w:rPr>
-        <w:t>42</w:t>
+        <w:t>43</w:t>
       </w:r>
       <w:r>
         <w:rPr>
@@ -3533,7 +3533,7 @@
           <w:b/>
           <w:noProof/>
         </w:rPr>
-        <w:instrText xml:space="preserve"> PAGEREF _Toc241968082 \h </w:instrText>
+        <w:instrText xml:space="preserve"> PAGEREF _Toc242038990 \h </w:instrText>
       </w:r>
       <w:r>
         <w:rPr>
@@ -3553,7 +3553,7 @@
           <w:b/>
           <w:noProof/>
         </w:rPr>
-        <w:t>43</w:t>
+        <w:t>44</w:t>
       </w:r>
       <w:r>
         <w:rPr>
@@ -3602,7 +3602,7 @@
         <w:rPr>
           <w:noProof/>
         </w:rPr>
-        <w:instrText xml:space="preserve"> PAGEREF _Toc241968083 \h </w:instrText>
+        <w:instrText xml:space="preserve"> PAGEREF _Toc242038991 \h </w:instrText>
       </w:r>
       <w:r>
         <w:rPr>
@@ -3619,7 +3619,7 @@
         <w:rPr>
           <w:noProof/>
         </w:rPr>
-        <w:t>43</w:t>
+        <w:t>44</w:t>
       </w:r>
       <w:r>
         <w:rPr>
@@ -3667,7 +3667,7 @@
         <w:rPr>
           <w:noProof/>
         </w:rPr>
-        <w:instrText xml:space="preserve"> PAGEREF _Toc241968084 \h </w:instrText>
+        <w:instrText xml:space="preserve"> PAGEREF _Toc242038992 \h </w:instrText>
       </w:r>
       <w:r>
         <w:rPr>
@@ -3684,7 +3684,7 @@
         <w:rPr>
           <w:noProof/>
         </w:rPr>
-        <w:t>44</w:t>
+        <w:t>45</w:t>
       </w:r>
       <w:r>
         <w:rPr>
@@ -3732,7 +3732,7 @@
         <w:rPr>
           <w:noProof/>
         </w:rPr>
-        <w:instrText xml:space="preserve"> PAGEREF _Toc241968085 \h </w:instrText>
+        <w:instrText xml:space="preserve"> PAGEREF _Toc242038993 \h </w:instrText>
       </w:r>
       <w:r>
         <w:rPr>
@@ -3749,7 +3749,7 @@
         <w:rPr>
           <w:noProof/>
         </w:rPr>
-        <w:t>45</w:t>
+        <w:t>47</w:t>
       </w:r>
       <w:r>
         <w:rPr>
@@ -3803,7 +3803,7 @@
           <w:b/>
           <w:noProof/>
         </w:rPr>
-        <w:instrText xml:space="preserve"> PAGEREF _Toc241968086 \h </w:instrText>
+        <w:instrText xml:space="preserve"> PAGEREF _Toc242038994 \h </w:instrText>
       </w:r>
       <w:r>
         <w:rPr>
@@ -3823,7 +3823,7 @@
           <w:b/>
           <w:noProof/>
         </w:rPr>
-        <w:t>47</w:t>
+        <w:t>49</w:t>
       </w:r>
       <w:r>
         <w:rPr>
@@ -3878,7 +3878,7 @@
           <w:b/>
           <w:noProof/>
         </w:rPr>
-        <w:instrText xml:space="preserve"> PAGEREF _Toc241968087 \h </w:instrText>
+        <w:instrText xml:space="preserve"> PAGEREF _Toc242038995 \h </w:instrText>
       </w:r>
       <w:r>
         <w:rPr>
@@ -3898,7 +3898,7 @@
           <w:b/>
           <w:noProof/>
         </w:rPr>
-        <w:t>48</w:t>
+        <w:t>50</w:t>
       </w:r>
       <w:r>
         <w:rPr>
@@ -3953,7 +3953,7 @@
           <w:b/>
           <w:noProof/>
         </w:rPr>
-        <w:instrText xml:space="preserve"> PAGEREF _Toc241968088 \h </w:instrText>
+        <w:instrText xml:space="preserve"> PAGEREF _Toc242038996 \h </w:instrText>
       </w:r>
       <w:r>
         <w:rPr>
@@ -3973,7 +3973,7 @@
           <w:b/>
           <w:noProof/>
         </w:rPr>
-        <w:t>48</w:t>
+        <w:t>51</w:t>
       </w:r>
       <w:r>
         <w:rPr>
@@ -4023,7 +4023,7 @@
         <w:rPr>
           <w:noProof/>
         </w:rPr>
-        <w:instrText xml:space="preserve"> PAGEREF _Toc241968089 \h </w:instrText>
+        <w:instrText xml:space="preserve"> PAGEREF _Toc242038997 \h </w:instrText>
       </w:r>
       <w:r>
         <w:rPr>
@@ -4040,7 +4040,7 @@
         <w:rPr>
           <w:noProof/>
         </w:rPr>
-        <w:t>48</w:t>
+        <w:t>51</w:t>
       </w:r>
       <w:r>
         <w:rPr>
@@ -4089,7 +4089,7 @@
         <w:rPr>
           <w:noProof/>
         </w:rPr>
-        <w:instrText xml:space="preserve"> PAGEREF _Toc241968090 \h </w:instrText>
+        <w:instrText xml:space="preserve"> PAGEREF _Toc242038998 \h </w:instrText>
       </w:r>
       <w:r>
         <w:rPr>
@@ -4106,7 +4106,7 @@
         <w:rPr>
           <w:noProof/>
         </w:rPr>
-        <w:t>48</w:t>
+        <w:t>51</w:t>
       </w:r>
       <w:r>
         <w:rPr>
@@ -4155,7 +4155,7 @@
         <w:rPr>
           <w:noProof/>
         </w:rPr>
-        <w:instrText xml:space="preserve"> PAGEREF _Toc241968091 \h </w:instrText>
+        <w:instrText xml:space="preserve"> PAGEREF _Toc242038999 \h </w:instrText>
       </w:r>
       <w:r>
         <w:rPr>
@@ -4172,7 +4172,7 @@
         <w:rPr>
           <w:noProof/>
         </w:rPr>
-        <w:t>49</w:t>
+        <w:t>53</w:t>
       </w:r>
       <w:r>
         <w:rPr>
@@ -4226,7 +4226,7 @@
           <w:b/>
           <w:noProof/>
         </w:rPr>
-        <w:instrText xml:space="preserve"> PAGEREF _Toc241968092 \h </w:instrText>
+        <w:instrText xml:space="preserve"> PAGEREF _Toc242039000 \h </w:instrText>
       </w:r>
       <w:r>
         <w:rPr>
@@ -4246,7 +4246,7 @@
           <w:b/>
           <w:noProof/>
         </w:rPr>
-        <w:t>49</w:t>
+        <w:t>54</w:t>
       </w:r>
       <w:r>
         <w:rPr>
@@ -4296,7 +4296,7 @@
         <w:rPr>
           <w:noProof/>
         </w:rPr>
-        <w:instrText xml:space="preserve"> PAGEREF _Toc241968093 \h </w:instrText>
+        <w:instrText xml:space="preserve"> PAGEREF _Toc242039001 \h </w:instrText>
       </w:r>
       <w:r>
         <w:rPr>
@@ -4313,7 +4313,7 @@
         <w:rPr>
           <w:noProof/>
         </w:rPr>
-        <w:t>49</w:t>
+        <w:t>54</w:t>
       </w:r>
       <w:r>
         <w:rPr>
@@ -4362,7 +4362,7 @@
         <w:rPr>
           <w:noProof/>
         </w:rPr>
-        <w:instrText xml:space="preserve"> PAGEREF _Toc241968094 \h </w:instrText>
+        <w:instrText xml:space="preserve"> PAGEREF _Toc242039002 \h </w:instrText>
       </w:r>
       <w:r>
         <w:rPr>
@@ -4379,7 +4379,7 @@
         <w:rPr>
           <w:noProof/>
         </w:rPr>
-        <w:t>50</w:t>
+        <w:t>54</w:t>
       </w:r>
       <w:r>
         <w:rPr>
@@ -4428,7 +4428,7 @@
         <w:rPr>
           <w:noProof/>
         </w:rPr>
-        <w:instrText xml:space="preserve"> PAGEREF _Toc241968095 \h </w:instrText>
+        <w:instrText xml:space="preserve"> PAGEREF _Toc242039003 \h </w:instrText>
       </w:r>
       <w:r>
         <w:rPr>
@@ -4445,7 +4445,7 @@
         <w:rPr>
           <w:noProof/>
         </w:rPr>
-        <w:t>50</w:t>
+        <w:t>56</w:t>
       </w:r>
       <w:r>
         <w:rPr>
@@ -4499,7 +4499,7 @@
           <w:b/>
           <w:noProof/>
         </w:rPr>
-        <w:instrText xml:space="preserve"> PAGEREF _Toc241968096 \h </w:instrText>
+        <w:instrText xml:space="preserve"> PAGEREF _Toc242039004 \h </w:instrText>
       </w:r>
       <w:r>
         <w:rPr>
@@ -4519,7 +4519,7 @@
           <w:b/>
           <w:noProof/>
         </w:rPr>
-        <w:t>51</w:t>
+        <w:t>57</w:t>
       </w:r>
       <w:r>
         <w:rPr>
@@ -4569,7 +4569,7 @@
         <w:rPr>
           <w:noProof/>
         </w:rPr>
-        <w:instrText xml:space="preserve"> PAGEREF _Toc241968097 \h </w:instrText>
+        <w:instrText xml:space="preserve"> PAGEREF _Toc242039005 \h </w:instrText>
       </w:r>
       <w:r>
         <w:rPr>
@@ -4586,7 +4586,7 @@
         <w:rPr>
           <w:noProof/>
         </w:rPr>
-        <w:t>51</w:t>
+        <w:t>57</w:t>
       </w:r>
       <w:r>
         <w:rPr>
@@ -4635,7 +4635,7 @@
         <w:rPr>
           <w:noProof/>
         </w:rPr>
-        <w:instrText xml:space="preserve"> PAGEREF _Toc241968098 \h </w:instrText>
+        <w:instrText xml:space="preserve"> PAGEREF _Toc242039006 \h </w:instrText>
       </w:r>
       <w:r>
         <w:rPr>
@@ -4652,7 +4652,7 @@
         <w:rPr>
           <w:noProof/>
         </w:rPr>
-        <w:t>51</w:t>
+        <w:t>57</w:t>
       </w:r>
       <w:r>
         <w:rPr>
@@ -4701,7 +4701,7 @@
         <w:rPr>
           <w:noProof/>
         </w:rPr>
-        <w:instrText xml:space="preserve"> PAGEREF _Toc241968099 \h </w:instrText>
+        <w:instrText xml:space="preserve"> PAGEREF _Toc242039007 \h </w:instrText>
       </w:r>
       <w:r>
         <w:rPr>
@@ -4718,7 +4718,7 @@
         <w:rPr>
           <w:noProof/>
         </w:rPr>
-        <w:t>51</w:t>
+        <w:t>58</w:t>
       </w:r>
       <w:r>
         <w:rPr>
@@ -4772,7 +4772,7 @@
           <w:b/>
           <w:noProof/>
         </w:rPr>
-        <w:instrText xml:space="preserve"> PAGEREF _Toc241968100 \h </w:instrText>
+        <w:instrText xml:space="preserve"> PAGEREF _Toc242039008 \h </w:instrText>
       </w:r>
       <w:r>
         <w:rPr>
@@ -4792,7 +4792,7 @@
           <w:b/>
           <w:noProof/>
         </w:rPr>
-        <w:t>51</w:t>
+        <w:t>58</w:t>
       </w:r>
       <w:r>
         <w:rPr>
@@ -4847,7 +4847,7 @@
           <w:b/>
           <w:noProof/>
         </w:rPr>
-        <w:instrText xml:space="preserve"> PAGEREF _Toc241968101 \h </w:instrText>
+        <w:instrText xml:space="preserve"> PAGEREF _Toc242039009 \h </w:instrText>
       </w:r>
       <w:r>
         <w:rPr>
@@ -4867,7 +4867,7 @@
           <w:b/>
           <w:noProof/>
         </w:rPr>
-        <w:t>52</w:t>
+        <w:t>58</w:t>
       </w:r>
       <w:r>
         <w:rPr>
@@ -5202,7 +5202,7 @@
           <w:szCs w:val="24"/>
         </w:rPr>
       </w:pPr>
-      <w:bookmarkStart w:id="0" w:name="_Toc241968037"/>
+      <w:bookmarkStart w:id="0" w:name="_Toc242038945"/>
       <w:r>
         <w:rPr>
           <w:rFonts w:ascii="Times New Roman" w:eastAsia="Times New Roman" w:hAnsi="Times New Roman" w:cs="Times New Roman"/>
@@ -5250,7 +5250,16 @@
           <w:sz w:val="24"/>
           <w:szCs w:val="24"/>
         </w:rPr>
-        <w:t>Para la versión concurrente se implementó un patrón Worker Pool basado en goroutines, channels y sync.WaitGroup, donde cada worker calcula gradientes parciales sobre una partición de los datos y posteriormente estos resultados son agregados antes de actualizar los parámetros del modelo. La lógica de sincronización fue representada mediante Promela y verificada con SPIN, cuya exploración exhaustiva alcanzó 143,799 estados y 241,264 transiciones sin detectar errores (errors: 0).</w:t>
+        <w:t xml:space="preserve">Para la versión concurrente se implementó un patrón Worker Pool basado en goroutines, channels y sync.WaitGroup, donde cada worker calcula gradientes parciales sobre una </w:t>
+      </w:r>
+      <w:r>
+        <w:rPr>
+          <w:rFonts w:ascii="Times New Roman" w:eastAsia="Times New Roman" w:hAnsi="Times New Roman" w:cs="Times New Roman"/>
+          <w:sz w:val="24"/>
+          <w:szCs w:val="24"/>
+        </w:rPr>
+        <w:lastRenderedPageBreak/>
+        <w:t>partición de los datos y posteriormente estos resultados son agregados antes de actualizar los parámetros del modelo. La lógica de sincronización fue representada mediante Promela y verificada con SPIN, cuya exploración exhaustiva alcanzó 143,799 estados y 241,264 transiciones sin detectar errores (errors: 0).</w:t>
       </w:r>
     </w:p>
     <w:p>
@@ -5333,7 +5342,7 @@
           <w:szCs w:val="24"/>
         </w:rPr>
       </w:pPr>
-      <w:bookmarkStart w:id="1" w:name="_Toc241968038"/>
+      <w:bookmarkStart w:id="1" w:name="_Toc242038946"/>
       <w:r>
         <w:rPr>
           <w:rFonts w:ascii="Times New Roman" w:eastAsia="Times New Roman" w:hAnsi="Times New Roman" w:cs="Times New Roman"/>
@@ -5361,7 +5370,7 @@
           <w:szCs w:val="24"/>
         </w:rPr>
       </w:pPr>
-      <w:bookmarkStart w:id="2" w:name="_Toc241968039"/>
+      <w:bookmarkStart w:id="2" w:name="_Toc242038947"/>
       <w:r>
         <w:rPr>
           <w:rFonts w:ascii="Times New Roman" w:eastAsia="Times New Roman" w:hAnsi="Times New Roman" w:cs="Times New Roman"/>
@@ -5408,7 +5417,7 @@
           <w:szCs w:val="24"/>
         </w:rPr>
       </w:pPr>
-      <w:bookmarkStart w:id="3" w:name="_Toc241968040"/>
+      <w:bookmarkStart w:id="3" w:name="_Toc242038948"/>
       <w:r>
         <w:rPr>
           <w:rFonts w:ascii="Times New Roman" w:eastAsia="Times New Roman" w:hAnsi="Times New Roman" w:cs="Times New Roman"/>
@@ -5506,6 +5515,7 @@
           <w:sz w:val="24"/>
           <w:szCs w:val="24"/>
         </w:rPr>
+        <w:lastRenderedPageBreak/>
         <w:t>Modelar la lógica de sincronización de la solución concurrente mediante Promela y verificar sus propiedades mediante SPIN.</w:t>
       </w:r>
     </w:p>
@@ -5569,7 +5579,7 @@
           <w:szCs w:val="24"/>
         </w:rPr>
       </w:pPr>
-      <w:bookmarkStart w:id="4" w:name="_Toc241968041"/>
+      <w:bookmarkStart w:id="4" w:name="_Toc242038949"/>
       <w:r>
         <w:rPr>
           <w:rFonts w:ascii="Times New Roman" w:eastAsia="Times New Roman" w:hAnsi="Times New Roman" w:cs="Times New Roman"/>
@@ -5616,7 +5626,7 @@
           <w:szCs w:val="24"/>
         </w:rPr>
       </w:pPr>
-      <w:bookmarkStart w:id="5" w:name="_Toc241968042"/>
+      <w:bookmarkStart w:id="5" w:name="_Toc242038950"/>
       <w:r>
         <w:rPr>
           <w:rFonts w:ascii="Times New Roman" w:eastAsia="Times New Roman" w:hAnsi="Times New Roman" w:cs="Times New Roman"/>
@@ -5663,7 +5673,7 @@
           <w:szCs w:val="24"/>
         </w:rPr>
       </w:pPr>
-      <w:bookmarkStart w:id="6" w:name="_Toc241968043"/>
+      <w:bookmarkStart w:id="6" w:name="_Toc242038951"/>
       <w:r>
         <w:rPr>
           <w:rFonts w:ascii="Times New Roman" w:eastAsia="Times New Roman" w:hAnsi="Times New Roman" w:cs="Times New Roman"/>
@@ -5729,7 +5739,7 @@
           <w:szCs w:val="24"/>
         </w:rPr>
       </w:pPr>
-      <w:bookmarkStart w:id="7" w:name="_Toc241968044"/>
+      <w:bookmarkStart w:id="7" w:name="_Toc242038952"/>
       <w:r>
         <w:rPr>
           <w:rFonts w:ascii="Times New Roman" w:eastAsia="Times New Roman" w:hAnsi="Times New Roman" w:cs="Times New Roman"/>
@@ -5777,6 +5787,7 @@
           <w:sz w:val="24"/>
           <w:szCs w:val="24"/>
         </w:rPr>
+        <w:lastRenderedPageBreak/>
         <w:t>Ejemplo de refinamiento por integrante:</w:t>
       </w:r>
     </w:p>
@@ -6115,7 +6126,7 @@
           <w:szCs w:val="24"/>
         </w:rPr>
       </w:pPr>
-      <w:bookmarkStart w:id="8" w:name="_Toc241968045"/>
+      <w:bookmarkStart w:id="8" w:name="_Toc242038953"/>
       <w:r>
         <w:rPr>
           <w:rFonts w:ascii="Times New Roman" w:eastAsia="Times New Roman" w:hAnsi="Times New Roman" w:cs="Times New Roman"/>
@@ -6162,7 +6173,7 @@
           <w:szCs w:val="24"/>
         </w:rPr>
       </w:pPr>
-      <w:bookmarkStart w:id="9" w:name="_Toc241968046"/>
+      <w:bookmarkStart w:id="9" w:name="_Toc242038954"/>
       <w:r>
         <w:rPr>
           <w:rFonts w:ascii="Times New Roman" w:eastAsia="Times New Roman" w:hAnsi="Times New Roman" w:cs="Times New Roman"/>
@@ -6583,7 +6594,16 @@
                 <w:sz w:val="24"/>
                 <w:szCs w:val="24"/>
               </w:rPr>
-              <w:t xml:space="preserve">El aprendizaje distribuido permite abordar tareas de aprendizaje a gran escala repartiendo la carga computacional entre múltiples nodos de una red. Sin embargo, los autores señalan que gran parte de los estudios existentes se concentra en el rendimiento sobre los datos de entrenamiento y no analiza suficientemente cómo la distribución del modelo afecta su capacidad para generalizar sobre datos no observados. Por ello, el trabajo estudia la Regresión Lineal distribuida desde la perspectiva del error de generalización, buscando identificar posibles problemas derivados del particionamiento del modelo. </w:t>
+              <w:t xml:space="preserve">El aprendizaje distribuido permite abordar tareas de aprendizaje a gran escala repartiendo la carga computacional entre múltiples nodos de una red. Sin embargo, los autores señalan que gran parte de los estudios existentes se concentra en el rendimiento sobre los datos de entrenamiento y no analiza suficientemente cómo la distribución del modelo afecta su capacidad para generalizar sobre datos no observados. Por ello, el trabajo estudia la Regresión Lineal </w:t>
+            </w:r>
+            <w:r>
+              <w:rPr>
+                <w:rFonts w:ascii="Times New Roman" w:eastAsia="Times New Roman" w:hAnsi="Times New Roman" w:cs="Times New Roman"/>
+                <w:sz w:val="24"/>
+                <w:szCs w:val="24"/>
+              </w:rPr>
+              <w:lastRenderedPageBreak/>
+              <w:t xml:space="preserve">distribuida desde la perspectiva del error de generalización, buscando identificar posibles problemas derivados del particionamiento del modelo. </w:t>
             </w:r>
           </w:p>
         </w:tc>
@@ -6624,6 +6644,7 @@
                 <w:sz w:val="24"/>
                 <w:szCs w:val="24"/>
               </w:rPr>
+              <w:lastRenderedPageBreak/>
               <w:t>Problema que resuelve</w:t>
             </w:r>
           </w:p>
@@ -6963,7 +6984,16 @@
                 <w:sz w:val="24"/>
                 <w:szCs w:val="24"/>
               </w:rPr>
-              <w:t xml:space="preserve">Considero que el artículo muestra que distribuir un modelo de Machine Learning puede ser beneficioso para repartir la carga computacional de problemas de gran escala, pero también deja claro que la distribución debe diseñarse con cuidado. Un aspecto relevante es que un bajo error de entrenamiento no garantiza un bajo error de generalización: dependiendo de cómo se dividan los parámetros entre los nodos, el rendimiento sobre datos nuevos puede empeorar bastante. Esto es importante para nuestro proyecto porque muestra que, al aplicar concurrencia o paralelismo, no basta con aumentar el número de workers para obtener una mejor solución; además del tiempo de ejecución y el speedup, es necesario analizar cómo se divide el trabajo y verificar que la calidad del modelo no se vea afectada. </w:t>
+              <w:t xml:space="preserve">Considero que el artículo muestra que distribuir un modelo de Machine Learning puede ser beneficioso para repartir la carga computacional de problemas de gran escala, pero también deja claro </w:t>
+            </w:r>
+            <w:r>
+              <w:rPr>
+                <w:rFonts w:ascii="Times New Roman" w:eastAsia="Times New Roman" w:hAnsi="Times New Roman" w:cs="Times New Roman"/>
+                <w:sz w:val="24"/>
+                <w:szCs w:val="24"/>
+              </w:rPr>
+              <w:lastRenderedPageBreak/>
+              <w:t xml:space="preserve">que la distribución debe diseñarse con cuidado. Un aspecto relevante es que un bajo error de entrenamiento no garantiza un bajo error de generalización: dependiendo de cómo se dividan los parámetros entre los nodos, el rendimiento sobre datos nuevos puede empeorar bastante. Esto es importante para nuestro proyecto porque muestra que, al aplicar concurrencia o paralelismo, no basta con aumentar el número de workers para obtener una mejor solución; además del tiempo de ejecución y el speedup, es necesario analizar cómo se divide el trabajo y verificar que la calidad del modelo no se vea afectada. </w:t>
             </w:r>
           </w:p>
         </w:tc>
@@ -7004,6 +7034,7 @@
                 <w:sz w:val="24"/>
                 <w:szCs w:val="24"/>
               </w:rPr>
+              <w:lastRenderedPageBreak/>
               <w:t>Link de acceso al paper</w:t>
             </w:r>
           </w:p>
@@ -7119,7 +7150,7 @@
           <w:szCs w:val="24"/>
         </w:rPr>
       </w:pPr>
-      <w:bookmarkStart w:id="10" w:name="_Toc241968047"/>
+      <w:bookmarkStart w:id="10" w:name="_Toc242038955"/>
       <w:r>
         <w:rPr>
           <w:rFonts w:ascii="Times New Roman" w:eastAsia="Times New Roman" w:hAnsi="Times New Roman" w:cs="Times New Roman"/>
@@ -7657,6 +7688,7 @@
                 <w:sz w:val="24"/>
                 <w:szCs w:val="24"/>
               </w:rPr>
+              <w:lastRenderedPageBreak/>
               <w:t>Propuesta de solución</w:t>
             </w:r>
           </w:p>
@@ -8050,7 +8082,7 @@
           <w:szCs w:val="24"/>
         </w:rPr>
       </w:pPr>
-      <w:bookmarkStart w:id="11" w:name="_Toc241968048"/>
+      <w:bookmarkStart w:id="11" w:name="_Toc242038956"/>
       <w:r>
         <w:rPr>
           <w:rFonts w:ascii="Times New Roman" w:eastAsia="Times New Roman" w:hAnsi="Times New Roman" w:cs="Times New Roman"/>
@@ -8284,6 +8316,7 @@
                 <w:sz w:val="24"/>
                 <w:szCs w:val="24"/>
               </w:rPr>
+              <w:lastRenderedPageBreak/>
               <w:t>Autores</w:t>
             </w:r>
           </w:p>
@@ -8664,6 +8697,7 @@
                 <w:sz w:val="24"/>
                 <w:szCs w:val="24"/>
               </w:rPr>
+              <w:lastRenderedPageBreak/>
               <w:t>Algoritmos usados / pseudocódigo</w:t>
             </w:r>
           </w:p>
@@ -8851,7 +8885,16 @@
                 <w:sz w:val="24"/>
                 <w:szCs w:val="24"/>
               </w:rPr>
-              <w:t>Considero que este artículo aporta la lección más directamente aplicable a nuestro trabajo: la concurrencia no mejora el rendimiento por sí sola, sino que su beneficio depende críticamente del mecanismo de sincronización elegido. Los autores muestran que la alternativa aparentemente más rápida, eliminar toda sincronización, como HOGWILD!, se vuelve inestable al aumentar el paralelismo, al punto de que con 68 hilos ninguna ejecución de las líneas base logró converger, mientras que la variante lock-free consistente sí lo hizo y alcanzó mejoras de entre 20-80% y hasta 4x en tiempo real de convergencia, además de reducir el uso de memoria. Esto evidencia un perjuicio importante de la programación concurrente mal diseñada: la contención y la obsolescencia pueden anular por completo la ganancia teórica del speedup. Un aspecto valioso desde el punto de vista metodológico es su insistencia en medir el tiempo real de reloj y no solo el número de iteraciones, criterio que se aplicó al comparar nuestras versiones secuencial y concurrente en Go. Como limitación, la evaluación se centra en redes neuronales (MLP y CNN) y no en Regresión Lineal, aunque los propios autores señalan que SGD es la base de modelos convexos como la regresión lineal y que el marco es aplicable a cualquier problema de optimización. Asimismo, aunque el artículo utiliza C++ y OpenMP, sus conceptos sobre contención, consistencia y coordinación entre hilos fueron considerados en el diseño de nuestra implementación en Go mediante goroutines, channels y sync.WaitGroup. En particular, se evitó que múltiples workers modificaran directamente los pesos globales durante el cálculo de gradientes.</w:t>
+              <w:t xml:space="preserve">Considero que este artículo aporta la lección más directamente aplicable a nuestro trabajo: la concurrencia no mejora el rendimiento por sí sola, sino que su beneficio depende críticamente del mecanismo de sincronización elegido. Los autores muestran que la alternativa aparentemente más rápida, eliminar toda sincronización, como HOGWILD!, se vuelve inestable al aumentar el paralelismo, al punto de que con 68 hilos ninguna ejecución de las líneas base logró converger, mientras que la variante lock-free consistente sí lo hizo y alcanzó mejoras de entre 20-80% y hasta 4x en tiempo real de convergencia, además de reducir el uso de memoria. Esto evidencia un perjuicio importante de la programación concurrente mal diseñada: la contención y la obsolescencia pueden anular por completo la ganancia teórica del speedup. Un aspecto valioso desde el punto de vista metodológico es su insistencia en medir el tiempo real de reloj y no solo el número de iteraciones, criterio que se aplicó </w:t>
+            </w:r>
+            <w:r>
+              <w:rPr>
+                <w:rFonts w:ascii="Times New Roman" w:eastAsia="Times New Roman" w:hAnsi="Times New Roman" w:cs="Times New Roman"/>
+                <w:sz w:val="24"/>
+                <w:szCs w:val="24"/>
+              </w:rPr>
+              <w:lastRenderedPageBreak/>
+              <w:t>al comparar nuestras versiones secuencial y concurrente en Go. Como limitación, la evaluación se centra en redes neuronales (MLP y CNN) y no en Regresión Lineal, aunque los propios autores señalan que SGD es la base de modelos convexos como la regresión lineal y que el marco es aplicable a cualquier problema de optimización. Asimismo, aunque el artículo utiliza C++ y OpenMP, sus conceptos sobre contención, consistencia y coordinación entre hilos fueron considerados en el diseño de nuestra implementación en Go mediante goroutines, channels y sync.WaitGroup. En particular, se evitó que múltiples workers modificaran directamente los pesos globales durante el cálculo de gradientes.</w:t>
             </w:r>
           </w:p>
         </w:tc>
@@ -8892,6 +8935,7 @@
                 <w:sz w:val="24"/>
                 <w:szCs w:val="24"/>
               </w:rPr>
+              <w:lastRenderedPageBreak/>
               <w:t>Link de acceso al paper</w:t>
             </w:r>
           </w:p>
@@ -9016,7 +9060,7 @@
           <w:szCs w:val="24"/>
         </w:rPr>
       </w:pPr>
-      <w:bookmarkStart w:id="12" w:name="_Toc241968049"/>
+      <w:bookmarkStart w:id="12" w:name="_Toc242038957"/>
       <w:r>
         <w:rPr>
           <w:rFonts w:ascii="Times New Roman" w:eastAsia="Times New Roman" w:hAnsi="Times New Roman" w:cs="Times New Roman"/>
@@ -9120,7 +9164,7 @@
           <w:szCs w:val="24"/>
         </w:rPr>
       </w:pPr>
-      <w:bookmarkStart w:id="13" w:name="_Toc241968050"/>
+      <w:bookmarkStart w:id="13" w:name="_Toc242038958"/>
       <w:r>
         <w:rPr>
           <w:rFonts w:ascii="Times New Roman" w:eastAsia="Times New Roman" w:hAnsi="Times New Roman" w:cs="Times New Roman"/>
@@ -9148,7 +9192,7 @@
           <w:szCs w:val="24"/>
         </w:rPr>
       </w:pPr>
-      <w:bookmarkStart w:id="14" w:name="_Toc241968051"/>
+      <w:bookmarkStart w:id="14" w:name="_Toc242038959"/>
       <w:r>
         <w:rPr>
           <w:rFonts w:ascii="Times New Roman" w:eastAsia="Times New Roman" w:hAnsi="Times New Roman" w:cs="Times New Roman"/>
@@ -9177,6 +9221,7 @@
           <w:sz w:val="24"/>
           <w:szCs w:val="24"/>
         </w:rPr>
+        <w:lastRenderedPageBreak/>
         <w:t>El caso de uso seleccionado consiste en la estimación del costo total de atención hospitalaria a partir de variables clínicas y administrativas asociadas a cada episodio de hospitalización, con el propósito de apoyar la planificación presupuestaria y el análisis del consumo de recursos en centros de salud, en línea con el ODS 3 (Salud y bienestar). Se eligió este caso por tres razones principales:</w:t>
       </w:r>
     </w:p>
@@ -9281,7 +9326,7 @@
           <w:szCs w:val="24"/>
         </w:rPr>
       </w:pPr>
-      <w:bookmarkStart w:id="15" w:name="_Toc241968052"/>
+      <w:bookmarkStart w:id="15" w:name="_Toc242038960"/>
       <w:r>
         <w:rPr>
           <w:rFonts w:ascii="Times New Roman" w:eastAsia="Times New Roman" w:hAnsi="Times New Roman" w:cs="Times New Roman"/>
@@ -9367,6 +9412,7 @@
           <w:sz w:val="24"/>
           <w:szCs w:val="24"/>
         </w:rPr>
+        <w:lastRenderedPageBreak/>
         <w:t>El dataset SPARCS 2022 contiene 2,103,433 registros a nivel de alta hospitalaria individual. Para el caso de uso se seleccionaron variables relacionadas con duración, características clínicas y administrativas de la hospitalización: Length of Stay, Age Group, Type of Admission, APR Severity of Illness Code, APR MDC Description, APR Medical Surgical Description, Payment Typology 1, Emergency Department Indicator y Total Costs. Esta última constituye la variable objetivo del modelo de Regresión Lineal (New York State Department of Health, 2024).</w:t>
       </w:r>
     </w:p>
@@ -9404,7 +9450,7 @@
           <w:szCs w:val="24"/>
         </w:rPr>
       </w:pPr>
-      <w:bookmarkStart w:id="16" w:name="_Toc241968053"/>
+      <w:bookmarkStart w:id="16" w:name="_Toc242038961"/>
       <w:r>
         <w:rPr>
           <w:rFonts w:ascii="Times New Roman" w:eastAsia="Times New Roman" w:hAnsi="Times New Roman" w:cs="Times New Roman"/>
@@ -9451,7 +9497,7 @@
           <w:szCs w:val="24"/>
         </w:rPr>
       </w:pPr>
-      <w:bookmarkStart w:id="17" w:name="_Toc241968054"/>
+      <w:bookmarkStart w:id="17" w:name="_Toc242038962"/>
       <w:r>
         <w:rPr>
           <w:rFonts w:ascii="Times New Roman" w:eastAsia="Times New Roman" w:hAnsi="Times New Roman" w:cs="Times New Roman"/>
@@ -9653,7 +9699,16 @@
           <w:sz w:val="24"/>
           <w:szCs w:val="24"/>
         </w:rPr>
-        <w:t xml:space="preserve"> los valores válidos de APR Severity of Illness Code se conservaron en el rango 1-4. Los códigos 0, vacíos o inválidos se representaron mediante APR Severity of Illness Code = 0 y Severity_unknown = 1, evitando eliminar esos registros.</w:t>
+        <w:t xml:space="preserve"> los valores válidos de APR Severity of Illness Code se conservaron en el rango 1-4. Los códigos 0, vacíos o inválidos se representaron </w:t>
+      </w:r>
+      <w:r>
+        <w:rPr>
+          <w:rFonts w:ascii="Times New Roman" w:eastAsia="Times New Roman" w:hAnsi="Times New Roman" w:cs="Times New Roman"/>
+          <w:sz w:val="24"/>
+          <w:szCs w:val="24"/>
+        </w:rPr>
+        <w:lastRenderedPageBreak/>
+        <w:t>mediante APR Severity of Illness Code = 0 y Severity_unknown = 1, evitando eliminar esos registros.</w:t>
       </w:r>
     </w:p>
     <w:p>
@@ -9861,7 +9916,7 @@
           <w:szCs w:val="24"/>
         </w:rPr>
       </w:pPr>
-      <w:bookmarkStart w:id="18" w:name="_Toc241968055"/>
+      <w:bookmarkStart w:id="18" w:name="_Toc242038963"/>
       <w:r>
         <w:rPr>
           <w:rFonts w:ascii="Times New Roman" w:eastAsia="Times New Roman" w:hAnsi="Times New Roman" w:cs="Times New Roman"/>
@@ -9978,6 +10033,7 @@
           <w:sz w:val="24"/>
           <w:szCs w:val="24"/>
         </w:rPr>
+        <w:lastRenderedPageBreak/>
         <w:t xml:space="preserve">Cadena de búsqueda (sección 3.3): </w:t>
       </w:r>
       <w:r>
@@ -10068,7 +10124,7 @@
           <w:szCs w:val="24"/>
         </w:rPr>
       </w:pPr>
-      <w:bookmarkStart w:id="19" w:name="_Toc241968056"/>
+      <w:bookmarkStart w:id="19" w:name="_Toc242038964"/>
       <w:r>
         <w:rPr>
           <w:rFonts w:ascii="Times New Roman" w:eastAsia="Times New Roman" w:hAnsi="Times New Roman" w:cs="Times New Roman"/>
@@ -10149,6 +10205,7 @@
     </w:p>
     <w:p>
       <w:pPr>
+        <w:keepNext/>
         <w:jc w:val="both"/>
         <w:rPr>
           <w:rFonts w:ascii="Times New Roman" w:eastAsia="Times New Roman" w:hAnsi="Times New Roman" w:cs="Times New Roman"/>
@@ -10291,17 +10348,20 @@
         <w:pStyle w:val="Ttulo2"/>
         <w:rPr>
           <w:rFonts w:ascii="Times New Roman" w:eastAsia="Times New Roman" w:hAnsi="Times New Roman" w:cs="Times New Roman"/>
-          <w:sz w:val="24"/>
-          <w:szCs w:val="24"/>
-        </w:rPr>
-      </w:pPr>
-      <w:bookmarkStart w:id="20" w:name="_Toc241968057"/>
-      <w:r>
-        <w:rPr>
-          <w:rFonts w:ascii="Times New Roman" w:eastAsia="Times New Roman" w:hAnsi="Times New Roman" w:cs="Times New Roman"/>
-          <w:sz w:val="24"/>
-          <w:szCs w:val="24"/>
-        </w:rPr>
+          <w:b/>
+          <w:sz w:val="24"/>
+          <w:szCs w:val="24"/>
+        </w:rPr>
+      </w:pPr>
+      <w:bookmarkStart w:id="20" w:name="_Toc242038965"/>
+      <w:r>
+        <w:rPr>
+          <w:rFonts w:ascii="Times New Roman" w:eastAsia="Times New Roman" w:hAnsi="Times New Roman" w:cs="Times New Roman"/>
+          <w:b/>
+          <w:sz w:val="24"/>
+          <w:szCs w:val="24"/>
+        </w:rPr>
+        <w:lastRenderedPageBreak/>
         <w:t>6.1 Lógica de sincronización</w:t>
       </w:r>
       <w:bookmarkEnd w:id="20"/>
@@ -10609,14 +10669,16 @@
         <w:jc w:val="both"/>
         <w:rPr>
           <w:rFonts w:ascii="Times New Roman" w:eastAsia="Times New Roman" w:hAnsi="Times New Roman" w:cs="Times New Roman"/>
-          <w:sz w:val="24"/>
-          <w:szCs w:val="24"/>
-        </w:rPr>
-      </w:pPr>
-      <w:bookmarkStart w:id="21" w:name="_Toc241968058"/>
-      <w:r>
-        <w:rPr>
-          <w:rFonts w:ascii="Times New Roman" w:eastAsia="Times New Roman" w:hAnsi="Times New Roman" w:cs="Times New Roman"/>
+          <w:b/>
+          <w:sz w:val="24"/>
+          <w:szCs w:val="24"/>
+        </w:rPr>
+      </w:pPr>
+      <w:bookmarkStart w:id="21" w:name="_Toc242038966"/>
+      <w:r>
+        <w:rPr>
+          <w:rFonts w:ascii="Times New Roman" w:eastAsia="Times New Roman" w:hAnsi="Times New Roman" w:cs="Times New Roman"/>
+          <w:b/>
           <w:sz w:val="24"/>
           <w:szCs w:val="24"/>
         </w:rPr>
@@ -10678,6 +10740,7 @@
           <w:sz w:val="24"/>
           <w:szCs w:val="24"/>
         </w:rPr>
+        <w:lastRenderedPageBreak/>
         <w:t>El proceso “proctype Worker(byte worker_id)” representa a cada worker del Worker Pool. Cada instancia espera elementos del canal jobs. Cuando recibe un identificador de trabajo válido, verifica que el trabajo no haya sido procesado anteriormente, lo marca como procesado y envía su identificador al canal results, representando el gradiente parcial producido.</w:t>
       </w:r>
     </w:p>
@@ -10856,14 +10919,16 @@
         <w:pStyle w:val="Ttulo2"/>
         <w:rPr>
           <w:rFonts w:ascii="Times New Roman" w:eastAsia="Times New Roman" w:hAnsi="Times New Roman" w:cs="Times New Roman"/>
-          <w:sz w:val="24"/>
-          <w:szCs w:val="24"/>
-        </w:rPr>
-      </w:pPr>
-      <w:bookmarkStart w:id="22" w:name="_Toc241968059"/>
-      <w:r>
-        <w:rPr>
-          <w:rFonts w:ascii="Times New Roman" w:eastAsia="Times New Roman" w:hAnsi="Times New Roman" w:cs="Times New Roman"/>
+          <w:b/>
+          <w:sz w:val="24"/>
+          <w:szCs w:val="24"/>
+        </w:rPr>
+      </w:pPr>
+      <w:bookmarkStart w:id="22" w:name="_Toc242038967"/>
+      <w:r>
+        <w:rPr>
+          <w:rFonts w:ascii="Times New Roman" w:eastAsia="Times New Roman" w:hAnsi="Times New Roman" w:cs="Times New Roman"/>
+          <w:b/>
           <w:sz w:val="24"/>
           <w:szCs w:val="24"/>
         </w:rPr>
@@ -11375,6 +11440,7 @@
                 <w:sz w:val="24"/>
                 <w:szCs w:val="24"/>
               </w:rPr>
+              <w:lastRenderedPageBreak/>
               <w:t>Deben recibirse todos los resultados</w:t>
             </w:r>
           </w:p>
@@ -11695,14 +11761,16 @@
         <w:pStyle w:val="Ttulo2"/>
         <w:rPr>
           <w:rFonts w:ascii="Times New Roman" w:eastAsia="Times New Roman" w:hAnsi="Times New Roman" w:cs="Times New Roman"/>
-          <w:sz w:val="24"/>
-          <w:szCs w:val="24"/>
-        </w:rPr>
-      </w:pPr>
-      <w:bookmarkStart w:id="23" w:name="_Toc241968060"/>
-      <w:r>
-        <w:rPr>
-          <w:rFonts w:ascii="Times New Roman" w:eastAsia="Times New Roman" w:hAnsi="Times New Roman" w:cs="Times New Roman"/>
+          <w:b/>
+          <w:sz w:val="24"/>
+          <w:szCs w:val="24"/>
+        </w:rPr>
+      </w:pPr>
+      <w:bookmarkStart w:id="23" w:name="_Toc242038968"/>
+      <w:r>
+        <w:rPr>
+          <w:rFonts w:ascii="Times New Roman" w:eastAsia="Times New Roman" w:hAnsi="Times New Roman" w:cs="Times New Roman"/>
+          <w:b/>
           <w:sz w:val="24"/>
           <w:szCs w:val="24"/>
         </w:rPr>
@@ -11782,24 +11850,27 @@
     </w:p>
     <w:p>
       <w:pPr>
-        <w:jc w:val="both"/>
-        <w:rPr>
-          <w:rFonts w:ascii="Times New Roman" w:eastAsia="Times New Roman" w:hAnsi="Times New Roman" w:cs="Times New Roman"/>
-          <w:sz w:val="24"/>
-          <w:szCs w:val="24"/>
-        </w:rPr>
-      </w:pPr>
-      <w:r>
-        <w:rPr>
-          <w:rFonts w:ascii="Times New Roman" w:eastAsia="Times New Roman" w:hAnsi="Times New Roman" w:cs="Times New Roman"/>
-          <w:sz w:val="24"/>
-          <w:szCs w:val="24"/>
-        </w:rPr>
+        <w:keepNext/>
+        <w:jc w:val="both"/>
+        <w:rPr>
+          <w:rFonts w:ascii="Times New Roman" w:eastAsia="Times New Roman" w:hAnsi="Times New Roman" w:cs="Times New Roman"/>
+          <w:sz w:val="24"/>
+          <w:szCs w:val="24"/>
+        </w:rPr>
+      </w:pPr>
+      <w:r>
+        <w:rPr>
+          <w:rFonts w:ascii="Times New Roman" w:eastAsia="Times New Roman" w:hAnsi="Times New Roman" w:cs="Times New Roman"/>
+          <w:sz w:val="24"/>
+          <w:szCs w:val="24"/>
+        </w:rPr>
+        <w:lastRenderedPageBreak/>
         <w:t>Figura 3. Simulación de la lógica concurrente del Worker Pool mediante Promela.</w:t>
       </w:r>
     </w:p>
     <w:p>
       <w:pPr>
+        <w:keepNext/>
         <w:jc w:val="both"/>
         <w:rPr>
           <w:rFonts w:ascii="Times New Roman" w:eastAsia="Times New Roman" w:hAnsi="Times New Roman" w:cs="Times New Roman"/>
@@ -11910,6 +11981,7 @@
     </w:p>
     <w:p>
       <w:pPr>
+        <w:keepNext/>
         <w:spacing w:before="200" w:after="200"/>
         <w:jc w:val="both"/>
         <w:rPr>
@@ -11924,6 +11996,7 @@
           <w:sz w:val="24"/>
           <w:szCs w:val="24"/>
         </w:rPr>
+        <w:lastRenderedPageBreak/>
         <w:t xml:space="preserve">Figura 4. Finalización de la simulación del modelo Promela. </w:t>
       </w:r>
     </w:p>
@@ -12093,20 +12166,22 @@
     </w:p>
     <w:p>
       <w:pPr>
-        <w:jc w:val="both"/>
-        <w:rPr>
-          <w:rFonts w:ascii="Times New Roman" w:eastAsia="Times New Roman" w:hAnsi="Times New Roman" w:cs="Times New Roman"/>
-          <w:sz w:val="24"/>
-          <w:szCs w:val="24"/>
-        </w:rPr>
-      </w:pPr>
-      <w:r>
-        <w:rPr>
-          <w:rFonts w:ascii="Times New Roman" w:eastAsia="Times New Roman" w:hAnsi="Times New Roman" w:cs="Times New Roman"/>
-          <w:sz w:val="24"/>
-          <w:szCs w:val="24"/>
-        </w:rPr>
-        <w:t>Figura 5. Verificación exhaustiva del modelo concurrente mediante SPIN.</w:t>
+        <w:keepNext/>
+        <w:jc w:val="both"/>
+        <w:rPr>
+          <w:rFonts w:ascii="Times New Roman" w:eastAsia="Times New Roman" w:hAnsi="Times New Roman" w:cs="Times New Roman"/>
+          <w:sz w:val="24"/>
+          <w:szCs w:val="24"/>
+        </w:rPr>
+      </w:pPr>
+      <w:r>
+        <w:rPr>
+          <w:rFonts w:ascii="Times New Roman" w:eastAsia="Times New Roman" w:hAnsi="Times New Roman" w:cs="Times New Roman"/>
+          <w:sz w:val="24"/>
+          <w:szCs w:val="24"/>
+        </w:rPr>
+        <w:lastRenderedPageBreak/>
+        <w:t>Figura 5. Verificación exhaustiva del modelo concurrente mediante SPIN (versión inicial del modelo; los resultados del modelo final con propiedades LTL se presentan en la sección 14).</w:t>
       </w:r>
     </w:p>
     <w:p>
@@ -12958,7 +13033,16 @@
           <w:sz w:val="24"/>
           <w:szCs w:val="24"/>
         </w:rPr>
-        <w:t>El resultado errors: 0 indica que, dentro del espacio de estados explorado para la abstracción definida, SPIN no encontró violaciones de los assert establecidos ni estados finales inválidos. En consecuencia, el modelo validó la lógica de coordinación planteada para el Worker Pool: cada trabajo es procesado una única vez, cada resultado es recolectado una única vez y la actualización de los pesos ocurre únicamente después de reunir todos los resultados parciales.</w:t>
+        <w:t xml:space="preserve">El resultado errors: 0 indica que, dentro del espacio de estados explorado para la abstracción definida, SPIN no encontró violaciones de los assert establecidos ni estados finales inválidos. En consecuencia, el modelo validó la lógica de coordinación planteada para el Worker Pool: </w:t>
+      </w:r>
+      <w:r>
+        <w:rPr>
+          <w:rFonts w:ascii="Times New Roman" w:eastAsia="Times New Roman" w:hAnsi="Times New Roman" w:cs="Times New Roman"/>
+          <w:sz w:val="24"/>
+          <w:szCs w:val="24"/>
+        </w:rPr>
+        <w:lastRenderedPageBreak/>
+        <w:t>cada trabajo es procesado una única vez, cada resultado es recolectado una única vez y la actualización de los pesos ocurre únicamente después de reunir todos los resultados parciales.</w:t>
       </w:r>
     </w:p>
     <w:p>
@@ -13548,7 +13632,7 @@
           <w:szCs w:val="24"/>
         </w:rPr>
       </w:pPr>
-      <w:bookmarkStart w:id="24" w:name="_Toc241968061"/>
+      <w:bookmarkStart w:id="24" w:name="_Toc242038969"/>
       <w:r>
         <w:rPr>
           <w:rFonts w:ascii="Times New Roman" w:eastAsia="Times New Roman" w:hAnsi="Times New Roman" w:cs="Times New Roman"/>
@@ -13859,6 +13943,7 @@
                 <w:sz w:val="24"/>
                 <w:szCs w:val="24"/>
               </w:rPr>
+              <w:lastRenderedPageBreak/>
               <w:t>preprocessing.go</w:t>
             </w:r>
           </w:p>
@@ -14458,14 +14543,16 @@
         <w:pStyle w:val="Ttulo2"/>
         <w:rPr>
           <w:rFonts w:ascii="Times New Roman" w:eastAsia="Times New Roman" w:hAnsi="Times New Roman" w:cs="Times New Roman"/>
-          <w:sz w:val="24"/>
-          <w:szCs w:val="24"/>
-        </w:rPr>
-      </w:pPr>
-      <w:bookmarkStart w:id="25" w:name="_Toc241968062"/>
-      <w:r>
-        <w:rPr>
-          <w:rFonts w:ascii="Times New Roman" w:eastAsia="Times New Roman" w:hAnsi="Times New Roman" w:cs="Times New Roman"/>
+          <w:b/>
+          <w:sz w:val="24"/>
+          <w:szCs w:val="24"/>
+        </w:rPr>
+      </w:pPr>
+      <w:bookmarkStart w:id="25" w:name="_Toc242038970"/>
+      <w:r>
+        <w:rPr>
+          <w:rFonts w:ascii="Times New Roman" w:eastAsia="Times New Roman" w:hAnsi="Times New Roman" w:cs="Times New Roman"/>
+          <w:b/>
           <w:sz w:val="24"/>
           <w:szCs w:val="24"/>
         </w:rPr>
@@ -15281,6 +15368,7 @@
                 <w:sz w:val="24"/>
                 <w:szCs w:val="24"/>
               </w:rPr>
+              <w:lastRenderedPageBreak/>
               <w:t xml:space="preserve">APR Medical Surgical Description </w:t>
             </w:r>
           </w:p>
@@ -15820,6 +15908,7 @@
     </w:p>
     <w:p>
       <w:pPr>
+        <w:keepNext/>
         <w:spacing w:after="200"/>
         <w:jc w:val="both"/>
         <w:rPr>
@@ -15834,6 +15923,7 @@
           <w:sz w:val="24"/>
           <w:szCs w:val="24"/>
         </w:rPr>
+        <w:lastRenderedPageBreak/>
         <w:t>Figura 6. Flujo de preparación de datos para la Regresión Lineal</w:t>
       </w:r>
     </w:p>
@@ -16560,6 +16650,7 @@
                 <w:sz w:val="24"/>
                 <w:szCs w:val="24"/>
               </w:rPr>
+              <w:lastRenderedPageBreak/>
               <w:t xml:space="preserve">Variable </w:t>
             </w:r>
           </w:p>
@@ -17030,14 +17121,16 @@
         <w:pStyle w:val="Ttulo2"/>
         <w:rPr>
           <w:rFonts w:ascii="Times New Roman" w:eastAsia="Times New Roman" w:hAnsi="Times New Roman" w:cs="Times New Roman"/>
-          <w:sz w:val="24"/>
-          <w:szCs w:val="24"/>
-        </w:rPr>
-      </w:pPr>
-      <w:bookmarkStart w:id="26" w:name="_Toc241968063"/>
-      <w:r>
-        <w:rPr>
-          <w:rFonts w:ascii="Times New Roman" w:eastAsia="Times New Roman" w:hAnsi="Times New Roman" w:cs="Times New Roman"/>
+          <w:b/>
+          <w:sz w:val="24"/>
+          <w:szCs w:val="24"/>
+        </w:rPr>
+      </w:pPr>
+      <w:bookmarkStart w:id="26" w:name="_Toc242038971"/>
+      <w:r>
+        <w:rPr>
+          <w:rFonts w:ascii="Times New Roman" w:eastAsia="Times New Roman" w:hAnsi="Times New Roman" w:cs="Times New Roman"/>
+          <w:b/>
           <w:sz w:val="24"/>
           <w:szCs w:val="24"/>
         </w:rPr>
@@ -17652,6 +17745,7 @@
           <w:sz w:val="24"/>
           <w:szCs w:val="24"/>
         </w:rPr>
+        <w:lastRenderedPageBreak/>
         <w:t xml:space="preserve">    Para cada registro de Train:</w:t>
       </w:r>
     </w:p>
@@ -17908,14 +18002,16 @@
         <w:pStyle w:val="Ttulo2"/>
         <w:rPr>
           <w:rFonts w:ascii="Times New Roman" w:eastAsia="Times New Roman" w:hAnsi="Times New Roman" w:cs="Times New Roman"/>
-          <w:sz w:val="24"/>
-          <w:szCs w:val="24"/>
-        </w:rPr>
-      </w:pPr>
-      <w:bookmarkStart w:id="27" w:name="_Toc241968064"/>
-      <w:r>
-        <w:rPr>
-          <w:rFonts w:ascii="Times New Roman" w:eastAsia="Times New Roman" w:hAnsi="Times New Roman" w:cs="Times New Roman"/>
+          <w:b/>
+          <w:sz w:val="24"/>
+          <w:szCs w:val="24"/>
+        </w:rPr>
+      </w:pPr>
+      <w:bookmarkStart w:id="27" w:name="_Toc242038972"/>
+      <w:r>
+        <w:rPr>
+          <w:rFonts w:ascii="Times New Roman" w:eastAsia="Times New Roman" w:hAnsi="Times New Roman" w:cs="Times New Roman"/>
+          <w:b/>
           <w:sz w:val="24"/>
           <w:szCs w:val="24"/>
         </w:rPr>
@@ -18207,6 +18303,7 @@
           <w:sz w:val="24"/>
           <w:szCs w:val="24"/>
         </w:rPr>
+        <w:lastRenderedPageBreak/>
         <w:t xml:space="preserve">donde </w:t>
       </w:r>
       <m:oMath>
@@ -18524,14 +18621,16 @@
         <w:pStyle w:val="Ttulo2"/>
         <w:rPr>
           <w:rFonts w:ascii="Times New Roman" w:eastAsia="Times New Roman" w:hAnsi="Times New Roman" w:cs="Times New Roman"/>
-          <w:sz w:val="24"/>
-          <w:szCs w:val="24"/>
-        </w:rPr>
-      </w:pPr>
-      <w:bookmarkStart w:id="28" w:name="_Toc241968065"/>
-      <w:r>
-        <w:rPr>
-          <w:rFonts w:ascii="Times New Roman" w:eastAsia="Times New Roman" w:hAnsi="Times New Roman" w:cs="Times New Roman"/>
+          <w:b/>
+          <w:sz w:val="24"/>
+          <w:szCs w:val="24"/>
+        </w:rPr>
+      </w:pPr>
+      <w:bookmarkStart w:id="28" w:name="_Toc242038973"/>
+      <w:r>
+        <w:rPr>
+          <w:rFonts w:ascii="Times New Roman" w:eastAsia="Times New Roman" w:hAnsi="Times New Roman" w:cs="Times New Roman"/>
+          <w:b/>
           <w:sz w:val="24"/>
           <w:szCs w:val="24"/>
         </w:rPr>
@@ -18560,6 +18659,7 @@
     </w:p>
     <w:p>
       <w:pPr>
+        <w:keepNext/>
         <w:spacing w:before="240" w:after="240"/>
         <w:jc w:val="both"/>
         <w:rPr>
@@ -18666,6 +18766,7 @@
           <w:sz w:val="24"/>
           <w:szCs w:val="24"/>
         </w:rPr>
+        <w:lastRenderedPageBreak/>
         <w:t>Cada worker permanece disponible para recibir trabajos hasta que el canal correspondiente es cerrado o se completa el procesamiento asignado. Esto evita crear millones de goroutines y permite controlar explícitamente el grado de paralelismo.</w:t>
       </w:r>
     </w:p>
@@ -18731,14 +18832,16 @@
         <w:pStyle w:val="Ttulo2"/>
         <w:rPr>
           <w:rFonts w:ascii="Times New Roman" w:eastAsia="Times New Roman" w:hAnsi="Times New Roman" w:cs="Times New Roman"/>
-          <w:sz w:val="24"/>
-          <w:szCs w:val="24"/>
-        </w:rPr>
-      </w:pPr>
-      <w:bookmarkStart w:id="29" w:name="_Toc241968066"/>
-      <w:r>
-        <w:rPr>
-          <w:rFonts w:ascii="Times New Roman" w:eastAsia="Times New Roman" w:hAnsi="Times New Roman" w:cs="Times New Roman"/>
+          <w:b/>
+          <w:sz w:val="24"/>
+          <w:szCs w:val="24"/>
+        </w:rPr>
+      </w:pPr>
+      <w:bookmarkStart w:id="29" w:name="_Toc242038974"/>
+      <w:r>
+        <w:rPr>
+          <w:rFonts w:ascii="Times New Roman" w:eastAsia="Times New Roman" w:hAnsi="Times New Roman" w:cs="Times New Roman"/>
+          <w:b/>
           <w:sz w:val="24"/>
           <w:szCs w:val="24"/>
         </w:rPr>
@@ -18872,6 +18975,7 @@
     </w:p>
     <w:p>
       <w:pPr>
+        <w:keepNext/>
         <w:spacing w:before="240" w:after="240"/>
         <w:jc w:val="both"/>
         <w:rPr>
@@ -18886,6 +18990,7 @@
           <w:sz w:val="24"/>
           <w:szCs w:val="24"/>
         </w:rPr>
+        <w:lastRenderedPageBreak/>
         <w:t>Figura 8. Flujo de sincronización de la implementación concurrente en Go</w:t>
       </w:r>
     </w:p>
@@ -18996,7 +19101,7 @@
           <w:szCs w:val="24"/>
         </w:rPr>
       </w:pPr>
-      <w:bookmarkStart w:id="30" w:name="_Toc241968067"/>
+      <w:bookmarkStart w:id="30" w:name="_Toc242038975"/>
       <w:r>
         <w:rPr>
           <w:rFonts w:ascii="Times New Roman" w:eastAsia="Times New Roman" w:hAnsi="Times New Roman" w:cs="Times New Roman"/>
@@ -19098,17 +19203,20 @@
         <w:pStyle w:val="Ttulo2"/>
         <w:rPr>
           <w:rFonts w:ascii="Times New Roman" w:eastAsia="Times New Roman" w:hAnsi="Times New Roman" w:cs="Times New Roman"/>
-          <w:sz w:val="24"/>
-          <w:szCs w:val="24"/>
-        </w:rPr>
-      </w:pPr>
-      <w:bookmarkStart w:id="31" w:name="_Toc241968068"/>
-      <w:r>
-        <w:rPr>
-          <w:rFonts w:ascii="Times New Roman" w:eastAsia="Times New Roman" w:hAnsi="Times New Roman" w:cs="Times New Roman"/>
-          <w:sz w:val="24"/>
-          <w:szCs w:val="24"/>
-        </w:rPr>
+          <w:b/>
+          <w:sz w:val="24"/>
+          <w:szCs w:val="24"/>
+        </w:rPr>
+      </w:pPr>
+      <w:bookmarkStart w:id="31" w:name="_Toc242038976"/>
+      <w:r>
+        <w:rPr>
+          <w:rFonts w:ascii="Times New Roman" w:eastAsia="Times New Roman" w:hAnsi="Times New Roman" w:cs="Times New Roman"/>
+          <w:b/>
+          <w:sz w:val="24"/>
+          <w:szCs w:val="24"/>
+        </w:rPr>
+        <w:lastRenderedPageBreak/>
         <w:t>8.1 Entorno de ejecución</w:t>
       </w:r>
       <w:bookmarkEnd w:id="31"/>
@@ -20137,14 +20245,16 @@
         <w:pStyle w:val="Ttulo2"/>
         <w:rPr>
           <w:rFonts w:ascii="Times New Roman" w:eastAsia="Times New Roman" w:hAnsi="Times New Roman" w:cs="Times New Roman"/>
-          <w:sz w:val="24"/>
-          <w:szCs w:val="24"/>
-        </w:rPr>
-      </w:pPr>
-      <w:bookmarkStart w:id="32" w:name="_Toc241968069"/>
-      <w:r>
-        <w:rPr>
-          <w:rFonts w:ascii="Times New Roman" w:eastAsia="Times New Roman" w:hAnsi="Times New Roman" w:cs="Times New Roman"/>
+          <w:b/>
+          <w:sz w:val="24"/>
+          <w:szCs w:val="24"/>
+        </w:rPr>
+      </w:pPr>
+      <w:bookmarkStart w:id="32" w:name="_Toc242038977"/>
+      <w:r>
+        <w:rPr>
+          <w:rFonts w:ascii="Times New Roman" w:eastAsia="Times New Roman" w:hAnsi="Times New Roman" w:cs="Times New Roman"/>
+          <w:b/>
           <w:sz w:val="24"/>
           <w:szCs w:val="24"/>
         </w:rPr>
@@ -20154,6 +20264,7 @@
       <w:r>
         <w:rPr>
           <w:rFonts w:ascii="Times New Roman" w:eastAsia="Times New Roman" w:hAnsi="Times New Roman" w:cs="Times New Roman"/>
+          <w:b/>
           <w:sz w:val="24"/>
           <w:szCs w:val="24"/>
         </w:rPr>
@@ -20304,6 +20415,7 @@
                 <w:sz w:val="24"/>
                 <w:szCs w:val="24"/>
               </w:rPr>
+              <w:lastRenderedPageBreak/>
               <w:t>Tipo de ejecución</w:t>
             </w:r>
           </w:p>
@@ -21003,14 +21115,16 @@
         <w:pStyle w:val="Ttulo2"/>
         <w:rPr>
           <w:rFonts w:ascii="Times New Roman" w:eastAsia="Times New Roman" w:hAnsi="Times New Roman" w:cs="Times New Roman"/>
-          <w:sz w:val="24"/>
-          <w:szCs w:val="24"/>
-        </w:rPr>
-      </w:pPr>
-      <w:bookmarkStart w:id="33" w:name="_Toc241968070"/>
-      <w:r>
-        <w:rPr>
-          <w:rFonts w:ascii="Times New Roman" w:eastAsia="Times New Roman" w:hAnsi="Times New Roman" w:cs="Times New Roman"/>
+          <w:b/>
+          <w:sz w:val="24"/>
+          <w:szCs w:val="24"/>
+        </w:rPr>
+      </w:pPr>
+      <w:bookmarkStart w:id="33" w:name="_Toc242038978"/>
+      <w:r>
+        <w:rPr>
+          <w:rFonts w:ascii="Times New Roman" w:eastAsia="Times New Roman" w:hAnsi="Times New Roman" w:cs="Times New Roman"/>
+          <w:b/>
           <w:sz w:val="24"/>
           <w:szCs w:val="24"/>
         </w:rPr>
@@ -21181,6 +21295,7 @@
                 <w:sz w:val="24"/>
                 <w:szCs w:val="24"/>
               </w:rPr>
+              <w:lastRenderedPageBreak/>
               <w:t xml:space="preserve">Configuración </w:t>
             </w:r>
           </w:p>
@@ -21842,14 +21957,16 @@
         <w:pStyle w:val="Ttulo2"/>
         <w:rPr>
           <w:rFonts w:ascii="Times New Roman" w:eastAsia="Times New Roman" w:hAnsi="Times New Roman" w:cs="Times New Roman"/>
-          <w:sz w:val="24"/>
-          <w:szCs w:val="24"/>
-        </w:rPr>
-      </w:pPr>
-      <w:bookmarkStart w:id="34" w:name="_Toc241968071"/>
-      <w:r>
-        <w:rPr>
-          <w:rFonts w:ascii="Times New Roman" w:eastAsia="Times New Roman" w:hAnsi="Times New Roman" w:cs="Times New Roman"/>
+          <w:b/>
+          <w:sz w:val="24"/>
+          <w:szCs w:val="24"/>
+        </w:rPr>
+      </w:pPr>
+      <w:bookmarkStart w:id="34" w:name="_Toc242038979"/>
+      <w:r>
+        <w:rPr>
+          <w:rFonts w:ascii="Times New Roman" w:eastAsia="Times New Roman" w:hAnsi="Times New Roman" w:cs="Times New Roman"/>
+          <w:b/>
           <w:sz w:val="24"/>
           <w:szCs w:val="24"/>
         </w:rPr>
@@ -21859,6 +21976,7 @@
       <w:r>
         <w:rPr>
           <w:rFonts w:ascii="Times New Roman" w:eastAsia="Times New Roman" w:hAnsi="Times New Roman" w:cs="Times New Roman"/>
+          <w:b/>
           <w:sz w:val="24"/>
           <w:szCs w:val="24"/>
         </w:rPr>
@@ -22732,6 +22850,7 @@
               <w:sz w:val="30"/>
               <w:szCs w:val="30"/>
             </w:rPr>
+            <w:lastRenderedPageBreak/>
             <m:t>Speedup=</m:t>
           </m:r>
           <m:f>
@@ -23058,7 +23177,7 @@
           <w:szCs w:val="24"/>
         </w:rPr>
       </w:pPr>
-      <w:bookmarkStart w:id="35" w:name="_Toc241968072"/>
+      <w:bookmarkStart w:id="35" w:name="_Toc242038980"/>
       <w:r>
         <w:rPr>
           <w:rFonts w:ascii="Times New Roman" w:eastAsia="Times New Roman" w:hAnsi="Times New Roman" w:cs="Times New Roman"/>
@@ -23122,14 +23241,16 @@
         <w:pStyle w:val="Ttulo2"/>
         <w:rPr>
           <w:rFonts w:ascii="Times New Roman" w:eastAsia="Times New Roman" w:hAnsi="Times New Roman" w:cs="Times New Roman"/>
-          <w:sz w:val="24"/>
-          <w:szCs w:val="24"/>
-        </w:rPr>
-      </w:pPr>
-      <w:bookmarkStart w:id="36" w:name="_Toc241968073"/>
-      <w:r>
-        <w:rPr>
-          <w:rFonts w:ascii="Times New Roman" w:eastAsia="Times New Roman" w:hAnsi="Times New Roman" w:cs="Times New Roman"/>
+          <w:b/>
+          <w:sz w:val="24"/>
+          <w:szCs w:val="24"/>
+        </w:rPr>
+      </w:pPr>
+      <w:bookmarkStart w:id="36" w:name="_Toc242038981"/>
+      <w:r>
+        <w:rPr>
+          <w:rFonts w:ascii="Times New Roman" w:eastAsia="Times New Roman" w:hAnsi="Times New Roman" w:cs="Times New Roman"/>
+          <w:b/>
           <w:sz w:val="24"/>
           <w:szCs w:val="24"/>
         </w:rPr>
@@ -23662,6 +23783,7 @@
                 <w:sz w:val="24"/>
                 <w:szCs w:val="24"/>
               </w:rPr>
+              <w:lastRenderedPageBreak/>
               <w:t>16 workers</w:t>
             </w:r>
           </w:p>
@@ -23848,14 +23970,16 @@
         <w:pStyle w:val="Ttulo2"/>
         <w:rPr>
           <w:rFonts w:ascii="Times New Roman" w:eastAsia="Times New Roman" w:hAnsi="Times New Roman" w:cs="Times New Roman"/>
-          <w:sz w:val="24"/>
-          <w:szCs w:val="24"/>
-        </w:rPr>
-      </w:pPr>
-      <w:bookmarkStart w:id="37" w:name="_Toc241968074"/>
-      <w:r>
-        <w:rPr>
-          <w:rFonts w:ascii="Times New Roman" w:eastAsia="Times New Roman" w:hAnsi="Times New Roman" w:cs="Times New Roman"/>
+          <w:b/>
+          <w:sz w:val="24"/>
+          <w:szCs w:val="24"/>
+        </w:rPr>
+      </w:pPr>
+      <w:bookmarkStart w:id="37" w:name="_Toc242038982"/>
+      <w:r>
+        <w:rPr>
+          <w:rFonts w:ascii="Times New Roman" w:eastAsia="Times New Roman" w:hAnsi="Times New Roman" w:cs="Times New Roman"/>
+          <w:b/>
           <w:sz w:val="24"/>
           <w:szCs w:val="24"/>
         </w:rPr>
@@ -25459,11 +25583,13 @@
           <w:sz w:val="24"/>
           <w:szCs w:val="24"/>
         </w:rPr>
+        <w:lastRenderedPageBreak/>
         <w:t>La eficiencia, en cambio, disminuye conforme aumenta el número de workers. Con 2 workers se obtuvo una eficiencia de 0.9827 y con 4 workers de 0.9154. A partir de 8 workers esta métrica desciende progresivamente, llegando a 0.1521 con 32 workers.</w:t>
       </w:r>
     </w:p>
     <w:p>
       <w:pPr>
+        <w:keepNext/>
         <w:spacing w:before="240" w:after="240"/>
         <w:jc w:val="both"/>
         <w:rPr>
@@ -25557,14 +25683,16 @@
         <w:pStyle w:val="Ttulo2"/>
         <w:rPr>
           <w:rFonts w:ascii="Times New Roman" w:eastAsia="Times New Roman" w:hAnsi="Times New Roman" w:cs="Times New Roman"/>
-          <w:sz w:val="24"/>
-          <w:szCs w:val="24"/>
-        </w:rPr>
-      </w:pPr>
-      <w:bookmarkStart w:id="38" w:name="_Toc241968075"/>
-      <w:r>
-        <w:rPr>
-          <w:rFonts w:ascii="Times New Roman" w:eastAsia="Times New Roman" w:hAnsi="Times New Roman" w:cs="Times New Roman"/>
+          <w:b/>
+          <w:sz w:val="24"/>
+          <w:szCs w:val="24"/>
+        </w:rPr>
+      </w:pPr>
+      <w:bookmarkStart w:id="38" w:name="_Toc242038983"/>
+      <w:r>
+        <w:rPr>
+          <w:rFonts w:ascii="Times New Roman" w:eastAsia="Times New Roman" w:hAnsi="Times New Roman" w:cs="Times New Roman"/>
+          <w:b/>
           <w:sz w:val="24"/>
           <w:szCs w:val="24"/>
         </w:rPr>
@@ -25975,6 +26103,7 @@
                 <w:sz w:val="24"/>
                 <w:szCs w:val="24"/>
               </w:rPr>
+              <w:lastRenderedPageBreak/>
               <w:t xml:space="preserve">Speedup </w:t>
             </w:r>
           </w:p>
@@ -26567,14 +26696,16 @@
         <w:pStyle w:val="Ttulo2"/>
         <w:rPr>
           <w:rFonts w:ascii="Times New Roman" w:eastAsia="Times New Roman" w:hAnsi="Times New Roman" w:cs="Times New Roman"/>
-          <w:sz w:val="24"/>
-          <w:szCs w:val="24"/>
-        </w:rPr>
-      </w:pPr>
-      <w:bookmarkStart w:id="39" w:name="_Toc241968076"/>
-      <w:r>
-        <w:rPr>
-          <w:rFonts w:ascii="Times New Roman" w:eastAsia="Times New Roman" w:hAnsi="Times New Roman" w:cs="Times New Roman"/>
+          <w:b/>
+          <w:sz w:val="24"/>
+          <w:szCs w:val="24"/>
+        </w:rPr>
+      </w:pPr>
+      <w:bookmarkStart w:id="39" w:name="_Toc242038984"/>
+      <w:r>
+        <w:rPr>
+          <w:rFonts w:ascii="Times New Roman" w:eastAsia="Times New Roman" w:hAnsi="Times New Roman" w:cs="Times New Roman"/>
+          <w:b/>
           <w:sz w:val="24"/>
           <w:szCs w:val="24"/>
         </w:rPr>
@@ -27226,6 +27357,7 @@
     </w:p>
     <w:p>
       <w:pPr>
+        <w:keepNext/>
         <w:spacing w:before="240" w:after="240"/>
         <w:jc w:val="both"/>
         <w:rPr>
@@ -27240,7 +27372,8 @@
           <w:sz w:val="24"/>
           <w:szCs w:val="24"/>
         </w:rPr>
-        <w:t>Figura 10. Evidencia de ejecución de las implementaciones secuencial y concurrente en Go.</w:t>
+        <w:lastRenderedPageBreak/>
+        <w:t>Figura 10. Evidencia de ejecución de las implementaciones secuencial y concurrente en Go (corrida individual en modo quick con 12 workers; los tiempos oficiales son las medias recortadas de la sección 9.1).</w:t>
       </w:r>
     </w:p>
     <w:p>
@@ -27366,7 +27499,7 @@
           <w:szCs w:val="24"/>
         </w:rPr>
       </w:pPr>
-      <w:bookmarkStart w:id="40" w:name="_Toc241968077"/>
+      <w:bookmarkStart w:id="40" w:name="_Toc242038985"/>
       <w:r>
         <w:rPr>
           <w:rFonts w:ascii="Times New Roman" w:eastAsia="Times New Roman" w:hAnsi="Times New Roman" w:cs="Times New Roman"/>
@@ -27430,14 +27563,16 @@
         <w:pStyle w:val="Ttulo2"/>
         <w:rPr>
           <w:rFonts w:ascii="Times New Roman" w:eastAsia="Times New Roman" w:hAnsi="Times New Roman" w:cs="Times New Roman"/>
-          <w:sz w:val="24"/>
-          <w:szCs w:val="24"/>
-        </w:rPr>
-      </w:pPr>
-      <w:bookmarkStart w:id="41" w:name="_Toc241968078"/>
-      <w:r>
-        <w:rPr>
-          <w:rFonts w:ascii="Times New Roman" w:eastAsia="Times New Roman" w:hAnsi="Times New Roman" w:cs="Times New Roman"/>
+          <w:b/>
+          <w:sz w:val="24"/>
+          <w:szCs w:val="24"/>
+        </w:rPr>
+      </w:pPr>
+      <w:bookmarkStart w:id="41" w:name="_Toc242038986"/>
+      <w:r>
+        <w:rPr>
+          <w:rFonts w:ascii="Times New Roman" w:eastAsia="Times New Roman" w:hAnsi="Times New Roman" w:cs="Times New Roman"/>
+          <w:b/>
           <w:sz w:val="24"/>
           <w:szCs w:val="24"/>
         </w:rPr>
@@ -27447,6 +27582,7 @@
       <w:r>
         <w:rPr>
           <w:rFonts w:ascii="Times New Roman" w:eastAsia="Times New Roman" w:hAnsi="Times New Roman" w:cs="Times New Roman"/>
+          <w:b/>
           <w:sz w:val="24"/>
           <w:szCs w:val="24"/>
         </w:rPr>
@@ -27468,7 +27604,16 @@
           <w:sz w:val="24"/>
           <w:szCs w:val="24"/>
         </w:rPr>
-        <w:t>Entre 1 y 4 workers se observa una escalabilidad cercana a la relación esperada respecto al número de workers. Con 2 workers se obtuvo un speedup de 1.9655x y una eficiencia de 0.9827, mientras que con 4 workers se alcanzó un speedup de 3.6615x y una eficiencia de 0.9154.</w:t>
+        <w:t xml:space="preserve">Entre 1 y 4 workers se observa una escalabilidad cercana a la relación esperada respecto al número de workers. Con 2 workers se obtuvo un speedup de 1.9655x y una eficiencia de </w:t>
+      </w:r>
+      <w:r>
+        <w:rPr>
+          <w:rFonts w:ascii="Times New Roman" w:eastAsia="Times New Roman" w:hAnsi="Times New Roman" w:cs="Times New Roman"/>
+          <w:sz w:val="24"/>
+          <w:szCs w:val="24"/>
+        </w:rPr>
+        <w:lastRenderedPageBreak/>
+        <w:t>0.9827, mientras que con 4 workers se alcanzó un speedup de 3.6615x y una eficiencia de 0.9154.</w:t>
       </w:r>
     </w:p>
     <w:p>
@@ -27585,21 +27730,116 @@
     </w:p>
     <w:p>
       <w:pPr>
+        <w:keepNext/>
+        <w:spacing w:before="240" w:after="240"/>
+        <w:jc w:val="both"/>
+        <w:rPr>
+          <w:rFonts w:ascii="Times New Roman" w:eastAsia="Times New Roman" w:hAnsi="Times New Roman" w:cs="Times New Roman"/>
+          <w:sz w:val="24"/>
+          <w:szCs w:val="24"/>
+        </w:rPr>
+      </w:pPr>
+      <w:r>
+        <w:rPr>
+          <w:rFonts w:ascii="Times New Roman" w:eastAsia="Times New Roman" w:hAnsi="Times New Roman" w:cs="Times New Roman"/>
+          <w:sz w:val="24"/>
+          <w:szCs w:val="24"/>
+        </w:rPr>
+        <w:t>Figura 11. Eficiencia según la cantidad de workers</w:t>
+      </w:r>
+    </w:p>
+    <w:p>
+      <w:pPr>
+        <w:jc w:val="center"/>
+        <w:rPr>
+          <w:rFonts w:ascii="Times New Roman" w:eastAsia="Times New Roman" w:hAnsi="Times New Roman" w:cs="Times New Roman"/>
+          <w:sz w:val="24"/>
+          <w:szCs w:val="24"/>
+        </w:rPr>
+      </w:pPr>
+      <w:r>
+        <w:rPr>
+          <w:rFonts w:ascii="Times New Roman" w:eastAsia="Times New Roman" w:hAnsi="Times New Roman" w:cs="Times New Roman"/>
+          <w:noProof/>
+          <w:sz w:val="24"/>
+          <w:szCs w:val="24"/>
+        </w:rPr>
+        <w:drawing>
+          <wp:inline distT="114300" distB="114300" distL="114300" distR="114300" wp14:anchorId="7E485A3D" wp14:editId="38BAC32E">
+            <wp:extent cx="5731200" cy="3582000"/>
+            <wp:effectExtent l="0" t="0" r="0" b="0"/>
+            <wp:docPr id="15" name="eficiencia.png"/>
+            <wp:cNvGraphicFramePr/>
+            <a:graphic xmlns:a="http://schemas.openxmlformats.org/drawingml/2006/main">
+              <a:graphicData uri="http://schemas.openxmlformats.org/drawingml/2006/picture">
+                <pic:pic xmlns:pic="http://schemas.openxmlformats.org/drawingml/2006/picture">
+                  <pic:nvPicPr>
+                    <pic:cNvPr id="0" name="eficiencia.png"/>
+                    <pic:cNvPicPr preferRelativeResize="0"/>
+                  </pic:nvPicPr>
+                  <pic:blipFill>
+                    <a:blip r:embed="rId23"/>
+                    <a:srcRect/>
+                    <a:stretch>
+                      <a:fillRect/>
+                    </a:stretch>
+                  </pic:blipFill>
+                  <pic:spPr>
+                    <a:xfrm>
+                      <a:off x="0" y="0"/>
+                      <a:ext cx="5731200" cy="3582000"/>
+                    </a:xfrm>
+                    <a:prstGeom prst="rect">
+                      <a:avLst/>
+                    </a:prstGeom>
+                    <a:ln/>
+                  </pic:spPr>
+                </pic:pic>
+              </a:graphicData>
+            </a:graphic>
+          </wp:inline>
+        </w:drawing>
+      </w:r>
+    </w:p>
+    <w:p>
+      <w:pPr>
+        <w:spacing w:before="240" w:after="240"/>
+        <w:jc w:val="both"/>
+        <w:rPr>
+          <w:rFonts w:ascii="Times New Roman" w:eastAsia="Times New Roman" w:hAnsi="Times New Roman" w:cs="Times New Roman"/>
+          <w:sz w:val="24"/>
+          <w:szCs w:val="24"/>
+        </w:rPr>
+      </w:pPr>
+      <w:r>
+        <w:rPr>
+          <w:rFonts w:ascii="Times New Roman" w:eastAsia="Times New Roman" w:hAnsi="Times New Roman" w:cs="Times New Roman"/>
+          <w:sz w:val="24"/>
+          <w:szCs w:val="24"/>
+        </w:rPr>
+        <w:t>La Figura 11 muestra que la eficiencia se mantiene cerca del valor ideal hasta 4 workers y cae de forma marcada al superar los 6 núcleos físicos del procesador, donde los hilos adicionales comparten unidades de cálculo y ancho de banda de memoria.</w:t>
+      </w:r>
+    </w:p>
+    <w:p>
+      <w:pPr>
         <w:pStyle w:val="Ttulo2"/>
         <w:jc w:val="both"/>
         <w:rPr>
           <w:rFonts w:ascii="Times New Roman" w:eastAsia="Times New Roman" w:hAnsi="Times New Roman" w:cs="Times New Roman"/>
-          <w:sz w:val="24"/>
-          <w:szCs w:val="24"/>
-        </w:rPr>
-      </w:pPr>
-      <w:bookmarkStart w:id="42" w:name="_Toc241968079"/>
-      <w:r>
-        <w:rPr>
-          <w:rFonts w:ascii="Times New Roman" w:eastAsia="Times New Roman" w:hAnsi="Times New Roman" w:cs="Times New Roman"/>
-          <w:sz w:val="24"/>
-          <w:szCs w:val="24"/>
-        </w:rPr>
+          <w:b/>
+          <w:sz w:val="24"/>
+          <w:szCs w:val="24"/>
+        </w:rPr>
+      </w:pPr>
+      <w:bookmarkStart w:id="42" w:name="_Toc242038987"/>
+      <w:r>
+        <w:rPr>
+          <w:rFonts w:ascii="Times New Roman" w:eastAsia="Times New Roman" w:hAnsi="Times New Roman" w:cs="Times New Roman"/>
+          <w:b/>
+          <w:sz w:val="24"/>
+          <w:szCs w:val="24"/>
+        </w:rPr>
+        <w:lastRenderedPageBreak/>
         <w:t>10.2 Rendimientos decrecientes y overhead</w:t>
       </w:r>
       <w:bookmarkEnd w:id="42"/>
@@ -27768,14 +28008,16 @@
         <w:jc w:val="both"/>
         <w:rPr>
           <w:rFonts w:ascii="Times New Roman" w:eastAsia="Times New Roman" w:hAnsi="Times New Roman" w:cs="Times New Roman"/>
-          <w:sz w:val="24"/>
-          <w:szCs w:val="24"/>
-        </w:rPr>
-      </w:pPr>
-      <w:bookmarkStart w:id="43" w:name="_Toc241968080"/>
-      <w:r>
-        <w:rPr>
-          <w:rFonts w:ascii="Times New Roman" w:eastAsia="Times New Roman" w:hAnsi="Times New Roman" w:cs="Times New Roman"/>
+          <w:b/>
+          <w:sz w:val="24"/>
+          <w:szCs w:val="24"/>
+        </w:rPr>
+      </w:pPr>
+      <w:bookmarkStart w:id="43" w:name="_Toc242038988"/>
+      <w:r>
+        <w:rPr>
+          <w:rFonts w:ascii="Times New Roman" w:eastAsia="Times New Roman" w:hAnsi="Times New Roman" w:cs="Times New Roman"/>
+          <w:b/>
           <w:sz w:val="24"/>
           <w:szCs w:val="24"/>
         </w:rPr>
@@ -27882,7 +28124,16 @@
           <w:sz w:val="24"/>
           <w:szCs w:val="24"/>
         </w:rPr>
-        <w:t>Por ello, el mayor número de workers no implica necesariamente la configuración más conveniente. La configuración de 16 workers obtuvo el menor tiempo absoluto, 382.95 ms, pero la configuración de 12 workers alcanzó 387.66 ms, una diferencia de aproximadamente 4.71 ms.</w:t>
+        <w:t xml:space="preserve">Por ello, el mayor número de workers no implica necesariamente la configuración más conveniente. La configuración de 16 workers obtuvo el menor tiempo absoluto, 382.95 ms, </w:t>
+      </w:r>
+      <w:r>
+        <w:rPr>
+          <w:rFonts w:ascii="Times New Roman" w:eastAsia="Times New Roman" w:hAnsi="Times New Roman" w:cs="Times New Roman"/>
+          <w:sz w:val="24"/>
+          <w:szCs w:val="24"/>
+        </w:rPr>
+        <w:lastRenderedPageBreak/>
+        <w:t>pero la configuración de 12 workers alcanzó 387.66 ms, una diferencia de aproximadamente 4.71 ms.</w:t>
       </w:r>
     </w:p>
     <w:p>
@@ -27928,7 +28179,7 @@
           <w:szCs w:val="24"/>
         </w:rPr>
       </w:pPr>
-      <w:bookmarkStart w:id="44" w:name="_Toc241968081"/>
+      <w:bookmarkStart w:id="44" w:name="_Toc242038989"/>
       <w:r>
         <w:rPr>
           <w:rFonts w:ascii="Times New Roman" w:eastAsia="Times New Roman" w:hAnsi="Times New Roman" w:cs="Times New Roman"/>
@@ -28750,6 +29001,99 @@
     </w:p>
     <w:p>
       <w:pPr>
+        <w:keepNext/>
+        <w:spacing w:before="240" w:after="240"/>
+        <w:jc w:val="both"/>
+        <w:rPr>
+          <w:rFonts w:ascii="Times New Roman" w:eastAsia="Times New Roman" w:hAnsi="Times New Roman" w:cs="Times New Roman"/>
+          <w:sz w:val="24"/>
+          <w:szCs w:val="24"/>
+        </w:rPr>
+      </w:pPr>
+      <w:r>
+        <w:rPr>
+          <w:rFonts w:ascii="Times New Roman" w:eastAsia="Times New Roman" w:hAnsi="Times New Roman" w:cs="Times New Roman"/>
+          <w:sz w:val="24"/>
+          <w:szCs w:val="24"/>
+        </w:rPr>
+        <w:lastRenderedPageBreak/>
+        <w:t>Figura 12. Fracción secuencial experimental (Karp–Flatt) según la cantidad de workers</w:t>
+      </w:r>
+    </w:p>
+    <w:p>
+      <w:pPr>
+        <w:jc w:val="center"/>
+        <w:rPr>
+          <w:rFonts w:ascii="Times New Roman" w:eastAsia="Times New Roman" w:hAnsi="Times New Roman" w:cs="Times New Roman"/>
+          <w:sz w:val="24"/>
+          <w:szCs w:val="24"/>
+        </w:rPr>
+      </w:pPr>
+      <w:r>
+        <w:rPr>
+          <w:rFonts w:ascii="Times New Roman" w:eastAsia="Times New Roman" w:hAnsi="Times New Roman" w:cs="Times New Roman"/>
+          <w:noProof/>
+          <w:sz w:val="24"/>
+          <w:szCs w:val="24"/>
+        </w:rPr>
+        <w:drawing>
+          <wp:inline distT="114300" distB="114300" distL="114300" distR="114300" wp14:anchorId="6FDEA0A3" wp14:editId="4AC580C1">
+            <wp:extent cx="5731200" cy="3582000"/>
+            <wp:effectExtent l="0" t="0" r="0" b="0"/>
+            <wp:docPr id="16" name="karp_flatt.png"/>
+            <wp:cNvGraphicFramePr/>
+            <a:graphic xmlns:a="http://schemas.openxmlformats.org/drawingml/2006/main">
+              <a:graphicData uri="http://schemas.openxmlformats.org/drawingml/2006/picture">
+                <pic:pic xmlns:pic="http://schemas.openxmlformats.org/drawingml/2006/picture">
+                  <pic:nvPicPr>
+                    <pic:cNvPr id="0" name="karp_flatt.png"/>
+                    <pic:cNvPicPr preferRelativeResize="0"/>
+                  </pic:nvPicPr>
+                  <pic:blipFill>
+                    <a:blip r:embed="rId24"/>
+                    <a:srcRect/>
+                    <a:stretch>
+                      <a:fillRect/>
+                    </a:stretch>
+                  </pic:blipFill>
+                  <pic:spPr>
+                    <a:xfrm>
+                      <a:off x="0" y="0"/>
+                      <a:ext cx="5731200" cy="3582000"/>
+                    </a:xfrm>
+                    <a:prstGeom prst="rect">
+                      <a:avLst/>
+                    </a:prstGeom>
+                    <a:ln/>
+                  </pic:spPr>
+                </pic:pic>
+              </a:graphicData>
+            </a:graphic>
+          </wp:inline>
+        </w:drawing>
+      </w:r>
+    </w:p>
+    <w:p>
+      <w:pPr>
+        <w:spacing w:before="240" w:after="240"/>
+        <w:jc w:val="both"/>
+        <w:rPr>
+          <w:rFonts w:ascii="Times New Roman" w:eastAsia="Times New Roman" w:hAnsi="Times New Roman" w:cs="Times New Roman"/>
+          <w:sz w:val="24"/>
+          <w:szCs w:val="24"/>
+        </w:rPr>
+      </w:pPr>
+      <w:r>
+        <w:rPr>
+          <w:rFonts w:ascii="Times New Roman" w:eastAsia="Times New Roman" w:hAnsi="Times New Roman" w:cs="Times New Roman"/>
+          <w:sz w:val="24"/>
+          <w:szCs w:val="24"/>
+        </w:rPr>
+        <w:t>La Figura 12 representa la tabla anterior: la fracción secuencial experimental crece con el número de workers en lugar de mantenerse constante, lo que confirma que la saturación se debe al overhead y a los recursos compartidos del hardware.</w:t>
+      </w:r>
+    </w:p>
+    <w:p>
+      <w:pPr>
         <w:pStyle w:val="Ttulo1"/>
         <w:keepNext w:val="0"/>
         <w:keepLines w:val="0"/>
@@ -28763,7 +29107,7 @@
           <w:szCs w:val="24"/>
         </w:rPr>
       </w:pPr>
-      <w:bookmarkStart w:id="45" w:name="_Toc241968082"/>
+      <w:bookmarkStart w:id="45" w:name="_Toc242038990"/>
       <w:r>
         <w:rPr>
           <w:rFonts w:ascii="Times New Roman" w:eastAsia="Times New Roman" w:hAnsi="Times New Roman" w:cs="Times New Roman"/>
@@ -28827,14 +29171,16 @@
         <w:pStyle w:val="Ttulo2"/>
         <w:rPr>
           <w:rFonts w:ascii="Times New Roman" w:eastAsia="Times New Roman" w:hAnsi="Times New Roman" w:cs="Times New Roman"/>
-          <w:sz w:val="24"/>
-          <w:szCs w:val="24"/>
-        </w:rPr>
-      </w:pPr>
-      <w:bookmarkStart w:id="46" w:name="_Toc241968083"/>
-      <w:r>
-        <w:rPr>
-          <w:rFonts w:ascii="Times New Roman" w:eastAsia="Times New Roman" w:hAnsi="Times New Roman" w:cs="Times New Roman"/>
+          <w:b/>
+          <w:sz w:val="24"/>
+          <w:szCs w:val="24"/>
+        </w:rPr>
+      </w:pPr>
+      <w:bookmarkStart w:id="46" w:name="_Toc242038991"/>
+      <w:r>
+        <w:rPr>
+          <w:rFonts w:ascii="Times New Roman" w:eastAsia="Times New Roman" w:hAnsi="Times New Roman" w:cs="Times New Roman"/>
+          <w:b/>
           <w:sz w:val="24"/>
           <w:szCs w:val="24"/>
         </w:rPr>
@@ -28885,7 +29231,16 @@
           <w:sz w:val="24"/>
           <w:szCs w:val="24"/>
         </w:rPr>
-        <w:t>Para observar el aprovechamiento del procesador durante una carga concurrente sostenida, se utilizó el archivo cpu_profile.go con una configuración de 12 workers. Esta ejecución se prolongó intencionalmente utilizando 3000 épocas, únicamente con el propósito de mantener el procesamiento activo durante el tiempo suficiente para visualizar su comportamiento mediante el Administrador de tareas de Windows.</w:t>
+        <w:t xml:space="preserve">Para observar el aprovechamiento del procesador durante una carga concurrente sostenida, se utilizó el archivo cpu_profile.go con una configuración de 12 workers. Esta ejecución se prolongó intencionalmente utilizando 3000 épocas, únicamente con el propósito de mantener </w:t>
+      </w:r>
+      <w:r>
+        <w:rPr>
+          <w:rFonts w:ascii="Times New Roman" w:eastAsia="Times New Roman" w:hAnsi="Times New Roman" w:cs="Times New Roman"/>
+          <w:sz w:val="24"/>
+          <w:szCs w:val="24"/>
+        </w:rPr>
+        <w:lastRenderedPageBreak/>
+        <w:t>el procesamiento activo durante el tiempo suficiente para visualizar su comportamiento mediante el Administrador de tareas de Windows.</w:t>
       </w:r>
     </w:p>
     <w:p>
@@ -28956,24 +29311,26 @@
     </w:p>
     <w:p>
       <w:pPr>
-        <w:jc w:val="both"/>
-        <w:rPr>
-          <w:rFonts w:ascii="Times New Roman" w:eastAsia="Times New Roman" w:hAnsi="Times New Roman" w:cs="Times New Roman"/>
-          <w:sz w:val="24"/>
-          <w:szCs w:val="24"/>
-        </w:rPr>
-      </w:pPr>
-      <w:r>
-        <w:rPr>
-          <w:rFonts w:ascii="Times New Roman" w:eastAsia="Times New Roman" w:hAnsi="Times New Roman" w:cs="Times New Roman"/>
-          <w:sz w:val="24"/>
-          <w:szCs w:val="24"/>
-        </w:rPr>
-        <w:t>Figura 11. Utilización de CPU durante la ejecución concurrente con 12 workers</w:t>
-      </w:r>
-    </w:p>
-    <w:p>
-      <w:pPr>
+        <w:keepNext/>
+        <w:jc w:val="both"/>
+        <w:rPr>
+          <w:rFonts w:ascii="Times New Roman" w:eastAsia="Times New Roman" w:hAnsi="Times New Roman" w:cs="Times New Roman"/>
+          <w:sz w:val="24"/>
+          <w:szCs w:val="24"/>
+        </w:rPr>
+      </w:pPr>
+      <w:r>
+        <w:rPr>
+          <w:rFonts w:ascii="Times New Roman" w:eastAsia="Times New Roman" w:hAnsi="Times New Roman" w:cs="Times New Roman"/>
+          <w:sz w:val="24"/>
+          <w:szCs w:val="24"/>
+        </w:rPr>
+        <w:t>Figura 13. Utilización de CPU durante la ejecución concurrente con 12 workers</w:t>
+      </w:r>
+    </w:p>
+    <w:p>
+      <w:pPr>
+        <w:keepNext/>
         <w:jc w:val="both"/>
         <w:rPr>
           <w:rFonts w:ascii="Times New Roman" w:eastAsia="Times New Roman" w:hAnsi="Times New Roman" w:cs="Times New Roman"/>
@@ -29012,7 +29369,7 @@
                     <pic:cNvPicPr preferRelativeResize="0"/>
                   </pic:nvPicPr>
                   <pic:blipFill>
-                    <a:blip r:embed="rId23"/>
+                    <a:blip r:embed="rId25"/>
                     <a:srcRect/>
                     <a:stretch>
                       <a:fillRect/>
@@ -29087,14 +29444,16 @@
         <w:pStyle w:val="Ttulo2"/>
         <w:rPr>
           <w:rFonts w:ascii="Times New Roman" w:eastAsia="Times New Roman" w:hAnsi="Times New Roman" w:cs="Times New Roman"/>
-          <w:sz w:val="24"/>
-          <w:szCs w:val="24"/>
-        </w:rPr>
-      </w:pPr>
-      <w:bookmarkStart w:id="47" w:name="_Toc241968084"/>
-      <w:r>
-        <w:rPr>
-          <w:rFonts w:ascii="Times New Roman" w:eastAsia="Times New Roman" w:hAnsi="Times New Roman" w:cs="Times New Roman"/>
+          <w:b/>
+          <w:sz w:val="24"/>
+          <w:szCs w:val="24"/>
+        </w:rPr>
+      </w:pPr>
+      <w:bookmarkStart w:id="47" w:name="_Toc242038992"/>
+      <w:r>
+        <w:rPr>
+          <w:rFonts w:ascii="Times New Roman" w:eastAsia="Times New Roman" w:hAnsi="Times New Roman" w:cs="Times New Roman"/>
+          <w:b/>
           <w:sz w:val="24"/>
           <w:szCs w:val="24"/>
         </w:rPr>
@@ -29127,6 +29486,7 @@
           <w:sz w:val="24"/>
           <w:szCs w:val="24"/>
         </w:rPr>
+        <w:lastRenderedPageBreak/>
         <w:t>Para complementar las mediciones temporales se utilizó resource_profile.go, encargado de registrar el comportamiento de memoria durante el entrenamiento. Para cada configuración se realizaron tres ejecuciones y se registró el heap máximo aproximado, la memoria acumulada asignada durante la medición, el número de asignaciones dinámicas y la cantidad de ciclos del Garbage Collector.</w:t>
       </w:r>
     </w:p>
@@ -30861,17 +31221,20 @@
         <w:pStyle w:val="Ttulo2"/>
         <w:rPr>
           <w:rFonts w:ascii="Times New Roman" w:eastAsia="Times New Roman" w:hAnsi="Times New Roman" w:cs="Times New Roman"/>
-          <w:sz w:val="24"/>
-          <w:szCs w:val="24"/>
-        </w:rPr>
-      </w:pPr>
-      <w:bookmarkStart w:id="48" w:name="_Toc241968085"/>
-      <w:r>
-        <w:rPr>
-          <w:rFonts w:ascii="Times New Roman" w:eastAsia="Times New Roman" w:hAnsi="Times New Roman" w:cs="Times New Roman"/>
-          <w:sz w:val="24"/>
-          <w:szCs w:val="24"/>
-        </w:rPr>
+          <w:b/>
+          <w:sz w:val="24"/>
+          <w:szCs w:val="24"/>
+        </w:rPr>
+      </w:pPr>
+      <w:bookmarkStart w:id="48" w:name="_Toc242038993"/>
+      <w:r>
+        <w:rPr>
+          <w:rFonts w:ascii="Times New Roman" w:eastAsia="Times New Roman" w:hAnsi="Times New Roman" w:cs="Times New Roman"/>
+          <w:b/>
+          <w:sz w:val="24"/>
+          <w:szCs w:val="24"/>
+        </w:rPr>
+        <w:lastRenderedPageBreak/>
         <w:t>11.3 Punto de equilibrio</w:t>
       </w:r>
       <w:bookmarkEnd w:id="48"/>
@@ -31891,7 +32254,16 @@
           <w:sz w:val="24"/>
           <w:szCs w:val="24"/>
         </w:rPr>
-        <w:t>Por otro lado, 16 workers se mantiene como la configuración de mayor rendimiento temporal absoluto. La distinción entre ambos resultados permite evitar interpretar el punto de equilibrio como sinónimo de la configuración más rápida: 16 workers minimiza el tiempo, mientras que 12 workers ofrece una relación más favorable entre tiempo de ejecución, eficiencia y uso adicional de recursos.</w:t>
+        <w:t xml:space="preserve">Por otro lado, 16 workers se mantiene como la configuración de mayor rendimiento temporal absoluto. La distinción entre ambos resultados permite evitar interpretar el punto de equilibrio como sinónimo de la configuración más rápida: 16 workers minimiza el tiempo, mientras que </w:t>
+      </w:r>
+      <w:r>
+        <w:rPr>
+          <w:rFonts w:ascii="Times New Roman" w:eastAsia="Times New Roman" w:hAnsi="Times New Roman" w:cs="Times New Roman"/>
+          <w:sz w:val="24"/>
+          <w:szCs w:val="24"/>
+        </w:rPr>
+        <w:lastRenderedPageBreak/>
+        <w:t>12 workers ofrece una relación más favorable entre tiempo de ejecución, eficiencia y uso adicional de recursos.</w:t>
       </w:r>
     </w:p>
     <w:p>
@@ -32586,6 +32958,99 @@
     </w:p>
     <w:p>
       <w:pPr>
+        <w:keepNext/>
+        <w:spacing w:before="240" w:after="240"/>
+        <w:jc w:val="both"/>
+        <w:rPr>
+          <w:rFonts w:ascii="Times New Roman" w:eastAsia="Times New Roman" w:hAnsi="Times New Roman" w:cs="Times New Roman"/>
+          <w:sz w:val="24"/>
+          <w:szCs w:val="24"/>
+        </w:rPr>
+      </w:pPr>
+      <w:r>
+        <w:rPr>
+          <w:rFonts w:ascii="Times New Roman" w:eastAsia="Times New Roman" w:hAnsi="Times New Roman" w:cs="Times New Roman"/>
+          <w:sz w:val="24"/>
+          <w:szCs w:val="24"/>
+        </w:rPr>
+        <w:t>Figura 14. Asignaciones de memoria y speedup según la cantidad de workers</w:t>
+      </w:r>
+    </w:p>
+    <w:p>
+      <w:pPr>
+        <w:jc w:val="center"/>
+        <w:rPr>
+          <w:rFonts w:ascii="Times New Roman" w:eastAsia="Times New Roman" w:hAnsi="Times New Roman" w:cs="Times New Roman"/>
+          <w:sz w:val="24"/>
+          <w:szCs w:val="24"/>
+        </w:rPr>
+      </w:pPr>
+      <w:r>
+        <w:rPr>
+          <w:rFonts w:ascii="Times New Roman" w:eastAsia="Times New Roman" w:hAnsi="Times New Roman" w:cs="Times New Roman"/>
+          <w:noProof/>
+          <w:sz w:val="24"/>
+          <w:szCs w:val="24"/>
+        </w:rPr>
+        <w:drawing>
+          <wp:inline distT="114300" distB="114300" distL="114300" distR="114300" wp14:anchorId="15E9498D" wp14:editId="31B76D1B">
+            <wp:extent cx="5731200" cy="3582000"/>
+            <wp:effectExtent l="0" t="0" r="0" b="0"/>
+            <wp:docPr id="17" name="memoria.png"/>
+            <wp:cNvGraphicFramePr/>
+            <a:graphic xmlns:a="http://schemas.openxmlformats.org/drawingml/2006/main">
+              <a:graphicData uri="http://schemas.openxmlformats.org/drawingml/2006/picture">
+                <pic:pic xmlns:pic="http://schemas.openxmlformats.org/drawingml/2006/picture">
+                  <pic:nvPicPr>
+                    <pic:cNvPr id="0" name="memoria.png"/>
+                    <pic:cNvPicPr preferRelativeResize="0"/>
+                  </pic:nvPicPr>
+                  <pic:blipFill>
+                    <a:blip r:embed="rId26"/>
+                    <a:srcRect/>
+                    <a:stretch>
+                      <a:fillRect/>
+                    </a:stretch>
+                  </pic:blipFill>
+                  <pic:spPr>
+                    <a:xfrm>
+                      <a:off x="0" y="0"/>
+                      <a:ext cx="5731200" cy="3582000"/>
+                    </a:xfrm>
+                    <a:prstGeom prst="rect">
+                      <a:avLst/>
+                    </a:prstGeom>
+                    <a:ln/>
+                  </pic:spPr>
+                </pic:pic>
+              </a:graphicData>
+            </a:graphic>
+          </wp:inline>
+        </w:drawing>
+      </w:r>
+    </w:p>
+    <w:p>
+      <w:pPr>
+        <w:spacing w:before="240" w:after="240"/>
+        <w:jc w:val="both"/>
+        <w:rPr>
+          <w:rFonts w:ascii="Times New Roman" w:eastAsia="Times New Roman" w:hAnsi="Times New Roman" w:cs="Times New Roman"/>
+          <w:sz w:val="24"/>
+          <w:szCs w:val="24"/>
+        </w:rPr>
+      </w:pPr>
+      <w:r>
+        <w:rPr>
+          <w:rFonts w:ascii="Times New Roman" w:eastAsia="Times New Roman" w:hAnsi="Times New Roman" w:cs="Times New Roman"/>
+          <w:sz w:val="24"/>
+          <w:szCs w:val="24"/>
+        </w:rPr>
+        <w:lastRenderedPageBreak/>
+        <w:t>La Figura 14 resume el punto de equilibrio: a partir de 8 workers el speedup prácticamente no aumenta, mientras que las asignaciones de memoria siguen creciendo de forma lineal.</w:t>
+      </w:r>
+    </w:p>
+    <w:p>
+      <w:pPr>
         <w:pStyle w:val="Ttulo1"/>
         <w:keepNext w:val="0"/>
         <w:keepLines w:val="0"/>
@@ -32597,7 +33062,7 @@
           <w:szCs w:val="24"/>
         </w:rPr>
       </w:pPr>
-      <w:bookmarkStart w:id="49" w:name="_Toc241968086"/>
+      <w:bookmarkStart w:id="49" w:name="_Toc242038994"/>
       <w:r>
         <w:rPr>
           <w:rFonts w:ascii="Times New Roman" w:eastAsia="Times New Roman" w:hAnsi="Times New Roman" w:cs="Times New Roman"/>
@@ -32647,7 +33112,7 @@
         </w:rPr>
         <w:t xml:space="preserve">Link del repositorio: </w:t>
       </w:r>
-      <w:hyperlink r:id="rId24">
+      <w:hyperlink r:id="rId27">
         <w:r>
           <w:rPr>
             <w:rFonts w:ascii="Times New Roman" w:eastAsia="Times New Roman" w:hAnsi="Times New Roman" w:cs="Times New Roman"/>
@@ -32685,8 +33150,27 @@
     </w:p>
     <w:p>
       <w:pPr>
-        <w:spacing w:after="160"/>
-        <w:jc w:val="both"/>
+        <w:keepNext/>
+        <w:spacing w:before="240" w:after="240"/>
+        <w:jc w:val="both"/>
+        <w:rPr>
+          <w:rFonts w:ascii="Times New Roman" w:eastAsia="Times New Roman" w:hAnsi="Times New Roman" w:cs="Times New Roman"/>
+          <w:sz w:val="24"/>
+          <w:szCs w:val="24"/>
+        </w:rPr>
+      </w:pPr>
+      <w:r>
+        <w:rPr>
+          <w:rFonts w:ascii="Times New Roman" w:eastAsia="Times New Roman" w:hAnsi="Times New Roman" w:cs="Times New Roman"/>
+          <w:sz w:val="24"/>
+          <w:szCs w:val="24"/>
+        </w:rPr>
+        <w:t>Figura 15. Historial de commits de la rama main en GitHub (4 de octubre de 2026)</w:t>
+      </w:r>
+    </w:p>
+    <w:p>
+      <w:pPr>
+        <w:jc w:val="center"/>
         <w:rPr>
           <w:rFonts w:ascii="Times New Roman" w:eastAsia="Times New Roman" w:hAnsi="Times New Roman" w:cs="Times New Roman"/>
           <w:sz w:val="24"/>
@@ -32701,20 +33185,20 @@
           <w:szCs w:val="24"/>
         </w:rPr>
         <w:drawing>
-          <wp:inline distT="114300" distB="114300" distL="114300" distR="114300" wp14:anchorId="202128D6" wp14:editId="332867E5">
-            <wp:extent cx="5731200" cy="4610100"/>
+          <wp:inline distT="114300" distB="114300" distL="114300" distR="114300" wp14:anchorId="64E17834" wp14:editId="38CD4319">
+            <wp:extent cx="5731200" cy="5910300"/>
             <wp:effectExtent l="0" t="0" r="0" b="0"/>
-            <wp:docPr id="7" name="image11.png"/>
+            <wp:docPr id="18" name="github_commits.png"/>
             <wp:cNvGraphicFramePr/>
             <a:graphic xmlns:a="http://schemas.openxmlformats.org/drawingml/2006/main">
               <a:graphicData uri="http://schemas.openxmlformats.org/drawingml/2006/picture">
                 <pic:pic xmlns:pic="http://schemas.openxmlformats.org/drawingml/2006/picture">
                   <pic:nvPicPr>
-                    <pic:cNvPr id="0" name="image11.png"/>
+                    <pic:cNvPr id="0" name="github_commits.png"/>
                     <pic:cNvPicPr preferRelativeResize="0"/>
                   </pic:nvPicPr>
                   <pic:blipFill>
-                    <a:blip r:embed="rId25"/>
+                    <a:blip r:embed="rId28"/>
                     <a:srcRect/>
                     <a:stretch>
                       <a:fillRect/>
@@ -32723,7 +33207,7 @@
                   <pic:spPr>
                     <a:xfrm>
                       <a:off x="0" y="0"/>
-                      <a:ext cx="5731200" cy="4610100"/>
+                      <a:ext cx="5731200" cy="5910300"/>
                     </a:xfrm>
                     <a:prstGeom prst="rect">
                       <a:avLst/>
@@ -32736,13 +33220,79 @@
           </wp:inline>
         </w:drawing>
       </w:r>
-      <w:r>
-        <w:rPr>
-          <w:rFonts w:ascii="Times New Roman" w:eastAsia="Times New Roman" w:hAnsi="Times New Roman" w:cs="Times New Roman"/>
-          <w:sz w:val="24"/>
-          <w:szCs w:val="24"/>
-        </w:rPr>
-        <w:t xml:space="preserve"> </w:t>
+    </w:p>
+    <w:p>
+      <w:pPr>
+        <w:keepNext/>
+        <w:spacing w:before="240" w:after="240"/>
+        <w:jc w:val="both"/>
+        <w:rPr>
+          <w:rFonts w:ascii="Times New Roman" w:eastAsia="Times New Roman" w:hAnsi="Times New Roman" w:cs="Times New Roman"/>
+          <w:sz w:val="24"/>
+          <w:szCs w:val="24"/>
+        </w:rPr>
+      </w:pPr>
+      <w:r>
+        <w:rPr>
+          <w:rFonts w:ascii="Times New Roman" w:eastAsia="Times New Roman" w:hAnsi="Times New Roman" w:cs="Times New Roman"/>
+          <w:sz w:val="24"/>
+          <w:szCs w:val="24"/>
+        </w:rPr>
+        <w:lastRenderedPageBreak/>
+        <w:t>Figura 16. Commits por integrante en la rama main (git shortlog)</w:t>
+      </w:r>
+    </w:p>
+    <w:p>
+      <w:pPr>
+        <w:jc w:val="center"/>
+        <w:rPr>
+          <w:rFonts w:ascii="Times New Roman" w:eastAsia="Times New Roman" w:hAnsi="Times New Roman" w:cs="Times New Roman"/>
+          <w:sz w:val="24"/>
+          <w:szCs w:val="24"/>
+        </w:rPr>
+      </w:pPr>
+      <w:r>
+        <w:rPr>
+          <w:rFonts w:ascii="Times New Roman" w:eastAsia="Times New Roman" w:hAnsi="Times New Roman" w:cs="Times New Roman"/>
+          <w:noProof/>
+          <w:sz w:val="24"/>
+          <w:szCs w:val="24"/>
+        </w:rPr>
+        <w:drawing>
+          <wp:inline distT="114300" distB="114300" distL="114300" distR="114300" wp14:anchorId="3593F89D" wp14:editId="08B57368">
+            <wp:extent cx="4867275" cy="1826895"/>
+            <wp:effectExtent l="0" t="0" r="0" b="0"/>
+            <wp:docPr id="19" name="git_shortlog.png"/>
+            <wp:cNvGraphicFramePr/>
+            <a:graphic xmlns:a="http://schemas.openxmlformats.org/drawingml/2006/main">
+              <a:graphicData uri="http://schemas.openxmlformats.org/drawingml/2006/picture">
+                <pic:pic xmlns:pic="http://schemas.openxmlformats.org/drawingml/2006/picture">
+                  <pic:nvPicPr>
+                    <pic:cNvPr id="0" name="git_shortlog.png"/>
+                    <pic:cNvPicPr preferRelativeResize="0"/>
+                  </pic:nvPicPr>
+                  <pic:blipFill>
+                    <a:blip r:embed="rId29"/>
+                    <a:srcRect/>
+                    <a:stretch>
+                      <a:fillRect/>
+                    </a:stretch>
+                  </pic:blipFill>
+                  <pic:spPr>
+                    <a:xfrm>
+                      <a:off x="0" y="0"/>
+                      <a:ext cx="4867275" cy="1826895"/>
+                    </a:xfrm>
+                    <a:prstGeom prst="rect">
+                      <a:avLst/>
+                    </a:prstGeom>
+                    <a:ln/>
+                  </pic:spPr>
+                </pic:pic>
+              </a:graphicData>
+            </a:graphic>
+          </wp:inline>
+        </w:drawing>
       </w:r>
     </w:p>
     <w:p>
@@ -32894,6 +33444,102 @@
     </w:p>
     <w:p>
       <w:pPr>
+        <w:numPr>
+          <w:ilvl w:val="0"/>
+          <w:numId w:val="1"/>
+        </w:numPr>
+        <w:jc w:val="both"/>
+        <w:rPr>
+          <w:rFonts w:ascii="Times New Roman" w:eastAsia="Times New Roman" w:hAnsi="Times New Roman" w:cs="Times New Roman"/>
+          <w:sz w:val="24"/>
+          <w:szCs w:val="24"/>
+        </w:rPr>
+      </w:pPr>
+      <w:r>
+        <w:rPr>
+          <w:rFonts w:ascii="Times New Roman" w:eastAsia="Times New Roman" w:hAnsi="Times New Roman" w:cs="Times New Roman"/>
+          <w:b/>
+          <w:bCs/>
+          <w:sz w:val="24"/>
+          <w:szCs w:val="24"/>
+        </w:rPr>
+        <w:t>feature/tp-delivery (PR #9) y develop → main (PR #10): mutantes de SPIN, análisis de GAPs con IA, corrección de los GAPs e informe del TP.</w:t>
+      </w:r>
+    </w:p>
+    <w:p>
+      <w:pPr>
+        <w:numPr>
+          <w:ilvl w:val="0"/>
+          <w:numId w:val="1"/>
+        </w:numPr>
+        <w:jc w:val="both"/>
+        <w:rPr>
+          <w:rFonts w:ascii="Times New Roman" w:eastAsia="Times New Roman" w:hAnsi="Times New Roman" w:cs="Times New Roman"/>
+          <w:sz w:val="24"/>
+          <w:szCs w:val="24"/>
+        </w:rPr>
+      </w:pPr>
+      <w:r>
+        <w:rPr>
+          <w:rFonts w:ascii="Times New Roman" w:eastAsia="Times New Roman" w:hAnsi="Times New Roman" w:cs="Times New Roman"/>
+          <w:b/>
+          <w:bCs/>
+          <w:sz w:val="24"/>
+          <w:szCs w:val="24"/>
+        </w:rPr>
+        <w:t>docs/tp-video-script (PR #11) y develop → main (PR #12): guion del video y lista de verificación de la entrega.</w:t>
+      </w:r>
+    </w:p>
+    <w:p>
+      <w:pPr>
+        <w:numPr>
+          <w:ilvl w:val="0"/>
+          <w:numId w:val="1"/>
+        </w:numPr>
+        <w:jc w:val="both"/>
+        <w:rPr>
+          <w:rFonts w:ascii="Times New Roman" w:eastAsia="Times New Roman" w:hAnsi="Times New Roman" w:cs="Times New Roman"/>
+          <w:sz w:val="24"/>
+          <w:szCs w:val="24"/>
+        </w:rPr>
+      </w:pPr>
+      <w:r>
+        <w:rPr>
+          <w:rFonts w:ascii="Times New Roman" w:eastAsia="Times New Roman" w:hAnsi="Times New Roman" w:cs="Times New Roman"/>
+          <w:b/>
+          <w:bCs/>
+          <w:sz w:val="24"/>
+          <w:szCs w:val="24"/>
+        </w:rPr>
+        <w:t>feature/tp-spin-review (PR #13): revalidación de la verificación formal en SPIN.</w:t>
+      </w:r>
+    </w:p>
+    <w:p>
+      <w:pPr>
+        <w:numPr>
+          <w:ilvl w:val="0"/>
+          <w:numId w:val="1"/>
+        </w:numPr>
+        <w:jc w:val="both"/>
+        <w:rPr>
+          <w:rFonts w:ascii="Times New Roman" w:eastAsia="Times New Roman" w:hAnsi="Times New Roman" w:cs="Times New Roman"/>
+          <w:sz w:val="24"/>
+          <w:szCs w:val="24"/>
+        </w:rPr>
+      </w:pPr>
+      <w:r>
+        <w:rPr>
+          <w:rFonts w:ascii="Times New Roman" w:eastAsia="Times New Roman" w:hAnsi="Times New Roman" w:cs="Times New Roman"/>
+          <w:b/>
+          <w:bCs/>
+          <w:sz w:val="24"/>
+          <w:szCs w:val="24"/>
+        </w:rPr>
+        <w:t>docs/tp-report-figures: actualización de las figuras del informe del TP.</w:t>
+      </w:r>
+    </w:p>
+    <w:p>
+      <w:pPr>
         <w:spacing w:after="100"/>
         <w:jc w:val="both"/>
         <w:rPr>
@@ -32926,7 +33572,7 @@
           <w:szCs w:val="24"/>
         </w:rPr>
       </w:pPr>
-      <w:bookmarkStart w:id="50" w:name="_Toc241968087"/>
+      <w:bookmarkStart w:id="50" w:name="_Toc242038995"/>
       <w:r>
         <w:rPr>
           <w:rFonts w:ascii="Times New Roman" w:eastAsia="Times New Roman" w:hAnsi="Times New Roman" w:cs="Times New Roman"/>
@@ -33165,7 +33811,7 @@
           <w:szCs w:val="24"/>
         </w:rPr>
       </w:pPr>
-      <w:bookmarkStart w:id="51" w:name="_Toc241968088"/>
+      <w:bookmarkStart w:id="51" w:name="_Toc242038996"/>
       <w:r>
         <w:rPr>
           <w:rFonts w:ascii="Times New Roman" w:eastAsia="Times New Roman" w:hAnsi="Times New Roman" w:cs="Times New Roman"/>
@@ -33174,6 +33820,7 @@
           <w:sz w:val="24"/>
           <w:szCs w:val="24"/>
         </w:rPr>
+        <w:lastRenderedPageBreak/>
         <w:t>14. Verificación formal en SPIN</w:t>
       </w:r>
       <w:bookmarkEnd w:id="51"/>
@@ -33212,7 +33859,7 @@
           <w:szCs w:val="24"/>
         </w:rPr>
       </w:pPr>
-      <w:bookmarkStart w:id="52" w:name="_Toc241968089"/>
+      <w:bookmarkStart w:id="52" w:name="_Toc242038997"/>
       <w:r>
         <w:rPr>
           <w:rFonts w:ascii="Times New Roman" w:eastAsia="Times New Roman" w:hAnsi="Times New Roman" w:cs="Times New Roman"/>
@@ -33368,7 +34015,7 @@
           <w:szCs w:val="24"/>
         </w:rPr>
       </w:pPr>
-      <w:bookmarkStart w:id="53" w:name="_Toc241968090"/>
+      <w:bookmarkStart w:id="53" w:name="_Toc242038998"/>
       <w:r>
         <w:rPr>
           <w:rFonts w:ascii="Times New Roman" w:eastAsia="Times New Roman" w:hAnsi="Times New Roman" w:cs="Times New Roman"/>
@@ -34157,6 +34804,99 @@
     </w:p>
     <w:p>
       <w:pPr>
+        <w:keepNext/>
+        <w:spacing w:before="240" w:after="240"/>
+        <w:jc w:val="both"/>
+        <w:rPr>
+          <w:rFonts w:ascii="Times New Roman" w:eastAsia="Times New Roman" w:hAnsi="Times New Roman" w:cs="Times New Roman"/>
+          <w:sz w:val="24"/>
+          <w:szCs w:val="24"/>
+        </w:rPr>
+      </w:pPr>
+      <w:r>
+        <w:rPr>
+          <w:rFonts w:ascii="Times New Roman" w:eastAsia="Times New Roman" w:hAnsi="Times New Roman" w:cs="Times New Roman"/>
+          <w:sz w:val="24"/>
+          <w:szCs w:val="24"/>
+        </w:rPr>
+        <w:lastRenderedPageBreak/>
+        <w:t>Figura 17. Verificación del modelo correcto con promela/run_spin.sh (3 workers, 4 jobs)</w:t>
+      </w:r>
+    </w:p>
+    <w:p>
+      <w:pPr>
+        <w:jc w:val="center"/>
+        <w:rPr>
+          <w:rFonts w:ascii="Times New Roman" w:eastAsia="Times New Roman" w:hAnsi="Times New Roman" w:cs="Times New Roman"/>
+          <w:sz w:val="24"/>
+          <w:szCs w:val="24"/>
+        </w:rPr>
+      </w:pPr>
+      <w:r>
+        <w:rPr>
+          <w:rFonts w:ascii="Times New Roman" w:eastAsia="Times New Roman" w:hAnsi="Times New Roman" w:cs="Times New Roman"/>
+          <w:noProof/>
+          <w:sz w:val="24"/>
+          <w:szCs w:val="24"/>
+        </w:rPr>
+        <w:drawing>
+          <wp:inline distT="114300" distB="114300" distL="114300" distR="114300" wp14:anchorId="3419247D" wp14:editId="4399A2BB">
+            <wp:extent cx="5109090" cy="7400000"/>
+            <wp:effectExtent l="0" t="0" r="0" b="0"/>
+            <wp:docPr id="20" name="spin_correcto.png"/>
+            <wp:cNvGraphicFramePr/>
+            <a:graphic xmlns:a="http://schemas.openxmlformats.org/drawingml/2006/main">
+              <a:graphicData uri="http://schemas.openxmlformats.org/drawingml/2006/picture">
+                <pic:pic xmlns:pic="http://schemas.openxmlformats.org/drawingml/2006/picture">
+                  <pic:nvPicPr>
+                    <pic:cNvPr id="0" name="spin_correcto.png"/>
+                    <pic:cNvPicPr preferRelativeResize="0"/>
+                  </pic:nvPicPr>
+                  <pic:blipFill>
+                    <a:blip r:embed="rId30"/>
+                    <a:srcRect/>
+                    <a:stretch>
+                      <a:fillRect/>
+                    </a:stretch>
+                  </pic:blipFill>
+                  <pic:spPr>
+                    <a:xfrm>
+                      <a:off x="0" y="0"/>
+                      <a:ext cx="5109090" cy="7400000"/>
+                    </a:xfrm>
+                    <a:prstGeom prst="rect">
+                      <a:avLst/>
+                    </a:prstGeom>
+                    <a:ln/>
+                  </pic:spPr>
+                </pic:pic>
+              </a:graphicData>
+            </a:graphic>
+          </wp:inline>
+        </w:drawing>
+      </w:r>
+    </w:p>
+    <w:p>
+      <w:pPr>
+        <w:spacing w:before="240" w:after="240"/>
+        <w:jc w:val="both"/>
+        <w:rPr>
+          <w:rFonts w:ascii="Times New Roman" w:eastAsia="Times New Roman" w:hAnsi="Times New Roman" w:cs="Times New Roman"/>
+          <w:sz w:val="24"/>
+          <w:szCs w:val="24"/>
+        </w:rPr>
+      </w:pPr>
+      <w:r>
+        <w:rPr>
+          <w:rFonts w:ascii="Times New Roman" w:eastAsia="Times New Roman" w:hAnsi="Times New Roman" w:cs="Times New Roman"/>
+          <w:sz w:val="24"/>
+          <w:szCs w:val="24"/>
+        </w:rPr>
+        <w:t>La ausencia de deadlocks se toma de la corrida de seguridad, compilada con -DSAFETY y -DNOCLAIM, porque en las corridas LTL SPIN desactiva la detección de estados finales inválidos al usar una never claim. Las propiedades mutex, safe_update y termination se verifican después como fórmulas LTL independientes.</w:t>
+      </w:r>
+    </w:p>
+    <w:p>
+      <w:pPr>
         <w:pStyle w:val="Ttulo2"/>
         <w:keepNext w:val="0"/>
         <w:keepLines w:val="0"/>
@@ -34170,7 +34910,7 @@
           <w:szCs w:val="24"/>
         </w:rPr>
       </w:pPr>
-      <w:bookmarkStart w:id="54" w:name="_Toc241968091"/>
+      <w:bookmarkStart w:id="54" w:name="_Toc242038999"/>
       <w:r>
         <w:rPr>
           <w:rFonts w:ascii="Times New Roman" w:eastAsia="Times New Roman" w:hAnsi="Times New Roman" w:cs="Times New Roman"/>
@@ -34179,6 +34919,7 @@
           <w:sz w:val="24"/>
           <w:szCs w:val="24"/>
         </w:rPr>
+        <w:lastRenderedPageBreak/>
         <w:t>14.3 Modelos mutantes</w:t>
       </w:r>
       <w:bookmarkEnd w:id="54"/>
@@ -34763,6 +35504,80 @@
     </w:p>
     <w:p>
       <w:pPr>
+        <w:keepNext/>
+        <w:spacing w:before="240" w:after="240"/>
+        <w:jc w:val="both"/>
+        <w:rPr>
+          <w:rFonts w:ascii="Times New Roman" w:eastAsia="Times New Roman" w:hAnsi="Times New Roman" w:cs="Times New Roman"/>
+          <w:sz w:val="24"/>
+          <w:szCs w:val="24"/>
+        </w:rPr>
+      </w:pPr>
+      <w:r>
+        <w:rPr>
+          <w:rFonts w:ascii="Times New Roman" w:eastAsia="Times New Roman" w:hAnsi="Times New Roman" w:cs="Times New Roman"/>
+          <w:sz w:val="24"/>
+          <w:szCs w:val="24"/>
+        </w:rPr>
+        <w:lastRenderedPageBreak/>
+        <w:t>Figura 18. SPIN detecta los defectos introducidos en los modelos mutantes</w:t>
+      </w:r>
+    </w:p>
+    <w:p>
+      <w:pPr>
+        <w:jc w:val="center"/>
+        <w:rPr>
+          <w:rFonts w:ascii="Times New Roman" w:eastAsia="Times New Roman" w:hAnsi="Times New Roman" w:cs="Times New Roman"/>
+          <w:sz w:val="24"/>
+          <w:szCs w:val="24"/>
+        </w:rPr>
+      </w:pPr>
+      <w:r>
+        <w:rPr>
+          <w:rFonts w:ascii="Times New Roman" w:eastAsia="Times New Roman" w:hAnsi="Times New Roman" w:cs="Times New Roman"/>
+          <w:noProof/>
+          <w:sz w:val="24"/>
+          <w:szCs w:val="24"/>
+        </w:rPr>
+        <w:drawing>
+          <wp:inline distT="114300" distB="114300" distL="114300" distR="114300" wp14:anchorId="7804B92C" wp14:editId="6840B3A2">
+            <wp:extent cx="5731200" cy="3849776"/>
+            <wp:effectExtent l="0" t="0" r="0" b="0"/>
+            <wp:docPr id="21" name="spin_mutantes.png"/>
+            <wp:cNvGraphicFramePr/>
+            <a:graphic xmlns:a="http://schemas.openxmlformats.org/drawingml/2006/main">
+              <a:graphicData uri="http://schemas.openxmlformats.org/drawingml/2006/picture">
+                <pic:pic xmlns:pic="http://schemas.openxmlformats.org/drawingml/2006/picture">
+                  <pic:nvPicPr>
+                    <pic:cNvPr id="0" name="spin_mutantes.png"/>
+                    <pic:cNvPicPr preferRelativeResize="0"/>
+                  </pic:nvPicPr>
+                  <pic:blipFill>
+                    <a:blip r:embed="rId31"/>
+                    <a:srcRect/>
+                    <a:stretch>
+                      <a:fillRect/>
+                    </a:stretch>
+                  </pic:blipFill>
+                  <pic:spPr>
+                    <a:xfrm>
+                      <a:off x="0" y="0"/>
+                      <a:ext cx="5731200" cy="3849776"/>
+                    </a:xfrm>
+                    <a:prstGeom prst="rect">
+                      <a:avLst/>
+                    </a:prstGeom>
+                    <a:ln/>
+                  </pic:spPr>
+                </pic:pic>
+              </a:graphicData>
+            </a:graphic>
+          </wp:inline>
+        </w:drawing>
+      </w:r>
+    </w:p>
+    <w:p>
+      <w:pPr>
         <w:pStyle w:val="Ttulo1"/>
         <w:keepNext w:val="0"/>
         <w:keepLines w:val="0"/>
@@ -34776,7 +35591,7 @@
           <w:szCs w:val="24"/>
         </w:rPr>
       </w:pPr>
-      <w:bookmarkStart w:id="55" w:name="_Toc241968092"/>
+      <w:bookmarkStart w:id="55" w:name="_Toc242039000"/>
       <w:r>
         <w:rPr>
           <w:rFonts w:ascii="Times New Roman" w:eastAsia="Times New Roman" w:hAnsi="Times New Roman" w:cs="Times New Roman"/>
@@ -34804,7 +35619,7 @@
           <w:szCs w:val="24"/>
         </w:rPr>
       </w:pPr>
-      <w:bookmarkStart w:id="56" w:name="_Toc241968093"/>
+      <w:bookmarkStart w:id="56" w:name="_Toc242039001"/>
       <w:r>
         <w:rPr>
           <w:rFonts w:ascii="Times New Roman" w:eastAsia="Times New Roman" w:hAnsi="Times New Roman" w:cs="Times New Roman"/>
@@ -34878,7 +35693,7 @@
           <w:szCs w:val="24"/>
         </w:rPr>
       </w:pPr>
-      <w:bookmarkStart w:id="57" w:name="_Toc241968094"/>
+      <w:bookmarkStart w:id="57" w:name="_Toc242039002"/>
       <w:r>
         <w:rPr>
           <w:rFonts w:ascii="Times New Roman" w:eastAsia="Times New Roman" w:hAnsi="Times New Roman" w:cs="Times New Roman"/>
@@ -34960,6 +35775,7 @@
                 <w:sz w:val="24"/>
                 <w:szCs w:val="24"/>
               </w:rPr>
+              <w:lastRenderedPageBreak/>
               <w:t>GAP</w:t>
             </w:r>
           </w:p>
@@ -36266,6 +37082,80 @@
           <w:szCs w:val="24"/>
         </w:rPr>
         <w:t>Tabla. Resumen de GAPs y su estado.</w:t>
+      </w:r>
+    </w:p>
+    <w:p>
+      <w:pPr>
+        <w:keepNext/>
+        <w:spacing w:before="240" w:after="240"/>
+        <w:jc w:val="both"/>
+        <w:rPr>
+          <w:rFonts w:ascii="Times New Roman" w:eastAsia="Times New Roman" w:hAnsi="Times New Roman" w:cs="Times New Roman"/>
+          <w:sz w:val="24"/>
+          <w:szCs w:val="24"/>
+        </w:rPr>
+      </w:pPr>
+      <w:r>
+        <w:rPr>
+          <w:rFonts w:ascii="Times New Roman" w:eastAsia="Times New Roman" w:hAnsi="Times New Roman" w:cs="Times New Roman"/>
+          <w:sz w:val="24"/>
+          <w:szCs w:val="24"/>
+        </w:rPr>
+        <w:lastRenderedPageBreak/>
+        <w:t>Figura 19. GAPs detectados por la IA según severidad y estado</w:t>
+      </w:r>
+    </w:p>
+    <w:p>
+      <w:pPr>
+        <w:jc w:val="center"/>
+        <w:rPr>
+          <w:rFonts w:ascii="Times New Roman" w:eastAsia="Times New Roman" w:hAnsi="Times New Roman" w:cs="Times New Roman"/>
+          <w:sz w:val="24"/>
+          <w:szCs w:val="24"/>
+        </w:rPr>
+      </w:pPr>
+      <w:r>
+        <w:rPr>
+          <w:rFonts w:ascii="Times New Roman" w:eastAsia="Times New Roman" w:hAnsi="Times New Roman" w:cs="Times New Roman"/>
+          <w:noProof/>
+          <w:sz w:val="24"/>
+          <w:szCs w:val="24"/>
+        </w:rPr>
+        <w:drawing>
+          <wp:inline distT="114300" distB="114300" distL="114300" distR="114300" wp14:anchorId="1538485D" wp14:editId="2B3CCA97">
+            <wp:extent cx="5731200" cy="3582000"/>
+            <wp:effectExtent l="0" t="0" r="0" b="0"/>
+            <wp:docPr id="22" name="gaps_estado.png"/>
+            <wp:cNvGraphicFramePr/>
+            <a:graphic xmlns:a="http://schemas.openxmlformats.org/drawingml/2006/main">
+              <a:graphicData uri="http://schemas.openxmlformats.org/drawingml/2006/picture">
+                <pic:pic xmlns:pic="http://schemas.openxmlformats.org/drawingml/2006/picture">
+                  <pic:nvPicPr>
+                    <pic:cNvPr id="0" name="gaps_estado.png"/>
+                    <pic:cNvPicPr preferRelativeResize="0"/>
+                  </pic:nvPicPr>
+                  <pic:blipFill>
+                    <a:blip r:embed="rId32"/>
+                    <a:srcRect/>
+                    <a:stretch>
+                      <a:fillRect/>
+                    </a:stretch>
+                  </pic:blipFill>
+                  <pic:spPr>
+                    <a:xfrm>
+                      <a:off x="0" y="0"/>
+                      <a:ext cx="5731200" cy="3582000"/>
+                    </a:xfrm>
+                    <a:prstGeom prst="rect">
+                      <a:avLst/>
+                    </a:prstGeom>
+                    <a:ln/>
+                  </pic:spPr>
+                </pic:pic>
+              </a:graphicData>
+            </a:graphic>
+          </wp:inline>
+        </w:drawing>
       </w:r>
     </w:p>
     <w:p>
@@ -36283,7 +37173,7 @@
           <w:szCs w:val="24"/>
         </w:rPr>
       </w:pPr>
-      <w:bookmarkStart w:id="58" w:name="_Toc241968095"/>
+      <w:bookmarkStart w:id="58" w:name="_Toc242039003"/>
       <w:r>
         <w:rPr>
           <w:rFonts w:ascii="Times New Roman" w:eastAsia="Times New Roman" w:hAnsi="Times New Roman" w:cs="Times New Roman"/>
@@ -36321,6 +37211,80 @@
           <w:szCs w:val="24"/>
         </w:rPr>
         <w:t xml:space="preserve"> contra el código antes de corregirlo.</w:t>
+      </w:r>
+    </w:p>
+    <w:p>
+      <w:pPr>
+        <w:keepNext/>
+        <w:spacing w:before="240" w:after="240"/>
+        <w:jc w:val="both"/>
+        <w:rPr>
+          <w:rFonts w:ascii="Times New Roman" w:eastAsia="Times New Roman" w:hAnsi="Times New Roman" w:cs="Times New Roman"/>
+          <w:sz w:val="24"/>
+          <w:szCs w:val="24"/>
+        </w:rPr>
+      </w:pPr>
+      <w:r>
+        <w:rPr>
+          <w:rFonts w:ascii="Times New Roman" w:eastAsia="Times New Roman" w:hAnsi="Times New Roman" w:cs="Times New Roman"/>
+          <w:sz w:val="24"/>
+          <w:szCs w:val="24"/>
+        </w:rPr>
+        <w:lastRenderedPageBreak/>
+        <w:t>Figura 20. Ejecución de go test -race sobre la implementación final, sin carreras detectadas</w:t>
+      </w:r>
+    </w:p>
+    <w:p>
+      <w:pPr>
+        <w:jc w:val="center"/>
+        <w:rPr>
+          <w:rFonts w:ascii="Times New Roman" w:eastAsia="Times New Roman" w:hAnsi="Times New Roman" w:cs="Times New Roman"/>
+          <w:sz w:val="24"/>
+          <w:szCs w:val="24"/>
+        </w:rPr>
+      </w:pPr>
+      <w:r>
+        <w:rPr>
+          <w:rFonts w:ascii="Times New Roman" w:eastAsia="Times New Roman" w:hAnsi="Times New Roman" w:cs="Times New Roman"/>
+          <w:noProof/>
+          <w:sz w:val="24"/>
+          <w:szCs w:val="24"/>
+        </w:rPr>
+        <w:drawing>
+          <wp:inline distT="114300" distB="114300" distL="114300" distR="114300" wp14:anchorId="5634BC2D" wp14:editId="4023E277">
+            <wp:extent cx="5731200" cy="2812908"/>
+            <wp:effectExtent l="0" t="0" r="0" b="0"/>
+            <wp:docPr id="23" name="go_test_race.png"/>
+            <wp:cNvGraphicFramePr/>
+            <a:graphic xmlns:a="http://schemas.openxmlformats.org/drawingml/2006/main">
+              <a:graphicData uri="http://schemas.openxmlformats.org/drawingml/2006/picture">
+                <pic:pic xmlns:pic="http://schemas.openxmlformats.org/drawingml/2006/picture">
+                  <pic:nvPicPr>
+                    <pic:cNvPr id="0" name="go_test_race.png"/>
+                    <pic:cNvPicPr preferRelativeResize="0"/>
+                  </pic:nvPicPr>
+                  <pic:blipFill>
+                    <a:blip r:embed="rId33"/>
+                    <a:srcRect/>
+                    <a:stretch>
+                      <a:fillRect/>
+                    </a:stretch>
+                  </pic:blipFill>
+                  <pic:spPr>
+                    <a:xfrm>
+                      <a:off x="0" y="0"/>
+                      <a:ext cx="5731200" cy="2812908"/>
+                    </a:xfrm>
+                    <a:prstGeom prst="rect">
+                      <a:avLst/>
+                    </a:prstGeom>
+                    <a:ln/>
+                  </pic:spPr>
+                </pic:pic>
+              </a:graphicData>
+            </a:graphic>
+          </wp:inline>
+        </w:drawing>
       </w:r>
     </w:p>
     <w:p>
@@ -36338,7 +37302,7 @@
           <w:szCs w:val="24"/>
         </w:rPr>
       </w:pPr>
-      <w:bookmarkStart w:id="59" w:name="_Toc241968096"/>
+      <w:bookmarkStart w:id="59" w:name="_Toc242039004"/>
       <w:r>
         <w:rPr>
           <w:rFonts w:ascii="Times New Roman" w:eastAsia="Times New Roman" w:hAnsi="Times New Roman" w:cs="Times New Roman"/>
@@ -36366,7 +37330,7 @@
           <w:szCs w:val="24"/>
         </w:rPr>
       </w:pPr>
-      <w:bookmarkStart w:id="60" w:name="_Toc241968097"/>
+      <w:bookmarkStart w:id="60" w:name="_Toc242039005"/>
       <w:r>
         <w:rPr>
           <w:rFonts w:ascii="Times New Roman" w:eastAsia="Times New Roman" w:hAnsi="Times New Roman" w:cs="Times New Roman"/>
@@ -36554,7 +37518,7 @@
           <w:szCs w:val="24"/>
         </w:rPr>
       </w:pPr>
-      <w:bookmarkStart w:id="61" w:name="_Toc241968098"/>
+      <w:bookmarkStart w:id="61" w:name="_Toc242039006"/>
       <w:r>
         <w:rPr>
           <w:rFonts w:ascii="Times New Roman" w:eastAsia="Times New Roman" w:hAnsi="Times New Roman" w:cs="Times New Roman"/>
@@ -36742,7 +37706,7 @@
           <w:szCs w:val="24"/>
         </w:rPr>
       </w:pPr>
-      <w:bookmarkStart w:id="62" w:name="_Toc241968099"/>
+      <w:bookmarkStart w:id="62" w:name="_Toc242039007"/>
       <w:r>
         <w:rPr>
           <w:rFonts w:ascii="Times New Roman" w:eastAsia="Times New Roman" w:hAnsi="Times New Roman" w:cs="Times New Roman"/>
@@ -36751,6 +37715,7 @@
           <w:sz w:val="24"/>
           <w:szCs w:val="24"/>
         </w:rPr>
+        <w:lastRenderedPageBreak/>
         <w:t>16.3 Limitaciones</w:t>
       </w:r>
       <w:bookmarkEnd w:id="62"/>
@@ -36789,7 +37754,7 @@
           <w:szCs w:val="24"/>
         </w:rPr>
       </w:pPr>
-      <w:bookmarkStart w:id="63" w:name="_Toc241968100"/>
+      <w:bookmarkStart w:id="63" w:name="_Toc242039008"/>
       <w:r>
         <w:rPr>
           <w:rFonts w:ascii="Times New Roman" w:eastAsia="Times New Roman" w:hAnsi="Times New Roman" w:cs="Times New Roman"/>
@@ -36943,7 +37908,7 @@
           <w:szCs w:val="24"/>
         </w:rPr>
       </w:pPr>
-      <w:bookmarkStart w:id="64" w:name="_Toc241968101"/>
+      <w:bookmarkStart w:id="64" w:name="_Toc242039009"/>
       <w:r>
         <w:rPr>
           <w:rFonts w:ascii="Times New Roman" w:eastAsia="Times New Roman" w:hAnsi="Times New Roman" w:cs="Times New Roman"/>
@@ -36974,7 +37939,7 @@
         </w:rPr>
         <w:t xml:space="preserve">Hellkvist, M., Özçelikkale, A., &amp; Ahlén, A. (2021). Linear regression with distributed learning: A generalization error perspective. IEEE Transactions on Signal Processing, 69, 5479–5495. </w:t>
       </w:r>
-      <w:hyperlink r:id="rId26">
+      <w:hyperlink r:id="rId34">
         <w:r>
           <w:rPr>
             <w:rFonts w:ascii="Times New Roman" w:eastAsia="Times New Roman" w:hAnsi="Times New Roman" w:cs="Times New Roman"/>
@@ -37031,7 +37996,7 @@
         </w:rPr>
         <w:t xml:space="preserve">, 205–259. </w:t>
       </w:r>
-      <w:hyperlink r:id="rId27">
+      <w:hyperlink r:id="rId35">
         <w:r>
           <w:rPr>
             <w:rFonts w:ascii="Times New Roman" w:eastAsia="Times New Roman" w:hAnsi="Times New Roman" w:cs="Times New Roman"/>
@@ -37062,7 +38027,7 @@
         </w:rPr>
         <w:t xml:space="preserve">Bäckström, K., Walulya, I., Papatriantafilou, M., &amp; Tsigas, P. (2021). Consistent lock-free parallel stochastic gradient descent for fast and stable convergence. En 2021 IEEE International Parallel and Distributed Processing Symposium (IPDPS) (pp. 423–432). IEEE. </w:t>
       </w:r>
-      <w:hyperlink r:id="rId28">
+      <w:hyperlink r:id="rId36">
         <w:r>
           <w:rPr>
             <w:rFonts w:ascii="Times New Roman" w:eastAsia="Times New Roman" w:hAnsi="Times New Roman" w:cs="Times New Roman"/>
@@ -37101,7 +38066,7 @@
         </w:rPr>
         <w:t xml:space="preserve">Jain, R., Singh, M., Rao, A. R., &amp; Garg, R. (2024). Predicting hospital length of stay using machine learning on a large open health dataset. BMC Health Services Research, 24, 860. </w:t>
       </w:r>
-      <w:hyperlink r:id="rId29">
+      <w:hyperlink r:id="rId37">
         <w:r>
           <w:rPr>
             <w:rFonts w:ascii="Times New Roman" w:eastAsia="Times New Roman" w:hAnsi="Times New Roman" w:cs="Times New Roman"/>
@@ -37140,7 +38105,7 @@
         </w:rPr>
         <w:t xml:space="preserve">New York State Department of Health. (2024). Hospital inpatient discharges (SPARCS De-Identified): 2022 [Data set]. Health Data NY. </w:t>
       </w:r>
-      <w:hyperlink r:id="rId30">
+      <w:hyperlink r:id="rId38">
         <w:r>
           <w:rPr>
             <w:rFonts w:ascii="Times New Roman" w:eastAsia="Times New Roman" w:hAnsi="Times New Roman" w:cs="Times New Roman"/>

</xml_diff>

<commit_message>
docs(report): final TP report review and presentation deck
</commit_message>
<xml_diff>
--- a/Documentos/CC65-TP-202620-U201714492.docx
+++ b/Documentos/CC65-TP-202620-U201714492.docx
@@ -492,7 +492,7 @@
           <w:b/>
           <w:noProof/>
         </w:rPr>
-        <w:instrText xml:space="preserve"> PAGEREF _Toc242038945 \h </w:instrText>
+        <w:instrText xml:space="preserve"> PAGEREF _Toc242049353 \h </w:instrText>
       </w:r>
       <w:r>
         <w:rPr>
@@ -567,7 +567,7 @@
           <w:b/>
           <w:noProof/>
         </w:rPr>
-        <w:instrText xml:space="preserve"> PAGEREF _Toc242038946 \h </w:instrText>
+        <w:instrText xml:space="preserve"> PAGEREF _Toc242049354 \h </w:instrText>
       </w:r>
       <w:r>
         <w:rPr>
@@ -637,7 +637,7 @@
         <w:rPr>
           <w:noProof/>
         </w:rPr>
-        <w:instrText xml:space="preserve"> PAGEREF _Toc242038947 \h </w:instrText>
+        <w:instrText xml:space="preserve"> PAGEREF _Toc242049355 \h </w:instrText>
       </w:r>
       <w:r>
         <w:rPr>
@@ -703,7 +703,7 @@
         <w:rPr>
           <w:noProof/>
         </w:rPr>
-        <w:instrText xml:space="preserve"> PAGEREF _Toc242038948 \h </w:instrText>
+        <w:instrText xml:space="preserve"> PAGEREF _Toc242049356 \h </w:instrText>
       </w:r>
       <w:r>
         <w:rPr>
@@ -774,7 +774,7 @@
           <w:b/>
           <w:noProof/>
         </w:rPr>
-        <w:instrText xml:space="preserve"> PAGEREF _Toc242038949 \h </w:instrText>
+        <w:instrText xml:space="preserve"> PAGEREF _Toc242049357 \h </w:instrText>
       </w:r>
       <w:r>
         <w:rPr>
@@ -844,7 +844,7 @@
         <w:rPr>
           <w:noProof/>
         </w:rPr>
-        <w:instrText xml:space="preserve"> PAGEREF _Toc242038950 \h </w:instrText>
+        <w:instrText xml:space="preserve"> PAGEREF _Toc242049358 \h </w:instrText>
       </w:r>
       <w:r>
         <w:rPr>
@@ -910,7 +910,7 @@
         <w:rPr>
           <w:noProof/>
         </w:rPr>
-        <w:instrText xml:space="preserve"> PAGEREF _Toc242038951 \h </w:instrText>
+        <w:instrText xml:space="preserve"> PAGEREF _Toc242049359 \h </w:instrText>
       </w:r>
       <w:r>
         <w:rPr>
@@ -976,7 +976,7 @@
         <w:rPr>
           <w:noProof/>
         </w:rPr>
-        <w:instrText xml:space="preserve"> PAGEREF _Toc242038952 \h </w:instrText>
+        <w:instrText xml:space="preserve"> PAGEREF _Toc242049360 \h </w:instrText>
       </w:r>
       <w:r>
         <w:rPr>
@@ -1042,7 +1042,7 @@
         <w:rPr>
           <w:noProof/>
         </w:rPr>
-        <w:instrText xml:space="preserve"> PAGEREF _Toc242038953 \h </w:instrText>
+        <w:instrText xml:space="preserve"> PAGEREF _Toc242049361 \h </w:instrText>
       </w:r>
       <w:r>
         <w:rPr>
@@ -1108,7 +1108,7 @@
         <w:rPr>
           <w:noProof/>
         </w:rPr>
-        <w:instrText xml:space="preserve"> PAGEREF _Toc242038954 \h </w:instrText>
+        <w:instrText xml:space="preserve"> PAGEREF _Toc242049362 \h </w:instrText>
       </w:r>
       <w:r>
         <w:rPr>
@@ -1174,7 +1174,7 @@
         <w:rPr>
           <w:noProof/>
         </w:rPr>
-        <w:instrText xml:space="preserve"> PAGEREF _Toc242038955 \h </w:instrText>
+        <w:instrText xml:space="preserve"> PAGEREF _Toc242049363 \h </w:instrText>
       </w:r>
       <w:r>
         <w:rPr>
@@ -1240,7 +1240,7 @@
         <w:rPr>
           <w:noProof/>
         </w:rPr>
-        <w:instrText xml:space="preserve"> PAGEREF _Toc242038956 \h </w:instrText>
+        <w:instrText xml:space="preserve"> PAGEREF _Toc242049364 \h </w:instrText>
       </w:r>
       <w:r>
         <w:rPr>
@@ -1306,7 +1306,7 @@
         <w:rPr>
           <w:noProof/>
         </w:rPr>
-        <w:instrText xml:space="preserve"> PAGEREF _Toc242038957 \h </w:instrText>
+        <w:instrText xml:space="preserve"> PAGEREF _Toc242049365 \h </w:instrText>
       </w:r>
       <w:r>
         <w:rPr>
@@ -1377,7 +1377,7 @@
           <w:b/>
           <w:noProof/>
         </w:rPr>
-        <w:instrText xml:space="preserve"> PAGEREF _Toc242038958 \h </w:instrText>
+        <w:instrText xml:space="preserve"> PAGEREF _Toc242049366 \h </w:instrText>
       </w:r>
       <w:r>
         <w:rPr>
@@ -1397,7 +1397,7 @@
           <w:b/>
           <w:noProof/>
         </w:rPr>
-        <w:t>13</w:t>
+        <w:t>14</w:t>
       </w:r>
       <w:r>
         <w:rPr>
@@ -1447,7 +1447,7 @@
         <w:rPr>
           <w:noProof/>
         </w:rPr>
-        <w:instrText xml:space="preserve"> PAGEREF _Toc242038959 \h </w:instrText>
+        <w:instrText xml:space="preserve"> PAGEREF _Toc242049367 \h </w:instrText>
       </w:r>
       <w:r>
         <w:rPr>
@@ -1464,7 +1464,7 @@
         <w:rPr>
           <w:noProof/>
         </w:rPr>
-        <w:t>13</w:t>
+        <w:t>14</w:t>
       </w:r>
       <w:r>
         <w:rPr>
@@ -1513,7 +1513,7 @@
         <w:rPr>
           <w:noProof/>
         </w:rPr>
-        <w:instrText xml:space="preserve"> PAGEREF _Toc242038960 \h </w:instrText>
+        <w:instrText xml:space="preserve"> PAGEREF _Toc242049368 \h </w:instrText>
       </w:r>
       <w:r>
         <w:rPr>
@@ -1584,7 +1584,7 @@
           <w:b/>
           <w:noProof/>
         </w:rPr>
-        <w:instrText xml:space="preserve"> PAGEREF _Toc242038961 \h </w:instrText>
+        <w:instrText xml:space="preserve"> PAGEREF _Toc242049369 \h </w:instrText>
       </w:r>
       <w:r>
         <w:rPr>
@@ -1654,7 +1654,7 @@
         <w:rPr>
           <w:noProof/>
         </w:rPr>
-        <w:instrText xml:space="preserve"> PAGEREF _Toc242038962 \h </w:instrText>
+        <w:instrText xml:space="preserve"> PAGEREF _Toc242049370 \h </w:instrText>
       </w:r>
       <w:r>
         <w:rPr>
@@ -1720,7 +1720,7 @@
         <w:rPr>
           <w:noProof/>
         </w:rPr>
-        <w:instrText xml:space="preserve"> PAGEREF _Toc242038963 \h </w:instrText>
+        <w:instrText xml:space="preserve"> PAGEREF _Toc242049371 \h </w:instrText>
       </w:r>
       <w:r>
         <w:rPr>
@@ -1791,7 +1791,7 @@
           <w:b/>
           <w:noProof/>
         </w:rPr>
-        <w:instrText xml:space="preserve"> PAGEREF _Toc242038964 \h </w:instrText>
+        <w:instrText xml:space="preserve"> PAGEREF _Toc242049372 \h </w:instrText>
       </w:r>
       <w:r>
         <w:rPr>
@@ -1860,7 +1860,7 @@
         <w:rPr>
           <w:noProof/>
         </w:rPr>
-        <w:instrText xml:space="preserve"> PAGEREF _Toc242038965 \h </w:instrText>
+        <w:instrText xml:space="preserve"> PAGEREF _Toc242049373 \h </w:instrText>
       </w:r>
       <w:r>
         <w:rPr>
@@ -1925,7 +1925,7 @@
         <w:rPr>
           <w:noProof/>
         </w:rPr>
-        <w:instrText xml:space="preserve"> PAGEREF _Toc242038966 \h </w:instrText>
+        <w:instrText xml:space="preserve"> PAGEREF _Toc242049374 \h </w:instrText>
       </w:r>
       <w:r>
         <w:rPr>
@@ -1942,7 +1942,7 @@
         <w:rPr>
           <w:noProof/>
         </w:rPr>
-        <w:t>18</w:t>
+        <w:t>19</w:t>
       </w:r>
       <w:r>
         <w:rPr>
@@ -1990,7 +1990,7 @@
         <w:rPr>
           <w:noProof/>
         </w:rPr>
-        <w:instrText xml:space="preserve"> PAGEREF _Toc242038967 \h </w:instrText>
+        <w:instrText xml:space="preserve"> PAGEREF _Toc242049375 \h </w:instrText>
       </w:r>
       <w:r>
         <w:rPr>
@@ -2055,7 +2055,7 @@
         <w:rPr>
           <w:noProof/>
         </w:rPr>
-        <w:instrText xml:space="preserve"> PAGEREF _Toc242038968 \h </w:instrText>
+        <w:instrText xml:space="preserve"> PAGEREF _Toc242049376 \h </w:instrText>
       </w:r>
       <w:r>
         <w:rPr>
@@ -2126,7 +2126,7 @@
           <w:b/>
           <w:noProof/>
         </w:rPr>
-        <w:instrText xml:space="preserve"> PAGEREF _Toc242038969 \h </w:instrText>
+        <w:instrText xml:space="preserve"> PAGEREF _Toc242049377 \h </w:instrText>
       </w:r>
       <w:r>
         <w:rPr>
@@ -2195,7 +2195,7 @@
         <w:rPr>
           <w:noProof/>
         </w:rPr>
-        <w:instrText xml:space="preserve"> PAGEREF _Toc242038970 \h </w:instrText>
+        <w:instrText xml:space="preserve"> PAGEREF _Toc242049378 \h </w:instrText>
       </w:r>
       <w:r>
         <w:rPr>
@@ -2260,7 +2260,7 @@
         <w:rPr>
           <w:noProof/>
         </w:rPr>
-        <w:instrText xml:space="preserve"> PAGEREF _Toc242038971 \h </w:instrText>
+        <w:instrText xml:space="preserve"> PAGEREF _Toc242049379 \h </w:instrText>
       </w:r>
       <w:r>
         <w:rPr>
@@ -2325,7 +2325,7 @@
         <w:rPr>
           <w:noProof/>
         </w:rPr>
-        <w:instrText xml:space="preserve"> PAGEREF _Toc242038972 \h </w:instrText>
+        <w:instrText xml:space="preserve"> PAGEREF _Toc242049380 \h </w:instrText>
       </w:r>
       <w:r>
         <w:rPr>
@@ -2390,7 +2390,7 @@
         <w:rPr>
           <w:noProof/>
         </w:rPr>
-        <w:instrText xml:space="preserve"> PAGEREF _Toc242038973 \h </w:instrText>
+        <w:instrText xml:space="preserve"> PAGEREF _Toc242049381 \h </w:instrText>
       </w:r>
       <w:r>
         <w:rPr>
@@ -2455,7 +2455,7 @@
         <w:rPr>
           <w:noProof/>
         </w:rPr>
-        <w:instrText xml:space="preserve"> PAGEREF _Toc242038974 \h </w:instrText>
+        <w:instrText xml:space="preserve"> PAGEREF _Toc242049382 \h </w:instrText>
       </w:r>
       <w:r>
         <w:rPr>
@@ -2526,7 +2526,7 @@
           <w:b/>
           <w:noProof/>
         </w:rPr>
-        <w:instrText xml:space="preserve"> PAGEREF _Toc242038975 \h </w:instrText>
+        <w:instrText xml:space="preserve"> PAGEREF _Toc242049383 \h </w:instrText>
       </w:r>
       <w:r>
         <w:rPr>
@@ -2595,7 +2595,7 @@
         <w:rPr>
           <w:noProof/>
         </w:rPr>
-        <w:instrText xml:space="preserve"> PAGEREF _Toc242038976 \h </w:instrText>
+        <w:instrText xml:space="preserve"> PAGEREF _Toc242049384 \h </w:instrText>
       </w:r>
       <w:r>
         <w:rPr>
@@ -2660,7 +2660,7 @@
         <w:rPr>
           <w:noProof/>
         </w:rPr>
-        <w:instrText xml:space="preserve"> PAGEREF _Toc242038977 \h </w:instrText>
+        <w:instrText xml:space="preserve"> PAGEREF _Toc242049385 \h </w:instrText>
       </w:r>
       <w:r>
         <w:rPr>
@@ -2725,7 +2725,7 @@
         <w:rPr>
           <w:noProof/>
         </w:rPr>
-        <w:instrText xml:space="preserve"> PAGEREF _Toc242038978 \h </w:instrText>
+        <w:instrText xml:space="preserve"> PAGEREF _Toc242049386 \h </w:instrText>
       </w:r>
       <w:r>
         <w:rPr>
@@ -2772,7 +2772,6 @@
           <w:rFonts w:ascii="Times New Roman" w:eastAsia="Times New Roman" w:hAnsi="Times New Roman" w:cs="Times New Roman"/>
           <w:noProof/>
         </w:rPr>
-        <w:lastRenderedPageBreak/>
         <w:t>8.4 Cálculo de media recortada</w:t>
       </w:r>
       <w:r>
@@ -2791,7 +2790,7 @@
         <w:rPr>
           <w:noProof/>
         </w:rPr>
-        <w:instrText xml:space="preserve"> PAGEREF _Toc242038979 \h </w:instrText>
+        <w:instrText xml:space="preserve"> PAGEREF _Toc242049387 \h </w:instrText>
       </w:r>
       <w:r>
         <w:rPr>
@@ -2862,7 +2861,7 @@
           <w:b/>
           <w:noProof/>
         </w:rPr>
-        <w:instrText xml:space="preserve"> PAGEREF _Toc242038980 \h </w:instrText>
+        <w:instrText xml:space="preserve"> PAGEREF _Toc242049388 \h </w:instrText>
       </w:r>
       <w:r>
         <w:rPr>
@@ -2931,7 +2930,7 @@
         <w:rPr>
           <w:noProof/>
         </w:rPr>
-        <w:instrText xml:space="preserve"> PAGEREF _Toc242038981 \h </w:instrText>
+        <w:instrText xml:space="preserve"> PAGEREF _Toc242049389 \h </w:instrText>
       </w:r>
       <w:r>
         <w:rPr>
@@ -2996,7 +2995,7 @@
         <w:rPr>
           <w:noProof/>
         </w:rPr>
-        <w:instrText xml:space="preserve"> PAGEREF _Toc242038982 \h </w:instrText>
+        <w:instrText xml:space="preserve"> PAGEREF _Toc242049390 \h </w:instrText>
       </w:r>
       <w:r>
         <w:rPr>
@@ -3061,7 +3060,7 @@
         <w:rPr>
           <w:noProof/>
         </w:rPr>
-        <w:instrText xml:space="preserve"> PAGEREF _Toc242038983 \h </w:instrText>
+        <w:instrText xml:space="preserve"> PAGEREF _Toc242049391 \h </w:instrText>
       </w:r>
       <w:r>
         <w:rPr>
@@ -3126,7 +3125,7 @@
         <w:rPr>
           <w:noProof/>
         </w:rPr>
-        <w:instrText xml:space="preserve"> PAGEREF _Toc242038984 \h </w:instrText>
+        <w:instrText xml:space="preserve"> PAGEREF _Toc242049392 \h </w:instrText>
       </w:r>
       <w:r>
         <w:rPr>
@@ -3197,7 +3196,7 @@
           <w:b/>
           <w:noProof/>
         </w:rPr>
-        <w:instrText xml:space="preserve"> PAGEREF _Toc242038985 \h </w:instrText>
+        <w:instrText xml:space="preserve"> PAGEREF _Toc242049393 \h </w:instrText>
       </w:r>
       <w:r>
         <w:rPr>
@@ -3266,7 +3265,7 @@
         <w:rPr>
           <w:noProof/>
         </w:rPr>
-        <w:instrText xml:space="preserve"> PAGEREF _Toc242038986 \h </w:instrText>
+        <w:instrText xml:space="preserve"> PAGEREF _Toc242049394 \h </w:instrText>
       </w:r>
       <w:r>
         <w:rPr>
@@ -3331,7 +3330,7 @@
         <w:rPr>
           <w:noProof/>
         </w:rPr>
-        <w:instrText xml:space="preserve"> PAGEREF _Toc242038987 \h </w:instrText>
+        <w:instrText xml:space="preserve"> PAGEREF _Toc242049395 \h </w:instrText>
       </w:r>
       <w:r>
         <w:rPr>
@@ -3396,7 +3395,7 @@
         <w:rPr>
           <w:noProof/>
         </w:rPr>
-        <w:instrText xml:space="preserve"> PAGEREF _Toc242038988 \h </w:instrText>
+        <w:instrText xml:space="preserve"> PAGEREF _Toc242049396 \h </w:instrText>
       </w:r>
       <w:r>
         <w:rPr>
@@ -3462,7 +3461,7 @@
         <w:rPr>
           <w:noProof/>
         </w:rPr>
-        <w:instrText xml:space="preserve"> PAGEREF _Toc242038989 \h </w:instrText>
+        <w:instrText xml:space="preserve"> PAGEREF _Toc242049397 \h </w:instrText>
       </w:r>
       <w:r>
         <w:rPr>
@@ -3533,7 +3532,7 @@
           <w:b/>
           <w:noProof/>
         </w:rPr>
-        <w:instrText xml:space="preserve"> PAGEREF _Toc242038990 \h </w:instrText>
+        <w:instrText xml:space="preserve"> PAGEREF _Toc242049398 \h </w:instrText>
       </w:r>
       <w:r>
         <w:rPr>
@@ -3602,7 +3601,7 @@
         <w:rPr>
           <w:noProof/>
         </w:rPr>
-        <w:instrText xml:space="preserve"> PAGEREF _Toc242038991 \h </w:instrText>
+        <w:instrText xml:space="preserve"> PAGEREF _Toc242049399 \h </w:instrText>
       </w:r>
       <w:r>
         <w:rPr>
@@ -3667,7 +3666,7 @@
         <w:rPr>
           <w:noProof/>
         </w:rPr>
-        <w:instrText xml:space="preserve"> PAGEREF _Toc242038992 \h </w:instrText>
+        <w:instrText xml:space="preserve"> PAGEREF _Toc242049400 \h </w:instrText>
       </w:r>
       <w:r>
         <w:rPr>
@@ -3732,7 +3731,7 @@
         <w:rPr>
           <w:noProof/>
         </w:rPr>
-        <w:instrText xml:space="preserve"> PAGEREF _Toc242038993 \h </w:instrText>
+        <w:instrText xml:space="preserve"> PAGEREF _Toc242049401 \h </w:instrText>
       </w:r>
       <w:r>
         <w:rPr>
@@ -3803,7 +3802,7 @@
           <w:b/>
           <w:noProof/>
         </w:rPr>
-        <w:instrText xml:space="preserve"> PAGEREF _Toc242038994 \h </w:instrText>
+        <w:instrText xml:space="preserve"> PAGEREF _Toc242049402 \h </w:instrText>
       </w:r>
       <w:r>
         <w:rPr>
@@ -3878,7 +3877,7 @@
           <w:b/>
           <w:noProof/>
         </w:rPr>
-        <w:instrText xml:space="preserve"> PAGEREF _Toc242038995 \h </w:instrText>
+        <w:instrText xml:space="preserve"> PAGEREF _Toc242049403 \h </w:instrText>
       </w:r>
       <w:r>
         <w:rPr>
@@ -3953,7 +3952,7 @@
           <w:b/>
           <w:noProof/>
         </w:rPr>
-        <w:instrText xml:space="preserve"> PAGEREF _Toc242038996 \h </w:instrText>
+        <w:instrText xml:space="preserve"> PAGEREF _Toc242049404 \h </w:instrText>
       </w:r>
       <w:r>
         <w:rPr>
@@ -4023,7 +4022,7 @@
         <w:rPr>
           <w:noProof/>
         </w:rPr>
-        <w:instrText xml:space="preserve"> PAGEREF _Toc242038997 \h </w:instrText>
+        <w:instrText xml:space="preserve"> PAGEREF _Toc242049405 \h </w:instrText>
       </w:r>
       <w:r>
         <w:rPr>
@@ -4089,7 +4088,7 @@
         <w:rPr>
           <w:noProof/>
         </w:rPr>
-        <w:instrText xml:space="preserve"> PAGEREF _Toc242038998 \h </w:instrText>
+        <w:instrText xml:space="preserve"> PAGEREF _Toc242049406 \h </w:instrText>
       </w:r>
       <w:r>
         <w:rPr>
@@ -4155,7 +4154,7 @@
         <w:rPr>
           <w:noProof/>
         </w:rPr>
-        <w:instrText xml:space="preserve"> PAGEREF _Toc242038999 \h </w:instrText>
+        <w:instrText xml:space="preserve"> PAGEREF _Toc242049407 \h </w:instrText>
       </w:r>
       <w:r>
         <w:rPr>
@@ -4226,7 +4225,7 @@
           <w:b/>
           <w:noProof/>
         </w:rPr>
-        <w:instrText xml:space="preserve"> PAGEREF _Toc242039000 \h </w:instrText>
+        <w:instrText xml:space="preserve"> PAGEREF _Toc242049408 \h </w:instrText>
       </w:r>
       <w:r>
         <w:rPr>
@@ -4296,7 +4295,7 @@
         <w:rPr>
           <w:noProof/>
         </w:rPr>
-        <w:instrText xml:space="preserve"> PAGEREF _Toc242039001 \h </w:instrText>
+        <w:instrText xml:space="preserve"> PAGEREF _Toc242049409 \h </w:instrText>
       </w:r>
       <w:r>
         <w:rPr>
@@ -4362,7 +4361,7 @@
         <w:rPr>
           <w:noProof/>
         </w:rPr>
-        <w:instrText xml:space="preserve"> PAGEREF _Toc242039002 \h </w:instrText>
+        <w:instrText xml:space="preserve"> PAGEREF _Toc242049410 \h </w:instrText>
       </w:r>
       <w:r>
         <w:rPr>
@@ -4428,7 +4427,7 @@
         <w:rPr>
           <w:noProof/>
         </w:rPr>
-        <w:instrText xml:space="preserve"> PAGEREF _Toc242039003 \h </w:instrText>
+        <w:instrText xml:space="preserve"> PAGEREF _Toc242049411 \h </w:instrText>
       </w:r>
       <w:r>
         <w:rPr>
@@ -4499,7 +4498,7 @@
           <w:b/>
           <w:noProof/>
         </w:rPr>
-        <w:instrText xml:space="preserve"> PAGEREF _Toc242039004 \h </w:instrText>
+        <w:instrText xml:space="preserve"> PAGEREF _Toc242049412 \h </w:instrText>
       </w:r>
       <w:r>
         <w:rPr>
@@ -4569,7 +4568,7 @@
         <w:rPr>
           <w:noProof/>
         </w:rPr>
-        <w:instrText xml:space="preserve"> PAGEREF _Toc242039005 \h </w:instrText>
+        <w:instrText xml:space="preserve"> PAGEREF _Toc242049413 \h </w:instrText>
       </w:r>
       <w:r>
         <w:rPr>
@@ -4635,7 +4634,7 @@
         <w:rPr>
           <w:noProof/>
         </w:rPr>
-        <w:instrText xml:space="preserve"> PAGEREF _Toc242039006 \h </w:instrText>
+        <w:instrText xml:space="preserve"> PAGEREF _Toc242049414 \h </w:instrText>
       </w:r>
       <w:r>
         <w:rPr>
@@ -4701,7 +4700,7 @@
         <w:rPr>
           <w:noProof/>
         </w:rPr>
-        <w:instrText xml:space="preserve"> PAGEREF _Toc242039007 \h </w:instrText>
+        <w:instrText xml:space="preserve"> PAGEREF _Toc242049415 \h </w:instrText>
       </w:r>
       <w:r>
         <w:rPr>
@@ -4772,7 +4771,7 @@
           <w:b/>
           <w:noProof/>
         </w:rPr>
-        <w:instrText xml:space="preserve"> PAGEREF _Toc242039008 \h </w:instrText>
+        <w:instrText xml:space="preserve"> PAGEREF _Toc242049416 \h </w:instrText>
       </w:r>
       <w:r>
         <w:rPr>
@@ -4847,7 +4846,7 @@
           <w:b/>
           <w:noProof/>
         </w:rPr>
-        <w:instrText xml:space="preserve"> PAGEREF _Toc242039009 \h </w:instrText>
+        <w:instrText xml:space="preserve"> PAGEREF _Toc242049417 \h </w:instrText>
       </w:r>
       <w:r>
         <w:rPr>
@@ -5190,7 +5189,6 @@
     <w:p>
       <w:pPr>
         <w:pStyle w:val="Ttulo1"/>
-        <w:keepNext w:val="0"/>
         <w:keepLines w:val="0"/>
         <w:spacing w:before="480"/>
         <w:jc w:val="both"/>
@@ -5202,7 +5200,7 @@
           <w:szCs w:val="24"/>
         </w:rPr>
       </w:pPr>
-      <w:bookmarkStart w:id="0" w:name="_Toc242038945"/>
+      <w:bookmarkStart w:id="0" w:name="_Toc242049353"/>
       <w:r>
         <w:rPr>
           <w:rFonts w:ascii="Times New Roman" w:eastAsia="Times New Roman" w:hAnsi="Times New Roman" w:cs="Times New Roman"/>
@@ -5231,7 +5229,7 @@
           <w:sz w:val="24"/>
           <w:szCs w:val="24"/>
         </w:rPr>
-        <w:t>El presente trabajo desarrolla una solución de Regresión Lineal aplicada al dataset Hospital Inpatient Discharges (SPARCS De-Identified): 2022, con el objetivo de comparar el rendimiento de una implementación secuencial y una implementación concurrente en Go. A partir del dataset limpio obtenido en la PC1, compuesto por 2,103,432 registros válidos, se realizó el preprocesamiento de las variables, obteniendo 49 características numéricas y una partición reproducible de 79.99% para entrenamiento y 20.01% para prueba. El modelo fue entrenado mediante Batch Gradient Descent utilizando 100 épocas y una tasa de aprendizaje de 0.01.</w:t>
+        <w:t>El presente trabajo desarrolla una solución de Regresión Lineal aplicada al dataset Hospital Inpatient Discharges (SPARCS De-Identified): 2022, con el objetivo de comparar el rendimiento de una implementación secuencial y una implementación concurrente en Go. A partir del dataset limpio obtenido en la PC1, compuesto por 2,103,432 registros válidos, se realizó el preprocesamiento de las variables, obteniendo 49 características numéricas y una partición reproducible de 79.99 % para entrenamiento y 20.01% para prueba. El modelo fue entrenado mediante Batch Gradient Descent utilizando 100 épocas y una tasa de aprendizaje de 0.01.</w:t>
       </w:r>
     </w:p>
     <w:p>
@@ -5330,7 +5328,6 @@
     <w:p>
       <w:pPr>
         <w:pStyle w:val="Ttulo1"/>
-        <w:keepNext w:val="0"/>
         <w:keepLines w:val="0"/>
         <w:spacing w:before="480"/>
         <w:jc w:val="both"/>
@@ -5342,7 +5339,7 @@
           <w:szCs w:val="24"/>
         </w:rPr>
       </w:pPr>
-      <w:bookmarkStart w:id="1" w:name="_Toc242038946"/>
+      <w:bookmarkStart w:id="1" w:name="_Toc242049354"/>
       <w:r>
         <w:rPr>
           <w:rFonts w:ascii="Times New Roman" w:eastAsia="Times New Roman" w:hAnsi="Times New Roman" w:cs="Times New Roman"/>
@@ -5358,7 +5355,6 @@
     <w:p>
       <w:pPr>
         <w:pStyle w:val="Ttulo2"/>
-        <w:keepNext w:val="0"/>
         <w:keepLines w:val="0"/>
         <w:spacing w:after="80"/>
         <w:jc w:val="both"/>
@@ -5370,7 +5366,7 @@
           <w:szCs w:val="24"/>
         </w:rPr>
       </w:pPr>
-      <w:bookmarkStart w:id="2" w:name="_Toc242038947"/>
+      <w:bookmarkStart w:id="2" w:name="_Toc242049355"/>
       <w:r>
         <w:rPr>
           <w:rFonts w:ascii="Times New Roman" w:eastAsia="Times New Roman" w:hAnsi="Times New Roman" w:cs="Times New Roman"/>
@@ -5405,7 +5401,6 @@
     <w:p>
       <w:pPr>
         <w:pStyle w:val="Ttulo2"/>
-        <w:keepNext w:val="0"/>
         <w:keepLines w:val="0"/>
         <w:spacing w:after="80"/>
         <w:jc w:val="both"/>
@@ -5417,7 +5412,7 @@
           <w:szCs w:val="24"/>
         </w:rPr>
       </w:pPr>
-      <w:bookmarkStart w:id="3" w:name="_Toc242038948"/>
+      <w:bookmarkStart w:id="3" w:name="_Toc242049356"/>
       <w:r>
         <w:rPr>
           <w:rFonts w:ascii="Times New Roman" w:eastAsia="Times New Roman" w:hAnsi="Times New Roman" w:cs="Times New Roman"/>
@@ -5567,7 +5562,6 @@
     <w:p>
       <w:pPr>
         <w:pStyle w:val="Ttulo1"/>
-        <w:keepNext w:val="0"/>
         <w:keepLines w:val="0"/>
         <w:spacing w:before="480"/>
         <w:jc w:val="both"/>
@@ -5579,7 +5573,7 @@
           <w:szCs w:val="24"/>
         </w:rPr>
       </w:pPr>
-      <w:bookmarkStart w:id="4" w:name="_Toc242038949"/>
+      <w:bookmarkStart w:id="4" w:name="_Toc242049357"/>
       <w:r>
         <w:rPr>
           <w:rFonts w:ascii="Times New Roman" w:eastAsia="Times New Roman" w:hAnsi="Times New Roman" w:cs="Times New Roman"/>
@@ -5614,7 +5608,6 @@
     <w:p>
       <w:pPr>
         <w:pStyle w:val="Ttulo2"/>
-        <w:keepNext w:val="0"/>
         <w:keepLines w:val="0"/>
         <w:spacing w:after="80"/>
         <w:jc w:val="both"/>
@@ -5626,7 +5619,7 @@
           <w:szCs w:val="24"/>
         </w:rPr>
       </w:pPr>
-      <w:bookmarkStart w:id="5" w:name="_Toc242038950"/>
+      <w:bookmarkStart w:id="5" w:name="_Toc242049358"/>
       <w:r>
         <w:rPr>
           <w:rFonts w:ascii="Times New Roman" w:eastAsia="Times New Roman" w:hAnsi="Times New Roman" w:cs="Times New Roman"/>
@@ -5661,7 +5654,6 @@
     <w:p>
       <w:pPr>
         <w:pStyle w:val="Ttulo2"/>
-        <w:keepNext w:val="0"/>
         <w:keepLines w:val="0"/>
         <w:spacing w:after="80"/>
         <w:jc w:val="both"/>
@@ -5673,7 +5665,7 @@
           <w:szCs w:val="24"/>
         </w:rPr>
       </w:pPr>
-      <w:bookmarkStart w:id="6" w:name="_Toc242038951"/>
+      <w:bookmarkStart w:id="6" w:name="_Toc242049359"/>
       <w:r>
         <w:rPr>
           <w:rFonts w:ascii="Times New Roman" w:eastAsia="Times New Roman" w:hAnsi="Times New Roman" w:cs="Times New Roman"/>
@@ -5727,7 +5719,6 @@
     <w:p>
       <w:pPr>
         <w:pStyle w:val="Ttulo2"/>
-        <w:keepNext w:val="0"/>
         <w:keepLines w:val="0"/>
         <w:spacing w:after="80"/>
         <w:jc w:val="both"/>
@@ -5739,7 +5730,7 @@
           <w:szCs w:val="24"/>
         </w:rPr>
       </w:pPr>
-      <w:bookmarkStart w:id="7" w:name="_Toc242038952"/>
+      <w:bookmarkStart w:id="7" w:name="_Toc242049360"/>
       <w:r>
         <w:rPr>
           <w:rFonts w:ascii="Times New Roman" w:eastAsia="Times New Roman" w:hAnsi="Times New Roman" w:cs="Times New Roman"/>
@@ -5939,15 +5930,7 @@
           <w:sz w:val="24"/>
           <w:szCs w:val="24"/>
         </w:rPr>
-        <w:t xml:space="preserve">Integrante 2: </w:t>
-      </w:r>
-      <w:r>
-        <w:rPr>
-          <w:rFonts w:ascii="Times New Roman" w:eastAsia="Times New Roman" w:hAnsi="Times New Roman" w:cs="Times New Roman"/>
-          <w:sz w:val="24"/>
-          <w:szCs w:val="24"/>
-        </w:rPr>
-        <w:t>Lucero Salome Manchay Paredes:</w:t>
+        <w:t>Integrante 2: Lucero Salome Manchay Paredes</w:t>
       </w:r>
     </w:p>
     <w:p>
@@ -6033,15 +6016,7 @@
           <w:sz w:val="24"/>
           <w:szCs w:val="24"/>
         </w:rPr>
-        <w:t>Integrante 3:</w:t>
-      </w:r>
-      <w:r>
-        <w:rPr>
-          <w:rFonts w:ascii="Times New Roman" w:eastAsia="Times New Roman" w:hAnsi="Times New Roman" w:cs="Times New Roman"/>
-          <w:sz w:val="24"/>
-          <w:szCs w:val="24"/>
-        </w:rPr>
-        <w:t xml:space="preserve"> Jhamil Brijan Peña Cardenas,</w:t>
+        <w:t>Integrante 3: Jhamil Brijan Peña Cardenas</w:t>
       </w:r>
     </w:p>
     <w:p>
@@ -6114,7 +6089,6 @@
     <w:p>
       <w:pPr>
         <w:pStyle w:val="Ttulo2"/>
-        <w:keepNext w:val="0"/>
         <w:keepLines w:val="0"/>
         <w:spacing w:after="80"/>
         <w:jc w:val="both"/>
@@ -6126,7 +6100,7 @@
           <w:szCs w:val="24"/>
         </w:rPr>
       </w:pPr>
-      <w:bookmarkStart w:id="8" w:name="_Toc242038953"/>
+      <w:bookmarkStart w:id="8" w:name="_Toc242049361"/>
       <w:r>
         <w:rPr>
           <w:rFonts w:ascii="Times New Roman" w:eastAsia="Times New Roman" w:hAnsi="Times New Roman" w:cs="Times New Roman"/>
@@ -6161,7 +6135,6 @@
     <w:p>
       <w:pPr>
         <w:pStyle w:val="Ttulo2"/>
-        <w:keepNext w:val="0"/>
         <w:keepLines w:val="0"/>
         <w:spacing w:after="80"/>
         <w:jc w:val="both"/>
@@ -6173,7 +6146,7 @@
           <w:szCs w:val="24"/>
         </w:rPr>
       </w:pPr>
-      <w:bookmarkStart w:id="9" w:name="_Toc242038954"/>
+      <w:bookmarkStart w:id="9" w:name="_Toc242049362"/>
       <w:r>
         <w:rPr>
           <w:rFonts w:ascii="Times New Roman" w:eastAsia="Times New Roman" w:hAnsi="Times New Roman" w:cs="Times New Roman"/>
@@ -7070,7 +7043,7 @@
                 <w:sz w:val="24"/>
                 <w:szCs w:val="24"/>
               </w:rPr>
-              <w:t xml:space="preserve">DOI: </w:t>
+              <w:t>IEEE Xplore: https://ieeexplore</w:t>
             </w:r>
             <w:hyperlink r:id="rId6">
               <w:r>
@@ -7081,7 +7054,7 @@
                   <w:szCs w:val="24"/>
                   <w:u w:val="single"/>
                 </w:rPr>
-                <w:t>https://ieeexplore.ieee.org/document/9520293</w:t>
+                <w:t>.ieee.org/document/9520293</w:t>
               </w:r>
             </w:hyperlink>
             <w:r>
@@ -7138,7 +7111,6 @@
     <w:p>
       <w:pPr>
         <w:pStyle w:val="Ttulo2"/>
-        <w:keepNext w:val="0"/>
         <w:keepLines w:val="0"/>
         <w:spacing w:after="80"/>
         <w:jc w:val="both"/>
@@ -7150,7 +7122,7 @@
           <w:szCs w:val="24"/>
         </w:rPr>
       </w:pPr>
-      <w:bookmarkStart w:id="10" w:name="_Toc242038955"/>
+      <w:bookmarkStart w:id="10" w:name="_Toc242049363"/>
       <w:r>
         <w:rPr>
           <w:rFonts w:ascii="Times New Roman" w:eastAsia="Times New Roman" w:hAnsi="Times New Roman" w:cs="Times New Roman"/>
@@ -8070,7 +8042,6 @@
     <w:p>
       <w:pPr>
         <w:pStyle w:val="Ttulo2"/>
-        <w:keepNext w:val="0"/>
         <w:keepLines w:val="0"/>
         <w:spacing w:after="80"/>
         <w:jc w:val="both"/>
@@ -8082,7 +8053,7 @@
           <w:szCs w:val="24"/>
         </w:rPr>
       </w:pPr>
-      <w:bookmarkStart w:id="11" w:name="_Toc242038956"/>
+      <w:bookmarkStart w:id="11" w:name="_Toc242049364"/>
       <w:r>
         <w:rPr>
           <w:rFonts w:ascii="Times New Roman" w:eastAsia="Times New Roman" w:hAnsi="Times New Roman" w:cs="Times New Roman"/>
@@ -8504,7 +8475,7 @@
                 <w:sz w:val="24"/>
                 <w:szCs w:val="24"/>
               </w:rPr>
-              <w:t xml:space="preserve">El Descenso de Gradiente Estocástico (SGD) es el motor de optimización de numerosos algoritmos de Machine Learning, incluida la Regresión Lineal. Los autores observan que, si bien existen variantes asíncronas de SGD sobre memoria compartida (AsyncSGD y HOGWILD!) que reducen el costo de coordinación frente a la parallelización síncrona, la literatura no explica con claridad en qué situaciones prácticas resultan realmente útiles ni qué papel cumplen los mecanismos de sincronización y de consistencia. Señalan además que muchos trabajos previos miden la convergencia en número de iteraciones (eficiencia estadística) y no en tiempo real de reloj, lo que puede llevar a conclusiones engañosas sobre el beneficio verdadero de la concurrencia. </w:t>
+              <w:t xml:space="preserve">El Descenso de Gradiente Estocástico (SGD) es el motor de optimización de numerosos algoritmos de Machine Learning, incluida la Regresión Lineal. Los autores observan que, si bien existen variantes asíncronas de SGD sobre memoria compartida (AsyncSGD y HOGWILD!) que reducen el costo de coordinación frente a la paralelización síncrona, la literatura no explica con claridad en qué situaciones prácticas resultan realmente útiles ni qué papel cumplen los mecanismos de sincronización y de consistencia. Señalan además que muchos trabajos previos miden la convergencia en número de iteraciones (eficiencia estadística) y no en tiempo real de reloj, lo que puede llevar a conclusiones engañosas sobre el beneficio verdadero de la concurrencia. </w:t>
             </w:r>
           </w:p>
         </w:tc>
@@ -8885,7 +8856,7 @@
                 <w:sz w:val="24"/>
                 <w:szCs w:val="24"/>
               </w:rPr>
-              <w:t xml:space="preserve">Considero que este artículo aporta la lección más directamente aplicable a nuestro trabajo: la concurrencia no mejora el rendimiento por sí sola, sino que su beneficio depende críticamente del mecanismo de sincronización elegido. Los autores muestran que la alternativa aparentemente más rápida, eliminar toda sincronización, como HOGWILD!, se vuelve inestable al aumentar el paralelismo, al punto de que con 68 hilos ninguna ejecución de las líneas base logró converger, mientras que la variante lock-free consistente sí lo hizo y alcanzó mejoras de entre 20-80% y hasta 4x en tiempo real de convergencia, además de reducir el uso de memoria. Esto evidencia un perjuicio importante de la programación concurrente mal diseñada: la contención y la obsolescencia pueden anular por completo la ganancia teórica del speedup. Un aspecto valioso desde el punto de vista metodológico es su insistencia en medir el tiempo real de reloj y no solo el número de iteraciones, criterio que se aplicó </w:t>
+              <w:t xml:space="preserve">Considero que este artículo aporta la lección más directamente aplicable a nuestro trabajo: la concurrencia no mejora el rendimiento por sí sola, sino que su beneficio depende críticamente del mecanismo de sincronización elegido. Los autores muestran que la alternativa aparentemente más rápida, eliminar toda sincronización, como HOGWILD!, se vuelve inestable al aumentar el paralelismo, al punto de que con 68 hilos ninguna ejecución de las líneas base logró converger, mientras que la variante lock-free consistente sí lo hizo y alcanzó mejoras de entre 20-80 % y hasta 4x en tiempo real de convergencia, además de reducir el uso de memoria. Esto evidencia un perjuicio importante de la programación concurrente mal diseñada: la contención y la obsolescencia pueden anular por completo la ganancia teórica del speedup. Un aspecto valioso desde el punto de vista metodológico es su insistencia en medir el tiempo real de reloj y no solo el número de iteraciones, criterio que se aplicó </w:t>
             </w:r>
             <w:r>
               <w:rPr>
@@ -9048,7 +9019,6 @@
     <w:p>
       <w:pPr>
         <w:pStyle w:val="Ttulo2"/>
-        <w:keepNext w:val="0"/>
         <w:keepLines w:val="0"/>
         <w:spacing w:after="80"/>
         <w:jc w:val="both"/>
@@ -9060,7 +9030,7 @@
           <w:szCs w:val="24"/>
         </w:rPr>
       </w:pPr>
-      <w:bookmarkStart w:id="12" w:name="_Toc242038957"/>
+      <w:bookmarkStart w:id="12" w:name="_Toc242049365"/>
       <w:r>
         <w:rPr>
           <w:rFonts w:ascii="Times New Roman" w:eastAsia="Times New Roman" w:hAnsi="Times New Roman" w:cs="Times New Roman"/>
@@ -9152,7 +9122,6 @@
     <w:p>
       <w:pPr>
         <w:pStyle w:val="Ttulo1"/>
-        <w:keepNext w:val="0"/>
         <w:keepLines w:val="0"/>
         <w:spacing w:before="480"/>
         <w:jc w:val="both"/>
@@ -9164,7 +9133,7 @@
           <w:szCs w:val="24"/>
         </w:rPr>
       </w:pPr>
-      <w:bookmarkStart w:id="13" w:name="_Toc242038958"/>
+      <w:bookmarkStart w:id="13" w:name="_Toc242049366"/>
       <w:r>
         <w:rPr>
           <w:rFonts w:ascii="Times New Roman" w:eastAsia="Times New Roman" w:hAnsi="Times New Roman" w:cs="Times New Roman"/>
@@ -9173,6 +9142,7 @@
           <w:sz w:val="24"/>
           <w:szCs w:val="24"/>
         </w:rPr>
+        <w:lastRenderedPageBreak/>
         <w:t>4. Análisis del caso de uso</w:t>
       </w:r>
       <w:bookmarkEnd w:id="13"/>
@@ -9180,7 +9150,6 @@
     <w:p>
       <w:pPr>
         <w:pStyle w:val="Ttulo2"/>
-        <w:keepNext w:val="0"/>
         <w:keepLines w:val="0"/>
         <w:spacing w:after="80"/>
         <w:jc w:val="both"/>
@@ -9192,7 +9161,7 @@
           <w:szCs w:val="24"/>
         </w:rPr>
       </w:pPr>
-      <w:bookmarkStart w:id="14" w:name="_Toc242038959"/>
+      <w:bookmarkStart w:id="14" w:name="_Toc242049367"/>
       <w:r>
         <w:rPr>
           <w:rFonts w:ascii="Times New Roman" w:eastAsia="Times New Roman" w:hAnsi="Times New Roman" w:cs="Times New Roman"/>
@@ -9221,7 +9190,6 @@
           <w:sz w:val="24"/>
           <w:szCs w:val="24"/>
         </w:rPr>
-        <w:lastRenderedPageBreak/>
         <w:t>El caso de uso seleccionado consiste en la estimación del costo total de atención hospitalaria a partir de variables clínicas y administrativas asociadas a cada episodio de hospitalización, con el propósito de apoyar la planificación presupuestaria y el análisis del consumo de recursos en centros de salud, en línea con el ODS 3 (Salud y bienestar). Se eligió este caso por tres razones principales:</w:t>
       </w:r>
     </w:p>
@@ -9314,7 +9282,6 @@
     <w:p>
       <w:pPr>
         <w:pStyle w:val="Ttulo2"/>
-        <w:keepNext w:val="0"/>
         <w:keepLines w:val="0"/>
         <w:spacing w:after="80"/>
         <w:jc w:val="both"/>
@@ -9326,7 +9293,7 @@
           <w:szCs w:val="24"/>
         </w:rPr>
       </w:pPr>
-      <w:bookmarkStart w:id="15" w:name="_Toc242038960"/>
+      <w:bookmarkStart w:id="15" w:name="_Toc242049368"/>
       <w:r>
         <w:rPr>
           <w:rFonts w:ascii="Times New Roman" w:eastAsia="Times New Roman" w:hAnsi="Times New Roman" w:cs="Times New Roman"/>
@@ -9393,7 +9360,16 @@
           <w:sz w:val="24"/>
           <w:szCs w:val="24"/>
         </w:rPr>
-        <w:t>Por ello, el grupo seleccionó como dataset definitivo el Hospital Inpatient Discharges (SPARCS De-Identified) del año 2022, publicado por el New York State Department of Health (2024) a través del portal público Health Data NY. El SPARCS (Statewide Planning and Research Cooperative System) es un sistema de reporte obligatorio que recopila el detalle de cada alta hospitalaria en el estado de Nueva York, y su versión desidentificada es de acceso público y gratuito.</w:t>
+        <w:t xml:space="preserve">Por ello, el grupo seleccionó como dataset definitivo el Hospital Inpatient Discharges (SPARCS De-Identified) del año 2022, publicado por el New York State Department of Health (2024) a través del portal público Health Data NY. El SPARCS (Statewide Planning and </w:t>
+      </w:r>
+      <w:r>
+        <w:rPr>
+          <w:rFonts w:ascii="Times New Roman" w:eastAsia="Times New Roman" w:hAnsi="Times New Roman" w:cs="Times New Roman"/>
+          <w:sz w:val="24"/>
+          <w:szCs w:val="24"/>
+        </w:rPr>
+        <w:lastRenderedPageBreak/>
+        <w:t>Research Cooperative System) es un sistema de reporte obligatorio que recopila el detalle de cada alta hospitalaria en el estado de Nueva York, y su versión desidentificada es de acceso público y gratuito.</w:t>
       </w:r>
     </w:p>
     <w:p>
@@ -9412,7 +9388,6 @@
           <w:sz w:val="24"/>
           <w:szCs w:val="24"/>
         </w:rPr>
-        <w:lastRenderedPageBreak/>
         <w:t>El dataset SPARCS 2022 contiene 2,103,433 registros a nivel de alta hospitalaria individual. Para el caso de uso se seleccionaron variables relacionadas con duración, características clínicas y administrativas de la hospitalización: Length of Stay, Age Group, Type of Admission, APR Severity of Illness Code, APR MDC Description, APR Medical Surgical Description, Payment Typology 1, Emergency Department Indicator y Total Costs. Esta última constituye la variable objetivo del modelo de Regresión Lineal (New York State Department of Health, 2024).</w:t>
       </w:r>
     </w:p>
@@ -9438,7 +9413,6 @@
     <w:p>
       <w:pPr>
         <w:pStyle w:val="Ttulo1"/>
-        <w:keepNext w:val="0"/>
         <w:keepLines w:val="0"/>
         <w:spacing w:before="480"/>
         <w:jc w:val="both"/>
@@ -9450,7 +9424,7 @@
           <w:szCs w:val="24"/>
         </w:rPr>
       </w:pPr>
-      <w:bookmarkStart w:id="16" w:name="_Toc242038961"/>
+      <w:bookmarkStart w:id="16" w:name="_Toc242049369"/>
       <w:r>
         <w:rPr>
           <w:rFonts w:ascii="Times New Roman" w:eastAsia="Times New Roman" w:hAnsi="Times New Roman" w:cs="Times New Roman"/>
@@ -9485,7 +9459,6 @@
     <w:p>
       <w:pPr>
         <w:pStyle w:val="Ttulo2"/>
-        <w:keepNext w:val="0"/>
         <w:keepLines w:val="0"/>
         <w:spacing w:after="80"/>
         <w:jc w:val="both"/>
@@ -9497,7 +9470,7 @@
           <w:szCs w:val="24"/>
         </w:rPr>
       </w:pPr>
-      <w:bookmarkStart w:id="17" w:name="_Toc242038962"/>
+      <w:bookmarkStart w:id="17" w:name="_Toc242049370"/>
       <w:r>
         <w:rPr>
           <w:rFonts w:ascii="Times New Roman" w:eastAsia="Times New Roman" w:hAnsi="Times New Roman" w:cs="Times New Roman"/>
@@ -9667,7 +9640,16 @@
           <w:sz w:val="24"/>
           <w:szCs w:val="24"/>
         </w:rPr>
-        <w:t xml:space="preserve"> debido a que esta categoría representa hospitalizaciones de 120 días o más, se almacenó Length of Stay = 120 y se creó la variable binaria LOS_120_plus = 1, conservando así la información de censura presente en el dato original.</w:t>
+        <w:t xml:space="preserve"> debido a que esta categoría representa hospitalizaciones de 120 días o más, se almacenó Length of Stay = 120 y se creó la variable binaria </w:t>
+      </w:r>
+      <w:r>
+        <w:rPr>
+          <w:rFonts w:ascii="Times New Roman" w:eastAsia="Times New Roman" w:hAnsi="Times New Roman" w:cs="Times New Roman"/>
+          <w:sz w:val="24"/>
+          <w:szCs w:val="24"/>
+        </w:rPr>
+        <w:lastRenderedPageBreak/>
+        <w:t>LOS_120_plus = 1, conservando así la información de censura presente en el dato original.</w:t>
       </w:r>
     </w:p>
     <w:p>
@@ -9699,16 +9681,7 @@
           <w:sz w:val="24"/>
           <w:szCs w:val="24"/>
         </w:rPr>
-        <w:t xml:space="preserve"> los valores válidos de APR Severity of Illness Code se conservaron en el rango 1-4. Los códigos 0, vacíos o inválidos se representaron </w:t>
-      </w:r>
-      <w:r>
-        <w:rPr>
-          <w:rFonts w:ascii="Times New Roman" w:eastAsia="Times New Roman" w:hAnsi="Times New Roman" w:cs="Times New Roman"/>
-          <w:sz w:val="24"/>
-          <w:szCs w:val="24"/>
-        </w:rPr>
-        <w:lastRenderedPageBreak/>
-        <w:t>mediante APR Severity of Illness Code = 0 y Severity_unknown = 1, evitando eliminar esos registros.</w:t>
+        <w:t xml:space="preserve"> los valores válidos de APR Severity of Illness Code se conservaron en el rango 1-4. Los códigos 0, vacíos o inválidos se representaron mediante APR Severity of Illness Code = 0 y Severity_unknown = 1, evitando eliminar esos registros.</w:t>
       </w:r>
     </w:p>
     <w:p>
@@ -9904,7 +9877,6 @@
     <w:p>
       <w:pPr>
         <w:pStyle w:val="Ttulo2"/>
-        <w:keepNext w:val="0"/>
         <w:keepLines w:val="0"/>
         <w:spacing w:after="80"/>
         <w:jc w:val="both"/>
@@ -9916,7 +9888,7 @@
           <w:szCs w:val="24"/>
         </w:rPr>
       </w:pPr>
-      <w:bookmarkStart w:id="18" w:name="_Toc242038963"/>
+      <w:bookmarkStart w:id="18" w:name="_Toc242049371"/>
       <w:r>
         <w:rPr>
           <w:rFonts w:ascii="Times New Roman" w:eastAsia="Times New Roman" w:hAnsi="Times New Roman" w:cs="Times New Roman"/>
@@ -10009,7 +9981,16 @@
           <w:sz w:val="24"/>
           <w:szCs w:val="24"/>
         </w:rPr>
-        <w:t>la PC1 indicaba que las sumas parciales se combinarían usando sync.Mutex y sync.WaitGroup. La implementación final no utiliza sync.Mutex: los workers envían sus gradientes parciales por channels y la reducción y actualización de pesos se realizan en un único flujo después de sync.WaitGroup.Wait().</w:t>
+        <w:t xml:space="preserve">la PC1 indicaba que las sumas parciales se combinarían usando sync.Mutex y sync.WaitGroup. La implementación final no </w:t>
+      </w:r>
+      <w:r>
+        <w:rPr>
+          <w:rFonts w:ascii="Times New Roman" w:eastAsia="Times New Roman" w:hAnsi="Times New Roman" w:cs="Times New Roman"/>
+          <w:sz w:val="24"/>
+          <w:szCs w:val="24"/>
+        </w:rPr>
+        <w:lastRenderedPageBreak/>
+        <w:t>utiliza sync.Mutex: los workers envían sus gradientes parciales por channels y la reducción y actualización de pesos se realizan en un único flujo después de sync.WaitGroup.Wait().</w:t>
       </w:r>
     </w:p>
     <w:p>
@@ -10033,7 +10014,6 @@
           <w:sz w:val="24"/>
           <w:szCs w:val="24"/>
         </w:rPr>
-        <w:lastRenderedPageBreak/>
         <w:t xml:space="preserve">Cadena de búsqueda (sección 3.3): </w:t>
       </w:r>
       <w:r>
@@ -10112,7 +10092,6 @@
     <w:p>
       <w:pPr>
         <w:pStyle w:val="Ttulo1"/>
-        <w:keepNext w:val="0"/>
         <w:keepLines w:val="0"/>
         <w:spacing w:before="480"/>
         <w:jc w:val="both"/>
@@ -10124,7 +10103,7 @@
           <w:szCs w:val="24"/>
         </w:rPr>
       </w:pPr>
-      <w:bookmarkStart w:id="19" w:name="_Toc242038964"/>
+      <w:bookmarkStart w:id="19" w:name="_Toc242049372"/>
       <w:r>
         <w:rPr>
           <w:rFonts w:ascii="Times New Roman" w:eastAsia="Times New Roman" w:hAnsi="Times New Roman" w:cs="Times New Roman"/>
@@ -10300,6 +10279,7 @@
           <w:sz w:val="24"/>
           <w:szCs w:val="24"/>
         </w:rPr>
+        <w:lastRenderedPageBreak/>
         <w:t>El coordinador distribuye trabajos mediante el canal jobs, los workers procesan las tareas de forma concurrente y comunican sus resultados a través del canal results; posteriormente se realiza la reducción y actualización de los parámetros.</w:t>
       </w:r>
     </w:p>
@@ -10353,7 +10333,7 @@
           <w:szCs w:val="24"/>
         </w:rPr>
       </w:pPr>
-      <w:bookmarkStart w:id="20" w:name="_Toc242038965"/>
+      <w:bookmarkStart w:id="20" w:name="_Toc242049373"/>
       <w:r>
         <w:rPr>
           <w:rFonts w:ascii="Times New Roman" w:eastAsia="Times New Roman" w:hAnsi="Times New Roman" w:cs="Times New Roman"/>
@@ -10361,7 +10341,6 @@
           <w:sz w:val="24"/>
           <w:szCs w:val="24"/>
         </w:rPr>
-        <w:lastRenderedPageBreak/>
         <w:t>6.1 Lógica de sincronización</w:t>
       </w:r>
       <w:bookmarkEnd w:id="20"/>
@@ -10674,7 +10653,7 @@
           <w:szCs w:val="24"/>
         </w:rPr>
       </w:pPr>
-      <w:bookmarkStart w:id="21" w:name="_Toc242038966"/>
+      <w:bookmarkStart w:id="21" w:name="_Toc242049374"/>
       <w:r>
         <w:rPr>
           <w:rFonts w:ascii="Times New Roman" w:eastAsia="Times New Roman" w:hAnsi="Times New Roman" w:cs="Times New Roman"/>
@@ -10682,6 +10661,7 @@
           <w:sz w:val="24"/>
           <w:szCs w:val="24"/>
         </w:rPr>
+        <w:lastRenderedPageBreak/>
         <w:t>6.2 Procesos y canales</w:t>
       </w:r>
       <w:bookmarkEnd w:id="21"/>
@@ -10740,7 +10720,6 @@
           <w:sz w:val="24"/>
           <w:szCs w:val="24"/>
         </w:rPr>
-        <w:lastRenderedPageBreak/>
         <w:t>El proceso “proctype Worker(byte worker_id)” representa a cada worker del Worker Pool. Cada instancia espera elementos del canal jobs. Cuando recibe un identificador de trabajo válido, verifica que el trabajo no haya sido procesado anteriormente, lo marca como procesado y envía su identificador al canal results, representando el gradiente parcial producido.</w:t>
       </w:r>
     </w:p>
@@ -10924,7 +10903,7 @@
           <w:szCs w:val="24"/>
         </w:rPr>
       </w:pPr>
-      <w:bookmarkStart w:id="22" w:name="_Toc242038967"/>
+      <w:bookmarkStart w:id="22" w:name="_Toc242049375"/>
       <w:r>
         <w:rPr>
           <w:rFonts w:ascii="Times New Roman" w:eastAsia="Times New Roman" w:hAnsi="Times New Roman" w:cs="Times New Roman"/>
@@ -11120,6 +11099,7 @@
                 <w:sz w:val="24"/>
                 <w:szCs w:val="24"/>
               </w:rPr>
+              <w:lastRenderedPageBreak/>
               <w:t>El identificador del trabajo debe ser válido</w:t>
             </w:r>
           </w:p>
@@ -11440,7 +11420,6 @@
                 <w:sz w:val="24"/>
                 <w:szCs w:val="24"/>
               </w:rPr>
-              <w:lastRenderedPageBreak/>
               <w:t>Deben recibirse todos los resultados</w:t>
             </w:r>
           </w:p>
@@ -11766,7 +11745,7 @@
           <w:szCs w:val="24"/>
         </w:rPr>
       </w:pPr>
-      <w:bookmarkStart w:id="23" w:name="_Toc242038968"/>
+      <w:bookmarkStart w:id="23" w:name="_Toc242049376"/>
       <w:r>
         <w:rPr>
           <w:rFonts w:ascii="Times New Roman" w:eastAsia="Times New Roman" w:hAnsi="Times New Roman" w:cs="Times New Roman"/>
@@ -13620,7 +13599,6 @@
     <w:p>
       <w:pPr>
         <w:pStyle w:val="Ttulo1"/>
-        <w:keepNext w:val="0"/>
         <w:keepLines w:val="0"/>
         <w:spacing w:before="480"/>
         <w:jc w:val="both"/>
@@ -13632,7 +13610,7 @@
           <w:szCs w:val="24"/>
         </w:rPr>
       </w:pPr>
-      <w:bookmarkStart w:id="24" w:name="_Toc242038969"/>
+      <w:bookmarkStart w:id="24" w:name="_Toc242049377"/>
       <w:r>
         <w:rPr>
           <w:rFonts w:ascii="Times New Roman" w:eastAsia="Times New Roman" w:hAnsi="Times New Roman" w:cs="Times New Roman"/>
@@ -14548,7 +14526,7 @@
           <w:szCs w:val="24"/>
         </w:rPr>
       </w:pPr>
-      <w:bookmarkStart w:id="25" w:name="_Toc242038970"/>
+      <w:bookmarkStart w:id="25" w:name="_Toc242049378"/>
       <w:r>
         <w:rPr>
           <w:rFonts w:ascii="Times New Roman" w:eastAsia="Times New Roman" w:hAnsi="Times New Roman" w:cs="Times New Roman"/>
@@ -17126,7 +17104,7 @@
           <w:szCs w:val="24"/>
         </w:rPr>
       </w:pPr>
-      <w:bookmarkStart w:id="26" w:name="_Toc242038971"/>
+      <w:bookmarkStart w:id="26" w:name="_Toc242049379"/>
       <w:r>
         <w:rPr>
           <w:rFonts w:ascii="Times New Roman" w:eastAsia="Times New Roman" w:hAnsi="Times New Roman" w:cs="Times New Roman"/>
@@ -18007,7 +17985,7 @@
           <w:szCs w:val="24"/>
         </w:rPr>
       </w:pPr>
-      <w:bookmarkStart w:id="27" w:name="_Toc242038972"/>
+      <w:bookmarkStart w:id="27" w:name="_Toc242049380"/>
       <w:r>
         <w:rPr>
           <w:rFonts w:ascii="Times New Roman" w:eastAsia="Times New Roman" w:hAnsi="Times New Roman" w:cs="Times New Roman"/>
@@ -18626,7 +18604,7 @@
           <w:szCs w:val="24"/>
         </w:rPr>
       </w:pPr>
-      <w:bookmarkStart w:id="28" w:name="_Toc242038973"/>
+      <w:bookmarkStart w:id="28" w:name="_Toc242049381"/>
       <w:r>
         <w:rPr>
           <w:rFonts w:ascii="Times New Roman" w:eastAsia="Times New Roman" w:hAnsi="Times New Roman" w:cs="Times New Roman"/>
@@ -18837,7 +18815,7 @@
           <w:szCs w:val="24"/>
         </w:rPr>
       </w:pPr>
-      <w:bookmarkStart w:id="29" w:name="_Toc242038974"/>
+      <w:bookmarkStart w:id="29" w:name="_Toc242049382"/>
       <w:r>
         <w:rPr>
           <w:rFonts w:ascii="Times New Roman" w:eastAsia="Times New Roman" w:hAnsi="Times New Roman" w:cs="Times New Roman"/>
@@ -19089,7 +19067,6 @@
     <w:p>
       <w:pPr>
         <w:pStyle w:val="Ttulo1"/>
-        <w:keepNext w:val="0"/>
         <w:keepLines w:val="0"/>
         <w:spacing w:before="480"/>
         <w:jc w:val="both"/>
@@ -19101,7 +19078,7 @@
           <w:szCs w:val="24"/>
         </w:rPr>
       </w:pPr>
-      <w:bookmarkStart w:id="30" w:name="_Toc242038975"/>
+      <w:bookmarkStart w:id="30" w:name="_Toc242049383"/>
       <w:r>
         <w:rPr>
           <w:rFonts w:ascii="Times New Roman" w:eastAsia="Times New Roman" w:hAnsi="Times New Roman" w:cs="Times New Roman"/>
@@ -19208,7 +19185,7 @@
           <w:szCs w:val="24"/>
         </w:rPr>
       </w:pPr>
-      <w:bookmarkStart w:id="31" w:name="_Toc242038976"/>
+      <w:bookmarkStart w:id="31" w:name="_Toc242049384"/>
       <w:r>
         <w:rPr>
           <w:rFonts w:ascii="Times New Roman" w:eastAsia="Times New Roman" w:hAnsi="Times New Roman" w:cs="Times New Roman"/>
@@ -20250,7 +20227,7 @@
           <w:szCs w:val="24"/>
         </w:rPr>
       </w:pPr>
-      <w:bookmarkStart w:id="32" w:name="_Toc242038977"/>
+      <w:bookmarkStart w:id="32" w:name="_Toc242049385"/>
       <w:r>
         <w:rPr>
           <w:rFonts w:ascii="Times New Roman" w:eastAsia="Times New Roman" w:hAnsi="Times New Roman" w:cs="Times New Roman"/>
@@ -21120,7 +21097,7 @@
           <w:szCs w:val="24"/>
         </w:rPr>
       </w:pPr>
-      <w:bookmarkStart w:id="33" w:name="_Toc242038978"/>
+      <w:bookmarkStart w:id="33" w:name="_Toc242049386"/>
       <w:r>
         <w:rPr>
           <w:rFonts w:ascii="Times New Roman" w:eastAsia="Times New Roman" w:hAnsi="Times New Roman" w:cs="Times New Roman"/>
@@ -21962,7 +21939,7 @@
           <w:szCs w:val="24"/>
         </w:rPr>
       </w:pPr>
-      <w:bookmarkStart w:id="34" w:name="_Toc242038979"/>
+      <w:bookmarkStart w:id="34" w:name="_Toc242049387"/>
       <w:r>
         <w:rPr>
           <w:rFonts w:ascii="Times New Roman" w:eastAsia="Times New Roman" w:hAnsi="Times New Roman" w:cs="Times New Roman"/>
@@ -22602,7 +22579,7 @@
                   <w:sz w:val="26"/>
                   <w:szCs w:val="26"/>
                 </w:rPr>
-                <m:t>≤</m:t>
+                <m:t>+</m:t>
               </m:r>
               <m:sSub>
                 <m:sSubPr>
@@ -22641,7 +22618,7 @@
                   <w:sz w:val="26"/>
                   <w:szCs w:val="26"/>
                 </w:rPr>
-                <m:t>≤</m:t>
+                <m:t>+</m:t>
               </m:r>
               <m:sSub>
                 <m:sSubPr>
@@ -22680,7 +22657,7 @@
                   <w:sz w:val="26"/>
                   <w:szCs w:val="26"/>
                 </w:rPr>
-                <m:t>≤</m:t>
+                <m:t>+</m:t>
               </m:r>
               <m:sSub>
                 <m:sSubPr>
@@ -22719,7 +22696,7 @@
                   <w:sz w:val="26"/>
                   <w:szCs w:val="26"/>
                 </w:rPr>
-                <m:t>≤</m:t>
+                <m:t>+</m:t>
               </m:r>
               <m:sSub>
                 <m:sSubPr>
@@ -23165,7 +23142,6 @@
     <w:p>
       <w:pPr>
         <w:pStyle w:val="Ttulo1"/>
-        <w:keepNext w:val="0"/>
         <w:keepLines w:val="0"/>
         <w:spacing w:before="480"/>
         <w:jc w:val="both"/>
@@ -23177,7 +23153,7 @@
           <w:szCs w:val="24"/>
         </w:rPr>
       </w:pPr>
-      <w:bookmarkStart w:id="35" w:name="_Toc242038980"/>
+      <w:bookmarkStart w:id="35" w:name="_Toc242049388"/>
       <w:r>
         <w:rPr>
           <w:rFonts w:ascii="Times New Roman" w:eastAsia="Times New Roman" w:hAnsi="Times New Roman" w:cs="Times New Roman"/>
@@ -23246,7 +23222,7 @@
           <w:szCs w:val="24"/>
         </w:rPr>
       </w:pPr>
-      <w:bookmarkStart w:id="36" w:name="_Toc242038981"/>
+      <w:bookmarkStart w:id="36" w:name="_Toc242049389"/>
       <w:r>
         <w:rPr>
           <w:rFonts w:ascii="Times New Roman" w:eastAsia="Times New Roman" w:hAnsi="Times New Roman" w:cs="Times New Roman"/>
@@ -23975,7 +23951,7 @@
           <w:szCs w:val="24"/>
         </w:rPr>
       </w:pPr>
-      <w:bookmarkStart w:id="37" w:name="_Toc242038982"/>
+      <w:bookmarkStart w:id="37" w:name="_Toc242049390"/>
       <w:r>
         <w:rPr>
           <w:rFonts w:ascii="Times New Roman" w:eastAsia="Times New Roman" w:hAnsi="Times New Roman" w:cs="Times New Roman"/>
@@ -25688,7 +25664,7 @@
           <w:szCs w:val="24"/>
         </w:rPr>
       </w:pPr>
-      <w:bookmarkStart w:id="38" w:name="_Toc242038983"/>
+      <w:bookmarkStart w:id="38" w:name="_Toc242049391"/>
       <w:r>
         <w:rPr>
           <w:rFonts w:ascii="Times New Roman" w:eastAsia="Times New Roman" w:hAnsi="Times New Roman" w:cs="Times New Roman"/>
@@ -26701,7 +26677,7 @@
           <w:szCs w:val="24"/>
         </w:rPr>
       </w:pPr>
-      <w:bookmarkStart w:id="39" w:name="_Toc242038984"/>
+      <w:bookmarkStart w:id="39" w:name="_Toc242049392"/>
       <w:r>
         <w:rPr>
           <w:rFonts w:ascii="Times New Roman" w:eastAsia="Times New Roman" w:hAnsi="Times New Roman" w:cs="Times New Roman"/>
@@ -27487,7 +27463,6 @@
     <w:p>
       <w:pPr>
         <w:pStyle w:val="Ttulo1"/>
-        <w:keepNext w:val="0"/>
         <w:keepLines w:val="0"/>
         <w:spacing w:before="480"/>
         <w:jc w:val="both"/>
@@ -27499,7 +27474,7 @@
           <w:szCs w:val="24"/>
         </w:rPr>
       </w:pPr>
-      <w:bookmarkStart w:id="40" w:name="_Toc242038985"/>
+      <w:bookmarkStart w:id="40" w:name="_Toc242049393"/>
       <w:r>
         <w:rPr>
           <w:rFonts w:ascii="Times New Roman" w:eastAsia="Times New Roman" w:hAnsi="Times New Roman" w:cs="Times New Roman"/>
@@ -27568,7 +27543,7 @@
           <w:szCs w:val="24"/>
         </w:rPr>
       </w:pPr>
-      <w:bookmarkStart w:id="41" w:name="_Toc242038986"/>
+      <w:bookmarkStart w:id="41" w:name="_Toc242049394"/>
       <w:r>
         <w:rPr>
           <w:rFonts w:ascii="Times New Roman" w:eastAsia="Times New Roman" w:hAnsi="Times New Roman" w:cs="Times New Roman"/>
@@ -27831,7 +27806,7 @@
           <w:szCs w:val="24"/>
         </w:rPr>
       </w:pPr>
-      <w:bookmarkStart w:id="42" w:name="_Toc242038987"/>
+      <w:bookmarkStart w:id="42" w:name="_Toc242049395"/>
       <w:r>
         <w:rPr>
           <w:rFonts w:ascii="Times New Roman" w:eastAsia="Times New Roman" w:hAnsi="Times New Roman" w:cs="Times New Roman"/>
@@ -28013,7 +27988,7 @@
           <w:szCs w:val="24"/>
         </w:rPr>
       </w:pPr>
-      <w:bookmarkStart w:id="43" w:name="_Toc242038988"/>
+      <w:bookmarkStart w:id="43" w:name="_Toc242049396"/>
       <w:r>
         <w:rPr>
           <w:rFonts w:ascii="Times New Roman" w:eastAsia="Times New Roman" w:hAnsi="Times New Roman" w:cs="Times New Roman"/>
@@ -28167,7 +28142,6 @@
     <w:p>
       <w:pPr>
         <w:pStyle w:val="Ttulo2"/>
-        <w:keepNext w:val="0"/>
         <w:keepLines w:val="0"/>
         <w:spacing w:after="80"/>
         <w:jc w:val="both"/>
@@ -28179,7 +28153,7 @@
           <w:szCs w:val="24"/>
         </w:rPr>
       </w:pPr>
-      <w:bookmarkStart w:id="44" w:name="_Toc242038989"/>
+      <w:bookmarkStart w:id="44" w:name="_Toc242049397"/>
       <w:r>
         <w:rPr>
           <w:rFonts w:ascii="Times New Roman" w:eastAsia="Times New Roman" w:hAnsi="Times New Roman" w:cs="Times New Roman"/>
@@ -29095,7 +29069,6 @@
     <w:p>
       <w:pPr>
         <w:pStyle w:val="Ttulo1"/>
-        <w:keepNext w:val="0"/>
         <w:keepLines w:val="0"/>
         <w:spacing w:before="480"/>
         <w:jc w:val="both"/>
@@ -29107,7 +29080,7 @@
           <w:szCs w:val="24"/>
         </w:rPr>
       </w:pPr>
-      <w:bookmarkStart w:id="45" w:name="_Toc242038990"/>
+      <w:bookmarkStart w:id="45" w:name="_Toc242049398"/>
       <w:r>
         <w:rPr>
           <w:rFonts w:ascii="Times New Roman" w:eastAsia="Times New Roman" w:hAnsi="Times New Roman" w:cs="Times New Roman"/>
@@ -29176,7 +29149,7 @@
           <w:szCs w:val="24"/>
         </w:rPr>
       </w:pPr>
-      <w:bookmarkStart w:id="46" w:name="_Toc242038991"/>
+      <w:bookmarkStart w:id="46" w:name="_Toc242049399"/>
       <w:r>
         <w:rPr>
           <w:rFonts w:ascii="Times New Roman" w:eastAsia="Times New Roman" w:hAnsi="Times New Roman" w:cs="Times New Roman"/>
@@ -29449,7 +29422,7 @@
           <w:szCs w:val="24"/>
         </w:rPr>
       </w:pPr>
-      <w:bookmarkStart w:id="47" w:name="_Toc242038992"/>
+      <w:bookmarkStart w:id="47" w:name="_Toc242049400"/>
       <w:r>
         <w:rPr>
           <w:rFonts w:ascii="Times New Roman" w:eastAsia="Times New Roman" w:hAnsi="Times New Roman" w:cs="Times New Roman"/>
@@ -31226,7 +31199,7 @@
           <w:szCs w:val="24"/>
         </w:rPr>
       </w:pPr>
-      <w:bookmarkStart w:id="48" w:name="_Toc242038993"/>
+      <w:bookmarkStart w:id="48" w:name="_Toc242049401"/>
       <w:r>
         <w:rPr>
           <w:rFonts w:ascii="Times New Roman" w:eastAsia="Times New Roman" w:hAnsi="Times New Roman" w:cs="Times New Roman"/>
@@ -32282,7 +32255,7 @@
           <w:sz w:val="24"/>
           <w:szCs w:val="24"/>
         </w:rPr>
-        <w:t>Como complemento, se aplicaron dos criterios cuantitativos al mismo conjunto de datos. El primero toma la menor configuración que alcanza al menos el 95 % del speedup máximo: 0.95 × 4.8817 = 4.6376, valor que ya supera la configuración de 8 workers (4.7050x, 96.4 % del máximo). El segundo identifica la última configuración con eficiencia igual o superior a 0.5, que también corresponde a 8 workers (0.5881; con 12 workers desciende a 0.4019).</w:t>
+        <w:t>Como complemento, se aplicaron dos criterios cuantitativos al mismo conjunto de datos. El primero toma la menor configuración que alcanza al menos el 95 % del speedup máximo: 0.95 × 4.8817 = 4.6376, umbral que la configuración de 8 workers (4.7050x, 96.4 % del máximo) ya supera. El segundo identifica la última configuración con eficiencia igual o superior a 0.5, que también corresponde a 8 workers (0.5881; con 12 workers desciende a 0.4019).</w:t>
       </w:r>
     </w:p>
     <w:tbl>
@@ -33052,7 +33025,6 @@
     <w:p>
       <w:pPr>
         <w:pStyle w:val="Ttulo1"/>
-        <w:keepNext w:val="0"/>
         <w:keepLines w:val="0"/>
         <w:spacing w:before="480"/>
         <w:jc w:val="both"/>
@@ -33062,7 +33034,7 @@
           <w:szCs w:val="24"/>
         </w:rPr>
       </w:pPr>
-      <w:bookmarkStart w:id="49" w:name="_Toc242038994"/>
+      <w:bookmarkStart w:id="49" w:name="_Toc242049402"/>
       <w:r>
         <w:rPr>
           <w:rFonts w:ascii="Times New Roman" w:eastAsia="Times New Roman" w:hAnsi="Times New Roman" w:cs="Times New Roman"/>
@@ -33121,7 +33093,7 @@
             <w:szCs w:val="24"/>
             <w:u w:val="single"/>
           </w:rPr>
-          <w:t>https://github.com/YuhiTTo/Grupo5-ProgramacionConcurrente.git</w:t>
+          <w:t>https://github.com/YuhiTTo/Grupo5-ProgramacionConcurrente</w:t>
         </w:r>
       </w:hyperlink>
     </w:p>
@@ -33311,7 +33283,7 @@
           <w:sz w:val="24"/>
           <w:szCs w:val="24"/>
         </w:rPr>
-        <w:t>El trabajo de la PC2 se integró mediante ramas feature y pull requests hacia develop, y posteriormente de develop hacia main:</w:t>
+        <w:t>El trabajo de la PC2 y del TP se integró mediante ramas feature y docs, con pull requests hacia develop, y posteriormente de develop hacia main:</w:t>
       </w:r>
     </w:p>
     <w:p>
@@ -33431,7 +33403,7 @@
           <w:sz w:val="24"/>
           <w:szCs w:val="24"/>
         </w:rPr>
-        <w:t xml:space="preserve">feature/pc2-report-review: </w:t>
+        <w:t xml:space="preserve">feature/pc2-report-review (PR #7) y develop → main (PR #8): </w:t>
       </w:r>
       <w:r>
         <w:rPr>
@@ -33463,7 +33435,15 @@
           <w:sz w:val="24"/>
           <w:szCs w:val="24"/>
         </w:rPr>
-        <w:t>feature/tp-delivery (PR #9) y develop → main (PR #10): mutantes de SPIN, análisis de GAPs con IA, corrección de los GAPs e informe del TP.</w:t>
+        <w:t xml:space="preserve">feature/tp-delivery (PR #9) y develop → main (PR #10): </w:t>
+      </w:r>
+      <w:r>
+        <w:rPr>
+          <w:rFonts w:ascii="Times New Roman" w:eastAsia="Times New Roman" w:hAnsi="Times New Roman" w:cs="Times New Roman"/>
+          <w:sz w:val="24"/>
+          <w:szCs w:val="24"/>
+        </w:rPr>
+        <w:t>mutantes de SPIN, análisis de GAPs con IA, corrección de los GAPs e informe del TP.</w:t>
       </w:r>
     </w:p>
     <w:p>
@@ -33487,7 +33467,15 @@
           <w:sz w:val="24"/>
           <w:szCs w:val="24"/>
         </w:rPr>
-        <w:t>docs/tp-video-script (PR #11) y develop → main (PR #12): guion del video y lista de verificación de la entrega.</w:t>
+        <w:t xml:space="preserve">docs/tp-video-script (PR #11) y develop → main (PR #12): </w:t>
+      </w:r>
+      <w:r>
+        <w:rPr>
+          <w:rFonts w:ascii="Times New Roman" w:eastAsia="Times New Roman" w:hAnsi="Times New Roman" w:cs="Times New Roman"/>
+          <w:sz w:val="24"/>
+          <w:szCs w:val="24"/>
+        </w:rPr>
+        <w:t>guion del video y lista de verificación de la entrega.</w:t>
       </w:r>
     </w:p>
     <w:p>
@@ -33511,7 +33499,15 @@
           <w:sz w:val="24"/>
           <w:szCs w:val="24"/>
         </w:rPr>
-        <w:t>feature/tp-spin-review (PR #13): revalidación de la verificación formal en SPIN.</w:t>
+        <w:t xml:space="preserve">feature/tp-spin-review (PR #13): </w:t>
+      </w:r>
+      <w:r>
+        <w:rPr>
+          <w:rFonts w:ascii="Times New Roman" w:eastAsia="Times New Roman" w:hAnsi="Times New Roman" w:cs="Times New Roman"/>
+          <w:sz w:val="24"/>
+          <w:szCs w:val="24"/>
+        </w:rPr>
+        <w:t>revalidación de la verificación formal en SPIN.</w:t>
       </w:r>
     </w:p>
     <w:p>
@@ -33535,73 +33531,15 @@
           <w:sz w:val="24"/>
           <w:szCs w:val="24"/>
         </w:rPr>
-        <w:t>docs/tp-report-figures: actualización de las figuras del informe del TP.</w:t>
-      </w:r>
-    </w:p>
-    <w:p>
-      <w:pPr>
-        <w:spacing w:after="100"/>
-        <w:jc w:val="both"/>
-        <w:rPr>
-          <w:rFonts w:ascii="Times New Roman" w:eastAsia="Times New Roman" w:hAnsi="Times New Roman" w:cs="Times New Roman"/>
-          <w:sz w:val="24"/>
-          <w:szCs w:val="24"/>
-        </w:rPr>
-      </w:pPr>
-      <w:r>
-        <w:rPr>
-          <w:rFonts w:ascii="Times New Roman" w:eastAsia="Times New Roman" w:hAnsi="Times New Roman" w:cs="Times New Roman"/>
-          <w:sz w:val="24"/>
-          <w:szCs w:val="24"/>
-        </w:rPr>
-        <w:t>Las cuentas de GitHub de los integrantes son Jaed69 (Jhamil Brijan Peña Cardenas), SeuNg720p (José Antonio Mayhua Hinostroza) y YuhiTTo (Lucero Salome Manchay Paredes).</w:t>
-      </w:r>
-    </w:p>
-    <w:p>
-      <w:pPr>
-        <w:pStyle w:val="Ttulo1"/>
-        <w:keepNext w:val="0"/>
-        <w:keepLines w:val="0"/>
-        <w:spacing w:before="480"/>
-        <w:jc w:val="both"/>
-        <w:rPr>
-          <w:rFonts w:ascii="Times New Roman" w:eastAsia="Times New Roman" w:hAnsi="Times New Roman" w:cs="Times New Roman"/>
-          <w:b/>
-          <w:bCs/>
-          <w:sz w:val="24"/>
-          <w:szCs w:val="24"/>
-        </w:rPr>
-      </w:pPr>
-      <w:bookmarkStart w:id="50" w:name="_Toc242038995"/>
-      <w:r>
-        <w:rPr>
-          <w:rFonts w:ascii="Times New Roman" w:eastAsia="Times New Roman" w:hAnsi="Times New Roman" w:cs="Times New Roman"/>
-          <w:b/>
-          <w:bCs/>
-          <w:sz w:val="24"/>
-          <w:szCs w:val="24"/>
-        </w:rPr>
-        <w:t>13. Correcciones respecto a la PC2</w:t>
-      </w:r>
-      <w:bookmarkEnd w:id="50"/>
-    </w:p>
-    <w:p>
-      <w:pPr>
-        <w:spacing w:after="100"/>
-        <w:jc w:val="both"/>
-        <w:rPr>
-          <w:rFonts w:ascii="Times New Roman" w:eastAsia="Times New Roman" w:hAnsi="Times New Roman" w:cs="Times New Roman"/>
-          <w:sz w:val="24"/>
-          <w:szCs w:val="24"/>
-        </w:rPr>
-      </w:pPr>
-      <w:r>
-        <w:rPr>
-          <w:rFonts w:ascii="Times New Roman" w:eastAsia="Times New Roman" w:hAnsi="Times New Roman" w:cs="Times New Roman"/>
-          <w:sz w:val="24"/>
-          <w:szCs w:val="24"/>
-        </w:rPr>
-        <w:t>Con respecto a la versión inicial del informe de la PC2, se realizaron los siguientes ajustes:</w:t>
+        <w:t xml:space="preserve">docs/tp-report-figures (PR #14) y develop → main (PR #15): </w:t>
+      </w:r>
+      <w:r>
+        <w:rPr>
+          <w:rFonts w:ascii="Times New Roman" w:eastAsia="Times New Roman" w:hAnsi="Times New Roman" w:cs="Times New Roman"/>
+          <w:sz w:val="24"/>
+          <w:szCs w:val="24"/>
+        </w:rPr>
+        <w:t>actualización de las figuras del informe del TP.</w:t>
       </w:r>
     </w:p>
     <w:p>
@@ -33625,15 +33563,15 @@
           <w:sz w:val="24"/>
           <w:szCs w:val="24"/>
         </w:rPr>
-        <w:t xml:space="preserve">Correcciones de la PC1 (sección 5.2): </w:t>
-      </w:r>
-      <w:r>
-        <w:rPr>
-          <w:rFonts w:ascii="Times New Roman" w:eastAsia="Times New Roman" w:hAnsi="Times New Roman" w:cs="Times New Roman"/>
-          <w:sz w:val="24"/>
-          <w:szCs w:val="24"/>
-        </w:rPr>
-        <w:t>se agregó la lista explícita de cambios respecto a la PC1 que exige el formato del informe.</w:t>
+        <w:t xml:space="preserve">docs/tp-shortlog-refresh (PR #16) y develop → main (PR #17): </w:t>
+      </w:r>
+      <w:r>
+        <w:rPr>
+          <w:rFonts w:ascii="Times New Roman" w:eastAsia="Times New Roman" w:hAnsi="Times New Roman" w:cs="Times New Roman"/>
+          <w:sz w:val="24"/>
+          <w:szCs w:val="24"/>
+        </w:rPr>
+        <w:t>actualización de la evidencia de commits por integrante.</w:t>
       </w:r>
     </w:p>
     <w:p>
@@ -33657,15 +33595,15 @@
           <w:sz w:val="24"/>
           <w:szCs w:val="24"/>
         </w:rPr>
-        <w:t xml:space="preserve">Verificación formal (sección 6.4): </w:t>
-      </w:r>
-      <w:r>
-        <w:rPr>
-          <w:rFonts w:ascii="Times New Roman" w:eastAsia="Times New Roman" w:hAnsi="Times New Roman" w:cs="Times New Roman"/>
-          <w:sz w:val="24"/>
-          <w:szCs w:val="24"/>
-        </w:rPr>
-        <w:t>además de las aserciones, se verificaron las propiedades LTL safe_update, termination y mutex para 2, 3 y 4 workers.</w:t>
+        <w:t xml:space="preserve">feature/tp-gaps-review (PR #18): </w:t>
+      </w:r>
+      <w:r>
+        <w:rPr>
+          <w:rFonts w:ascii="Times New Roman" w:eastAsia="Times New Roman" w:hAnsi="Times New Roman" w:cs="Times New Roman"/>
+          <w:sz w:val="24"/>
+          <w:szCs w:val="24"/>
+        </w:rPr>
+        <w:t>revisión del estado residual de los GAPs de severidad baja.</w:t>
       </w:r>
     </w:p>
     <w:p>
@@ -33689,15 +33627,80 @@
           <w:sz w:val="24"/>
           <w:szCs w:val="24"/>
         </w:rPr>
-        <w:t xml:space="preserve">Escalabilidad (sección 10.4): </w:t>
-      </w:r>
-      <w:r>
-        <w:rPr>
-          <w:rFonts w:ascii="Times New Roman" w:eastAsia="Times New Roman" w:hAnsi="Times New Roman" w:cs="Times New Roman"/>
-          <w:sz w:val="24"/>
-          <w:szCs w:val="24"/>
-        </w:rPr>
-        <w:t>se incorporó la métrica de Karp–Flatt para explicar por qué el speedup se estanca cerca de 4.9x.</w:t>
+        <w:t xml:space="preserve">docs/tp-final-delivery: </w:t>
+      </w:r>
+      <w:r>
+        <w:rPr>
+          <w:rFonts w:ascii="Times New Roman" w:eastAsia="Times New Roman" w:hAnsi="Times New Roman" w:cs="Times New Roman"/>
+          <w:sz w:val="24"/>
+          <w:szCs w:val="24"/>
+        </w:rPr>
+        <w:t>revisión final del informe, presentación de la exposición y evidencias actualizadas.</w:t>
+      </w:r>
+    </w:p>
+    <w:p>
+      <w:pPr>
+        <w:spacing w:after="100"/>
+        <w:jc w:val="both"/>
+        <w:rPr>
+          <w:rFonts w:ascii="Times New Roman" w:eastAsia="Times New Roman" w:hAnsi="Times New Roman" w:cs="Times New Roman"/>
+          <w:sz w:val="24"/>
+          <w:szCs w:val="24"/>
+        </w:rPr>
+      </w:pPr>
+      <w:r>
+        <w:rPr>
+          <w:rFonts w:ascii="Times New Roman" w:eastAsia="Times New Roman" w:hAnsi="Times New Roman" w:cs="Times New Roman"/>
+          <w:sz w:val="24"/>
+          <w:szCs w:val="24"/>
+        </w:rPr>
+        <w:t>Las cuentas de GitHub de los integrantes son Jaed69 (Jhamil Brijan Peña Cardenas), SeuNg720p (José Antonio Mayhua Hinostroza) y YuhiTTo (Lucero Salome Manchay Paredes). La cuenta Littlepie4, que aparece en la Figura 16, registra el commit inicial del repositorio y el merge del PR #2.</w:t>
+      </w:r>
+    </w:p>
+    <w:p>
+      <w:pPr>
+        <w:pStyle w:val="Ttulo1"/>
+        <w:keepLines w:val="0"/>
+        <w:spacing w:before="480"/>
+        <w:jc w:val="both"/>
+        <w:rPr>
+          <w:rFonts w:ascii="Times New Roman" w:eastAsia="Times New Roman" w:hAnsi="Times New Roman" w:cs="Times New Roman"/>
+          <w:b/>
+          <w:bCs/>
+          <w:sz w:val="24"/>
+          <w:szCs w:val="24"/>
+        </w:rPr>
+      </w:pPr>
+      <w:bookmarkStart w:id="50" w:name="_Toc242049403"/>
+      <w:r>
+        <w:rPr>
+          <w:rFonts w:ascii="Times New Roman" w:eastAsia="Times New Roman" w:hAnsi="Times New Roman" w:cs="Times New Roman"/>
+          <w:b/>
+          <w:bCs/>
+          <w:sz w:val="24"/>
+          <w:szCs w:val="24"/>
+        </w:rPr>
+        <w:t>13. Correcciones respecto a la PC2</w:t>
+      </w:r>
+      <w:bookmarkEnd w:id="50"/>
+    </w:p>
+    <w:p>
+      <w:pPr>
+        <w:spacing w:after="100"/>
+        <w:jc w:val="both"/>
+        <w:rPr>
+          <w:rFonts w:ascii="Times New Roman" w:eastAsia="Times New Roman" w:hAnsi="Times New Roman" w:cs="Times New Roman"/>
+          <w:sz w:val="24"/>
+          <w:szCs w:val="24"/>
+        </w:rPr>
+      </w:pPr>
+      <w:r>
+        <w:rPr>
+          <w:rFonts w:ascii="Times New Roman" w:eastAsia="Times New Roman" w:hAnsi="Times New Roman" w:cs="Times New Roman"/>
+          <w:sz w:val="24"/>
+          <w:szCs w:val="24"/>
+        </w:rPr>
+        <w:t>Con respecto a la versión inicial del informe de la PC2, se realizaron los siguientes ajustes:</w:t>
       </w:r>
     </w:p>
     <w:p>
@@ -33721,15 +33724,15 @@
           <w:sz w:val="24"/>
           <w:szCs w:val="24"/>
         </w:rPr>
-        <w:t xml:space="preserve">Punto de equilibrio (sección 11.3): </w:t>
-      </w:r>
-      <w:r>
-        <w:rPr>
-          <w:rFonts w:ascii="Times New Roman" w:eastAsia="Times New Roman" w:hAnsi="Times New Roman" w:cs="Times New Roman"/>
-          <w:sz w:val="24"/>
-          <w:szCs w:val="24"/>
-        </w:rPr>
-        <w:t>se complementó la elección de 12 workers con el criterio de eficiencia, según el cual 8 workers alcanzan el 96 % del speedup máximo.</w:t>
+        <w:t xml:space="preserve">Correcciones de la PC1 (sección 5.2): </w:t>
+      </w:r>
+      <w:r>
+        <w:rPr>
+          <w:rFonts w:ascii="Times New Roman" w:eastAsia="Times New Roman" w:hAnsi="Times New Roman" w:cs="Times New Roman"/>
+          <w:sz w:val="24"/>
+          <w:szCs w:val="24"/>
+        </w:rPr>
+        <w:t>se agregó la lista explícita de cambios respecto a la PC1 que exige el formato del informe.</w:t>
       </w:r>
     </w:p>
     <w:p>
@@ -33753,15 +33756,16 @@
           <w:sz w:val="24"/>
           <w:szCs w:val="24"/>
         </w:rPr>
-        <w:t xml:space="preserve">Formato: </w:t>
-      </w:r>
-      <w:r>
-        <w:rPr>
-          <w:rFonts w:ascii="Times New Roman" w:eastAsia="Times New Roman" w:hAnsi="Times New Roman" w:cs="Times New Roman"/>
-          <w:sz w:val="24"/>
-          <w:szCs w:val="24"/>
-        </w:rPr>
-        <w:t>se corrigió el código de alumno de la carátula y se regeneró el índice.</w:t>
+        <w:lastRenderedPageBreak/>
+        <w:t xml:space="preserve">Verificación formal (sección 6.4): </w:t>
+      </w:r>
+      <w:r>
+        <w:rPr>
+          <w:rFonts w:ascii="Times New Roman" w:eastAsia="Times New Roman" w:hAnsi="Times New Roman" w:cs="Times New Roman"/>
+          <w:sz w:val="24"/>
+          <w:szCs w:val="24"/>
+        </w:rPr>
+        <w:t>además de las aserciones, se verificaron las propiedades LTL safe_update, termination y mutex para 2, 3 y 4 workers.</w:t>
       </w:r>
     </w:p>
     <w:p>
@@ -33785,92 +33789,16 @@
           <w:sz w:val="24"/>
           <w:szCs w:val="24"/>
         </w:rPr>
-        <w:t xml:space="preserve">Código: </w:t>
-      </w:r>
-      <w:r>
-        <w:rPr>
-          <w:rFonts w:ascii="Times New Roman" w:eastAsia="Times New Roman" w:hAnsi="Times New Roman" w:cs="Times New Roman"/>
-          <w:sz w:val="24"/>
-          <w:szCs w:val="24"/>
-        </w:rPr>
-        <w:t>se corrigieron los GAPs de severidad media detectados en el análisis con IA (sección 15), sin cambiar el resultado del modelo.</w:t>
-      </w:r>
-    </w:p>
-    <w:p>
-      <w:pPr>
-        <w:pStyle w:val="Ttulo1"/>
-        <w:keepNext w:val="0"/>
-        <w:keepLines w:val="0"/>
-        <w:spacing w:before="480"/>
-        <w:jc w:val="both"/>
-        <w:rPr>
-          <w:rFonts w:ascii="Times New Roman" w:eastAsia="Times New Roman" w:hAnsi="Times New Roman" w:cs="Times New Roman"/>
-          <w:b/>
-          <w:bCs/>
-          <w:sz w:val="24"/>
-          <w:szCs w:val="24"/>
-        </w:rPr>
-      </w:pPr>
-      <w:bookmarkStart w:id="51" w:name="_Toc242038996"/>
-      <w:r>
-        <w:rPr>
-          <w:rFonts w:ascii="Times New Roman" w:eastAsia="Times New Roman" w:hAnsi="Times New Roman" w:cs="Times New Roman"/>
-          <w:b/>
-          <w:bCs/>
-          <w:sz w:val="24"/>
-          <w:szCs w:val="24"/>
-        </w:rPr>
-        <w:lastRenderedPageBreak/>
-        <w:t>14. Verificación formal en SPIN</w:t>
-      </w:r>
-      <w:bookmarkEnd w:id="51"/>
-    </w:p>
-    <w:p>
-      <w:pPr>
-        <w:spacing w:after="100"/>
-        <w:jc w:val="both"/>
-        <w:rPr>
-          <w:rFonts w:ascii="Times New Roman" w:eastAsia="Times New Roman" w:hAnsi="Times New Roman" w:cs="Times New Roman"/>
-          <w:sz w:val="24"/>
-          <w:szCs w:val="24"/>
-        </w:rPr>
-      </w:pPr>
-      <w:r>
-        <w:rPr>
-          <w:rFonts w:ascii="Times New Roman" w:eastAsia="Times New Roman" w:hAnsi="Times New Roman" w:cs="Times New Roman"/>
-          <w:sz w:val="24"/>
-          <w:szCs w:val="24"/>
-        </w:rPr>
-        <w:t>El objetivo de esta sección es demostrar formalmente que la sincronización del Worker Pool está libre de deadlocks y respeta la exclusión mutua. Se utilizó el modelo promela/regression_workers.pml descrito en la sección 6, verificado con SPIN 6.5.2.</w:t>
-      </w:r>
-    </w:p>
-    <w:p>
-      <w:pPr>
-        <w:pStyle w:val="Ttulo2"/>
-        <w:keepNext w:val="0"/>
-        <w:keepLines w:val="0"/>
-        <w:spacing w:after="80"/>
-        <w:jc w:val="both"/>
-        <w:rPr>
-          <w:rFonts w:ascii="Times New Roman" w:eastAsia="Times New Roman" w:hAnsi="Times New Roman" w:cs="Times New Roman"/>
-          <w:b/>
-          <w:bCs/>
-          <w:sz w:val="24"/>
-          <w:szCs w:val="24"/>
-        </w:rPr>
-      </w:pPr>
-      <w:bookmarkStart w:id="52" w:name="_Toc242038997"/>
-      <w:r>
-        <w:rPr>
-          <w:rFonts w:ascii="Times New Roman" w:eastAsia="Times New Roman" w:hAnsi="Times New Roman" w:cs="Times New Roman"/>
-          <w:b/>
-          <w:bCs/>
-          <w:sz w:val="24"/>
-          <w:szCs w:val="24"/>
-        </w:rPr>
-        <w:t>14.1 Propiedades verificadas</w:t>
-      </w:r>
-      <w:bookmarkEnd w:id="52"/>
+        <w:t xml:space="preserve">Escalabilidad (sección 10.4): </w:t>
+      </w:r>
+      <w:r>
+        <w:rPr>
+          <w:rFonts w:ascii="Times New Roman" w:eastAsia="Times New Roman" w:hAnsi="Times New Roman" w:cs="Times New Roman"/>
+          <w:sz w:val="24"/>
+          <w:szCs w:val="24"/>
+        </w:rPr>
+        <w:t>se incorporó la métrica de Karp–Flatt para explicar por qué el speedup se estanca cerca de 4.9x.</w:t>
+      </w:r>
     </w:p>
     <w:p>
       <w:pPr>
@@ -33893,15 +33821,15 @@
           <w:sz w:val="24"/>
           <w:szCs w:val="24"/>
         </w:rPr>
-        <w:t xml:space="preserve">Ausencia de deadlock: </w:t>
-      </w:r>
-      <w:r>
-        <w:rPr>
-          <w:rFonts w:ascii="Times New Roman" w:eastAsia="Times New Roman" w:hAnsi="Times New Roman" w:cs="Times New Roman"/>
-          <w:sz w:val="24"/>
-          <w:szCs w:val="24"/>
-        </w:rPr>
-        <w:t>corrida de seguridad (gcc -DSAFETY -DNOCLAIM y ./pan). SPIN explora todos los entrelazados y reporta cualquier estado final inválido, es decir, un estado en el que un proceso quedó bloqueado.</w:t>
+        <w:t xml:space="preserve">Punto de equilibrio (sección 11.3): </w:t>
+      </w:r>
+      <w:r>
+        <w:rPr>
+          <w:rFonts w:ascii="Times New Roman" w:eastAsia="Times New Roman" w:hAnsi="Times New Roman" w:cs="Times New Roman"/>
+          <w:sz w:val="24"/>
+          <w:szCs w:val="24"/>
+        </w:rPr>
+        <w:t>se complementó la elección de 12 workers con el criterio de eficiencia, según el cual 8 workers alcanzan el 96 % del speedup máximo.</w:t>
       </w:r>
     </w:p>
     <w:p>
@@ -33925,15 +33853,15 @@
           <w:sz w:val="24"/>
           <w:szCs w:val="24"/>
         </w:rPr>
-        <w:t xml:space="preserve">Exclusión mutua: </w:t>
-      </w:r>
-      <w:r>
-        <w:rPr>
-          <w:rFonts w:ascii="Times New Roman" w:eastAsia="Times New Roman" w:hAnsi="Times New Roman" w:cs="Times New Roman"/>
-          <w:sz w:val="24"/>
-          <w:szCs w:val="24"/>
-        </w:rPr>
-        <w:t>propiedad LTL mutex, [] (in_update &lt;= 1): a lo sumo un proceso actualiza los pesos a la vez, lo que justifica no usar sync.Mutex en Go.</w:t>
+        <w:t xml:space="preserve">Formato: </w:t>
+      </w:r>
+      <w:r>
+        <w:rPr>
+          <w:rFonts w:ascii="Times New Roman" w:eastAsia="Times New Roman" w:hAnsi="Times New Roman" w:cs="Times New Roman"/>
+          <w:sz w:val="24"/>
+          <w:szCs w:val="24"/>
+        </w:rPr>
+        <w:t>se corrigió el código de alumno de la carátula y se regeneró el índice.</w:t>
       </w:r>
     </w:p>
     <w:p>
@@ -33957,16 +33885,89 @@
           <w:sz w:val="24"/>
           <w:szCs w:val="24"/>
         </w:rPr>
-        <w:t xml:space="preserve">Actualización segura: </w:t>
-      </w:r>
-      <w:r>
-        <w:rPr>
-          <w:rFonts w:ascii="Times New Roman" w:eastAsia="Times New Roman" w:hAnsi="Times New Roman" w:cs="Times New Roman"/>
-          <w:sz w:val="24"/>
-          <w:szCs w:val="24"/>
-        </w:rPr>
-        <w:t>propiedad LTL safe_update, [] (updating -&gt; result_count == NUM_JOBS): los pesos solo se actualizan después de recibir todos los resultados, como garantiza wg.Wait() en Go.</w:t>
-      </w:r>
+        <w:t xml:space="preserve">Código: </w:t>
+      </w:r>
+      <w:r>
+        <w:rPr>
+          <w:rFonts w:ascii="Times New Roman" w:eastAsia="Times New Roman" w:hAnsi="Times New Roman" w:cs="Times New Roman"/>
+          <w:sz w:val="24"/>
+          <w:szCs w:val="24"/>
+        </w:rPr>
+        <w:t>se corrigieron los GAPs de severidad media detectados en el análisis con IA (sección 15), sin cambiar el resultado del modelo.</w:t>
+      </w:r>
+    </w:p>
+    <w:p>
+      <w:pPr>
+        <w:pStyle w:val="Ttulo1"/>
+        <w:keepLines w:val="0"/>
+        <w:spacing w:before="480"/>
+        <w:jc w:val="both"/>
+        <w:rPr>
+          <w:rFonts w:ascii="Times New Roman" w:eastAsia="Times New Roman" w:hAnsi="Times New Roman" w:cs="Times New Roman"/>
+          <w:b/>
+          <w:bCs/>
+          <w:sz w:val="24"/>
+          <w:szCs w:val="24"/>
+        </w:rPr>
+      </w:pPr>
+      <w:bookmarkStart w:id="51" w:name="_Toc242049404"/>
+      <w:r>
+        <w:rPr>
+          <w:rFonts w:ascii="Times New Roman" w:eastAsia="Times New Roman" w:hAnsi="Times New Roman" w:cs="Times New Roman"/>
+          <w:b/>
+          <w:bCs/>
+          <w:sz w:val="24"/>
+          <w:szCs w:val="24"/>
+        </w:rPr>
+        <w:t>14. Verificación formal en SPIN</w:t>
+      </w:r>
+      <w:bookmarkEnd w:id="51"/>
+    </w:p>
+    <w:p>
+      <w:pPr>
+        <w:spacing w:after="100"/>
+        <w:jc w:val="both"/>
+        <w:rPr>
+          <w:rFonts w:ascii="Times New Roman" w:eastAsia="Times New Roman" w:hAnsi="Times New Roman" w:cs="Times New Roman"/>
+          <w:sz w:val="24"/>
+          <w:szCs w:val="24"/>
+        </w:rPr>
+      </w:pPr>
+      <w:r>
+        <w:rPr>
+          <w:rFonts w:ascii="Times New Roman" w:eastAsia="Times New Roman" w:hAnsi="Times New Roman" w:cs="Times New Roman"/>
+          <w:sz w:val="24"/>
+          <w:szCs w:val="24"/>
+        </w:rPr>
+        <w:t>El objetivo de esta sección es demostrar formalmente que la sincronización del Worker Pool está libre de deadlocks y respeta la exclusión mutua. Se utilizó el modelo promela/regression_workers.pml descrito en la sección 6, verificado con SPIN 6.5.2 (Holzmann, 2003).</w:t>
+      </w:r>
+    </w:p>
+    <w:p>
+      <w:pPr>
+        <w:pStyle w:val="Ttulo2"/>
+        <w:keepLines w:val="0"/>
+        <w:spacing w:after="80"/>
+        <w:jc w:val="both"/>
+        <w:rPr>
+          <w:rFonts w:ascii="Times New Roman" w:eastAsia="Times New Roman" w:hAnsi="Times New Roman" w:cs="Times New Roman"/>
+          <w:b/>
+          <w:bCs/>
+          <w:sz w:val="24"/>
+          <w:szCs w:val="24"/>
+        </w:rPr>
+      </w:pPr>
+      <w:bookmarkStart w:id="52" w:name="_Toc242049405"/>
+      <w:r>
+        <w:rPr>
+          <w:rFonts w:ascii="Times New Roman" w:eastAsia="Times New Roman" w:hAnsi="Times New Roman" w:cs="Times New Roman"/>
+          <w:b/>
+          <w:bCs/>
+          <w:sz w:val="24"/>
+          <w:szCs w:val="24"/>
+        </w:rPr>
+        <w:t>14.1 Propiedades verificadas</w:t>
+      </w:r>
+      <w:bookmarkEnd w:id="52"/>
     </w:p>
     <w:p>
       <w:pPr>
@@ -33989,6 +33990,102 @@
           <w:sz w:val="24"/>
           <w:szCs w:val="24"/>
         </w:rPr>
+        <w:t xml:space="preserve">Ausencia de deadlock: </w:t>
+      </w:r>
+      <w:r>
+        <w:rPr>
+          <w:rFonts w:ascii="Times New Roman" w:eastAsia="Times New Roman" w:hAnsi="Times New Roman" w:cs="Times New Roman"/>
+          <w:sz w:val="24"/>
+          <w:szCs w:val="24"/>
+        </w:rPr>
+        <w:t>corrida de seguridad (gcc -DSAFETY -DNOCLAIM y ./pan). SPIN explora todos los entrelazados y reporta cualquier estado final inválido, es decir, un estado en el que un proceso quedó bloqueado.</w:t>
+      </w:r>
+    </w:p>
+    <w:p>
+      <w:pPr>
+        <w:numPr>
+          <w:ilvl w:val="0"/>
+          <w:numId w:val="1"/>
+        </w:numPr>
+        <w:jc w:val="both"/>
+        <w:rPr>
+          <w:rFonts w:ascii="Times New Roman" w:eastAsia="Times New Roman" w:hAnsi="Times New Roman" w:cs="Times New Roman"/>
+          <w:sz w:val="24"/>
+          <w:szCs w:val="24"/>
+        </w:rPr>
+      </w:pPr>
+      <w:r>
+        <w:rPr>
+          <w:rFonts w:ascii="Times New Roman" w:eastAsia="Times New Roman" w:hAnsi="Times New Roman" w:cs="Times New Roman"/>
+          <w:b/>
+          <w:bCs/>
+          <w:sz w:val="24"/>
+          <w:szCs w:val="24"/>
+        </w:rPr>
+        <w:t xml:space="preserve">Exclusión mutua: </w:t>
+      </w:r>
+      <w:r>
+        <w:rPr>
+          <w:rFonts w:ascii="Times New Roman" w:eastAsia="Times New Roman" w:hAnsi="Times New Roman" w:cs="Times New Roman"/>
+          <w:sz w:val="24"/>
+          <w:szCs w:val="24"/>
+        </w:rPr>
+        <w:t>propiedad LTL mutex, [] (in_update &lt;= 1): a lo sumo un proceso actualiza los pesos a la vez, lo que justifica no usar sync.Mutex en Go.</w:t>
+      </w:r>
+    </w:p>
+    <w:p>
+      <w:pPr>
+        <w:numPr>
+          <w:ilvl w:val="0"/>
+          <w:numId w:val="1"/>
+        </w:numPr>
+        <w:jc w:val="both"/>
+        <w:rPr>
+          <w:rFonts w:ascii="Times New Roman" w:eastAsia="Times New Roman" w:hAnsi="Times New Roman" w:cs="Times New Roman"/>
+          <w:sz w:val="24"/>
+          <w:szCs w:val="24"/>
+        </w:rPr>
+      </w:pPr>
+      <w:r>
+        <w:rPr>
+          <w:rFonts w:ascii="Times New Roman" w:eastAsia="Times New Roman" w:hAnsi="Times New Roman" w:cs="Times New Roman"/>
+          <w:b/>
+          <w:bCs/>
+          <w:sz w:val="24"/>
+          <w:szCs w:val="24"/>
+        </w:rPr>
+        <w:t xml:space="preserve">Actualización segura: </w:t>
+      </w:r>
+      <w:r>
+        <w:rPr>
+          <w:rFonts w:ascii="Times New Roman" w:eastAsia="Times New Roman" w:hAnsi="Times New Roman" w:cs="Times New Roman"/>
+          <w:sz w:val="24"/>
+          <w:szCs w:val="24"/>
+        </w:rPr>
+        <w:t>propiedad LTL safe_update, [] (updating -&gt; result_count == NUM_JOBS): los pesos solo se actualizan después de recibir todos los resultados, como garantiza wg.Wait() en Go.</w:t>
+      </w:r>
+    </w:p>
+    <w:p>
+      <w:pPr>
+        <w:numPr>
+          <w:ilvl w:val="0"/>
+          <w:numId w:val="1"/>
+        </w:numPr>
+        <w:jc w:val="both"/>
+        <w:rPr>
+          <w:rFonts w:ascii="Times New Roman" w:eastAsia="Times New Roman" w:hAnsi="Times New Roman" w:cs="Times New Roman"/>
+          <w:sz w:val="24"/>
+          <w:szCs w:val="24"/>
+        </w:rPr>
+      </w:pPr>
+      <w:r>
+        <w:rPr>
+          <w:rFonts w:ascii="Times New Roman" w:eastAsia="Times New Roman" w:hAnsi="Times New Roman" w:cs="Times New Roman"/>
+          <w:b/>
+          <w:bCs/>
+          <w:sz w:val="24"/>
+          <w:szCs w:val="24"/>
+        </w:rPr>
         <w:t xml:space="preserve">Terminación: </w:t>
       </w:r>
       <w:r>
@@ -34003,7 +34100,6 @@
     <w:p>
       <w:pPr>
         <w:pStyle w:val="Ttulo2"/>
-        <w:keepNext w:val="0"/>
         <w:keepLines w:val="0"/>
         <w:spacing w:after="80"/>
         <w:jc w:val="both"/>
@@ -34015,7 +34111,7 @@
           <w:szCs w:val="24"/>
         </w:rPr>
       </w:pPr>
-      <w:bookmarkStart w:id="53" w:name="_Toc242038998"/>
+      <w:bookmarkStart w:id="53" w:name="_Toc242049406"/>
       <w:r>
         <w:rPr>
           <w:rFonts w:ascii="Times New Roman" w:eastAsia="Times New Roman" w:hAnsi="Times New Roman" w:cs="Times New Roman"/>
@@ -34898,7 +34994,6 @@
     <w:p>
       <w:pPr>
         <w:pStyle w:val="Ttulo2"/>
-        <w:keepNext w:val="0"/>
         <w:keepLines w:val="0"/>
         <w:spacing w:after="80"/>
         <w:jc w:val="both"/>
@@ -34910,7 +35005,7 @@
           <w:szCs w:val="24"/>
         </w:rPr>
       </w:pPr>
-      <w:bookmarkStart w:id="54" w:name="_Toc242038999"/>
+      <w:bookmarkStart w:id="54" w:name="_Toc242049407"/>
       <w:r>
         <w:rPr>
           <w:rFonts w:ascii="Times New Roman" w:eastAsia="Times New Roman" w:hAnsi="Times New Roman" w:cs="Times New Roman"/>
@@ -35579,7 +35674,6 @@
     <w:p>
       <w:pPr>
         <w:pStyle w:val="Ttulo1"/>
-        <w:keepNext w:val="0"/>
         <w:keepLines w:val="0"/>
         <w:spacing w:before="480"/>
         <w:jc w:val="both"/>
@@ -35591,7 +35685,7 @@
           <w:szCs w:val="24"/>
         </w:rPr>
       </w:pPr>
-      <w:bookmarkStart w:id="55" w:name="_Toc242039000"/>
+      <w:bookmarkStart w:id="55" w:name="_Toc242049408"/>
       <w:r>
         <w:rPr>
           <w:rFonts w:ascii="Times New Roman" w:eastAsia="Times New Roman" w:hAnsi="Times New Roman" w:cs="Times New Roman"/>
@@ -35607,7 +35701,6 @@
     <w:p>
       <w:pPr>
         <w:pStyle w:val="Ttulo2"/>
-        <w:keepNext w:val="0"/>
         <w:keepLines w:val="0"/>
         <w:spacing w:after="80"/>
         <w:jc w:val="both"/>
@@ -35619,7 +35712,7 @@
           <w:szCs w:val="24"/>
         </w:rPr>
       </w:pPr>
-      <w:bookmarkStart w:id="56" w:name="_Toc242039001"/>
+      <w:bookmarkStart w:id="56" w:name="_Toc242049409"/>
       <w:r>
         <w:rPr>
           <w:rFonts w:ascii="Times New Roman" w:eastAsia="Times New Roman" w:hAnsi="Times New Roman" w:cs="Times New Roman"/>
@@ -35681,7 +35774,6 @@
     <w:p>
       <w:pPr>
         <w:pStyle w:val="Ttulo2"/>
-        <w:keepNext w:val="0"/>
         <w:keepLines w:val="0"/>
         <w:spacing w:after="80"/>
         <w:jc w:val="both"/>
@@ -35693,7 +35785,7 @@
           <w:szCs w:val="24"/>
         </w:rPr>
       </w:pPr>
-      <w:bookmarkStart w:id="57" w:name="_Toc242039002"/>
+      <w:bookmarkStart w:id="57" w:name="_Toc242049410"/>
       <w:r>
         <w:rPr>
           <w:rFonts w:ascii="Times New Roman" w:eastAsia="Times New Roman" w:hAnsi="Times New Roman" w:cs="Times New Roman"/>
@@ -36908,7 +37000,7 @@
                 <w:sz w:val="24"/>
                 <w:szCs w:val="24"/>
               </w:rPr>
-              <w:t>Formato con gofmt y ausencia de integración continua</w:t>
+              <w:t>Ausencia de integración continua (gofmt y typo ya corregidos)</w:t>
             </w:r>
           </w:p>
         </w:tc>
@@ -37161,7 +37253,6 @@
     <w:p>
       <w:pPr>
         <w:pStyle w:val="Ttulo2"/>
-        <w:keepNext w:val="0"/>
         <w:keepLines w:val="0"/>
         <w:spacing w:after="80"/>
         <w:jc w:val="both"/>
@@ -37173,7 +37264,7 @@
           <w:szCs w:val="24"/>
         </w:rPr>
       </w:pPr>
-      <w:bookmarkStart w:id="58" w:name="_Toc242039003"/>
+      <w:bookmarkStart w:id="58" w:name="_Toc242049411"/>
       <w:r>
         <w:rPr>
           <w:rFonts w:ascii="Times New Roman" w:eastAsia="Times New Roman" w:hAnsi="Times New Roman" w:cs="Times New Roman"/>
@@ -37290,7 +37381,6 @@
     <w:p>
       <w:pPr>
         <w:pStyle w:val="Ttulo1"/>
-        <w:keepNext w:val="0"/>
         <w:keepLines w:val="0"/>
         <w:spacing w:before="480"/>
         <w:jc w:val="both"/>
@@ -37302,7 +37392,7 @@
           <w:szCs w:val="24"/>
         </w:rPr>
       </w:pPr>
-      <w:bookmarkStart w:id="59" w:name="_Toc242039004"/>
+      <w:bookmarkStart w:id="59" w:name="_Toc242049412"/>
       <w:r>
         <w:rPr>
           <w:rFonts w:ascii="Times New Roman" w:eastAsia="Times New Roman" w:hAnsi="Times New Roman" w:cs="Times New Roman"/>
@@ -37318,7 +37408,6 @@
     <w:p>
       <w:pPr>
         <w:pStyle w:val="Ttulo2"/>
-        <w:keepNext w:val="0"/>
         <w:keepLines w:val="0"/>
         <w:spacing w:after="80"/>
         <w:jc w:val="both"/>
@@ -37330,7 +37419,7 @@
           <w:szCs w:val="24"/>
         </w:rPr>
       </w:pPr>
-      <w:bookmarkStart w:id="60" w:name="_Toc242039005"/>
+      <w:bookmarkStart w:id="60" w:name="_Toc242049413"/>
       <w:r>
         <w:rPr>
           <w:rFonts w:ascii="Times New Roman" w:eastAsia="Times New Roman" w:hAnsi="Times New Roman" w:cs="Times New Roman"/>
@@ -37506,7 +37595,6 @@
     <w:p>
       <w:pPr>
         <w:pStyle w:val="Ttulo2"/>
-        <w:keepNext w:val="0"/>
         <w:keepLines w:val="0"/>
         <w:spacing w:after="80"/>
         <w:jc w:val="both"/>
@@ -37518,7 +37606,7 @@
           <w:szCs w:val="24"/>
         </w:rPr>
       </w:pPr>
-      <w:bookmarkStart w:id="61" w:name="_Toc242039006"/>
+      <w:bookmarkStart w:id="61" w:name="_Toc242049414"/>
       <w:r>
         <w:rPr>
           <w:rFonts w:ascii="Times New Roman" w:eastAsia="Times New Roman" w:hAnsi="Times New Roman" w:cs="Times New Roman"/>
@@ -37694,7 +37782,6 @@
     <w:p>
       <w:pPr>
         <w:pStyle w:val="Ttulo2"/>
-        <w:keepNext w:val="0"/>
         <w:keepLines w:val="0"/>
         <w:spacing w:after="80"/>
         <w:jc w:val="both"/>
@@ -37706,7 +37793,7 @@
           <w:szCs w:val="24"/>
         </w:rPr>
       </w:pPr>
-      <w:bookmarkStart w:id="62" w:name="_Toc242039007"/>
+      <w:bookmarkStart w:id="62" w:name="_Toc242049415"/>
       <w:r>
         <w:rPr>
           <w:rFonts w:ascii="Times New Roman" w:eastAsia="Times New Roman" w:hAnsi="Times New Roman" w:cs="Times New Roman"/>
@@ -37742,7 +37829,6 @@
     <w:p>
       <w:pPr>
         <w:pStyle w:val="Ttulo1"/>
-        <w:keepNext w:val="0"/>
         <w:keepLines w:val="0"/>
         <w:spacing w:before="480"/>
         <w:jc w:val="both"/>
@@ -37754,7 +37840,7 @@
           <w:szCs w:val="24"/>
         </w:rPr>
       </w:pPr>
-      <w:bookmarkStart w:id="63" w:name="_Toc242039008"/>
+      <w:bookmarkStart w:id="63" w:name="_Toc242049416"/>
       <w:r>
         <w:rPr>
           <w:rFonts w:ascii="Times New Roman" w:eastAsia="Times New Roman" w:hAnsi="Times New Roman" w:cs="Times New Roman"/>
@@ -37898,7 +37984,6 @@
     <w:p>
       <w:pPr>
         <w:pStyle w:val="Ttulo1"/>
-        <w:keepNext w:val="0"/>
         <w:keepLines w:val="0"/>
         <w:spacing w:before="480"/>
         <w:jc w:val="both"/>
@@ -37908,7 +37993,7 @@
           <w:szCs w:val="24"/>
         </w:rPr>
       </w:pPr>
-      <w:bookmarkStart w:id="64" w:name="_Toc242039009"/>
+      <w:bookmarkStart w:id="64" w:name="_Toc242049417"/>
       <w:r>
         <w:rPr>
           <w:rFonts w:ascii="Times New Roman" w:eastAsia="Times New Roman" w:hAnsi="Times New Roman" w:cs="Times New Roman"/>
@@ -37924,22 +38009,97 @@
     <w:p>
       <w:pPr>
         <w:spacing w:after="160"/>
-        <w:jc w:val="both"/>
-        <w:rPr>
-          <w:rFonts w:ascii="Times New Roman" w:eastAsia="Times New Roman" w:hAnsi="Times New Roman" w:cs="Times New Roman"/>
-          <w:sz w:val="24"/>
-          <w:szCs w:val="24"/>
-        </w:rPr>
-      </w:pPr>
-      <w:r>
-        <w:rPr>
-          <w:rFonts w:ascii="Times New Roman" w:eastAsia="Times New Roman" w:hAnsi="Times New Roman" w:cs="Times New Roman"/>
-          <w:sz w:val="24"/>
-          <w:szCs w:val="24"/>
-        </w:rPr>
-        <w:t xml:space="preserve">Hellkvist, M., Özçelikkale, A., &amp; Ahlén, A. (2021). Linear regression with distributed learning: A generalization error perspective. IEEE Transactions on Signal Processing, 69, 5479–5495. </w:t>
+        <w:ind w:left="720" w:hanging="720"/>
+        <w:jc w:val="left"/>
+        <w:rPr>
+          <w:rFonts w:ascii="Times New Roman" w:eastAsia="Times New Roman" w:hAnsi="Times New Roman" w:cs="Times New Roman"/>
+          <w:sz w:val="24"/>
+          <w:szCs w:val="24"/>
+        </w:rPr>
+      </w:pPr>
+      <w:r>
+        <w:rPr>
+          <w:rFonts w:ascii="Times New Roman" w:eastAsia="Times New Roman" w:hAnsi="Times New Roman" w:cs="Times New Roman"/>
+          <w:sz w:val="24"/>
+          <w:szCs w:val="24"/>
+        </w:rPr>
+        <w:t xml:space="preserve">Bäckström, K., Walulya, I., Papatriantafilou, M., &amp; Tsigas, P. (2021). Consistent lock-free parallel stochastic gradient descent for fast and stable convergence. En </w:t>
+      </w:r>
+      <w:r>
+        <w:rPr>
+          <w:rFonts w:ascii="Times New Roman" w:eastAsia="Times New Roman" w:hAnsi="Times New Roman" w:cs="Times New Roman"/>
+          <w:i/>
+          <w:sz w:val="24"/>
+          <w:szCs w:val="24"/>
+        </w:rPr>
+        <w:t>2021 IEEE International Parallel and Distributed Processing Symposium (IPDPS)</w:t>
+      </w:r>
+      <w:r>
+        <w:rPr>
+          <w:rFonts w:ascii="Times New Roman" w:eastAsia="Times New Roman" w:hAnsi="Times New Roman" w:cs="Times New Roman"/>
+          <w:sz w:val="24"/>
+          <w:szCs w:val="24"/>
+        </w:rPr>
+        <w:t xml:space="preserve"> (pp. 423–432). IEEE. </w:t>
       </w:r>
       <w:hyperlink r:id="rId34">
+        <w:r>
+          <w:rPr>
+            <w:rFonts w:ascii="Times New Roman" w:eastAsia="Times New Roman" w:hAnsi="Times New Roman" w:cs="Times New Roman"/>
+            <w:color w:val="1155CC"/>
+            <w:sz w:val="24"/>
+            <w:szCs w:val="24"/>
+            <w:u w:val="single"/>
+          </w:rPr>
+          <w:t>https://ieeexplore.ieee.org/document/9460457</w:t>
+        </w:r>
+      </w:hyperlink>
+      <w:r>
+        <w:rPr>
+          <w:rFonts w:ascii="Times New Roman" w:eastAsia="Times New Roman" w:hAnsi="Times New Roman" w:cs="Times New Roman"/>
+          <w:sz w:val="24"/>
+          <w:szCs w:val="24"/>
+        </w:rPr>
+        <w:t xml:space="preserve"> </w:t>
+      </w:r>
+    </w:p>
+    <w:p>
+      <w:pPr>
+        <w:spacing w:after="160"/>
+        <w:ind w:left="720" w:hanging="720"/>
+        <w:jc w:val="left"/>
+        <w:rPr>
+          <w:rFonts w:ascii="Times New Roman" w:eastAsia="Times New Roman" w:hAnsi="Times New Roman" w:cs="Times New Roman"/>
+          <w:sz w:val="24"/>
+          <w:szCs w:val="24"/>
+        </w:rPr>
+      </w:pPr>
+      <w:r>
+        <w:rPr>
+          <w:rFonts w:ascii="Times New Roman" w:eastAsia="Times New Roman" w:hAnsi="Times New Roman" w:cs="Times New Roman"/>
+          <w:sz w:val="24"/>
+          <w:szCs w:val="24"/>
+        </w:rPr>
+        <w:t xml:space="preserve">Hellkvist, M., Özçelikkale, A., &amp; Ahlén, A. (2021). Linear regression with distributed learning: A generalization error perspective. </w:t>
+      </w:r>
+      <w:r>
+        <w:rPr>
+          <w:rFonts w:ascii="Times New Roman" w:eastAsia="Times New Roman" w:hAnsi="Times New Roman" w:cs="Times New Roman"/>
+          <w:i/>
+          <w:sz w:val="24"/>
+          <w:szCs w:val="24"/>
+        </w:rPr>
+        <w:t>IEEE Transactions on Signal Processing, 69</w:t>
+      </w:r>
+      <w:r>
+        <w:rPr>
+          <w:rFonts w:ascii="Times New Roman" w:eastAsia="Times New Roman" w:hAnsi="Times New Roman" w:cs="Times New Roman"/>
+          <w:sz w:val="24"/>
+          <w:szCs w:val="24"/>
+        </w:rPr>
+        <w:t xml:space="preserve">, 5479–5495. </w:t>
+      </w:r>
+      <w:hyperlink r:id="rId35">
         <w:r>
           <w:rPr>
             <w:rFonts w:ascii="Times New Roman" w:eastAsia="Times New Roman" w:hAnsi="Times New Roman" w:cs="Times New Roman"/>
@@ -37962,21 +38122,22 @@
     </w:p>
     <w:p>
       <w:pPr>
-        <w:spacing w:after="160"/>
-        <w:jc w:val="both"/>
-        <w:rPr>
-          <w:rFonts w:ascii="Times New Roman" w:eastAsia="Times New Roman" w:hAnsi="Times New Roman" w:cs="Times New Roman"/>
-          <w:sz w:val="24"/>
-          <w:szCs w:val="24"/>
-        </w:rPr>
-      </w:pPr>
-      <w:r>
-        <w:rPr>
-          <w:rFonts w:ascii="Times New Roman" w:eastAsia="Times New Roman" w:hAnsi="Times New Roman" w:cs="Times New Roman"/>
-          <w:sz w:val="24"/>
-          <w:szCs w:val="24"/>
-        </w:rPr>
-        <w:t xml:space="preserve">Schüle, M. E., Lang, H., Springer, M., Kemper, A., Neumann, T., &amp; Günnemann, S. (2022). Recursive SQL and GPU-support for in-database machine learning. </w:t>
+        <w:spacing w:after="100"/>
+        <w:ind w:left="720" w:hanging="720"/>
+        <w:jc w:val="left"/>
+        <w:rPr>
+          <w:rFonts w:ascii="Times New Roman" w:eastAsia="Times New Roman" w:hAnsi="Times New Roman" w:cs="Times New Roman"/>
+          <w:sz w:val="24"/>
+          <w:szCs w:val="24"/>
+        </w:rPr>
+      </w:pPr>
+      <w:r>
+        <w:rPr>
+          <w:rFonts w:ascii="Times New Roman" w:eastAsia="Times New Roman" w:hAnsi="Times New Roman" w:cs="Times New Roman"/>
+          <w:sz w:val="24"/>
+          <w:szCs w:val="24"/>
+        </w:rPr>
+        <w:t xml:space="preserve">Holzmann, G. J. (2003). </w:t>
       </w:r>
       <w:r>
         <w:rPr>
@@ -37986,6 +38147,188 @@
           <w:sz w:val="24"/>
           <w:szCs w:val="24"/>
         </w:rPr>
+        <w:t>The SPIN model checker: Primer and reference manual</w:t>
+      </w:r>
+      <w:r>
+        <w:rPr>
+          <w:rFonts w:ascii="Times New Roman" w:eastAsia="Times New Roman" w:hAnsi="Times New Roman" w:cs="Times New Roman"/>
+          <w:sz w:val="24"/>
+          <w:szCs w:val="24"/>
+        </w:rPr>
+        <w:t>. Addison-Wesley.</w:t>
+      </w:r>
+    </w:p>
+    <w:p>
+      <w:pPr>
+        <w:spacing w:after="160"/>
+        <w:ind w:left="720" w:hanging="720"/>
+        <w:jc w:val="left"/>
+        <w:rPr>
+          <w:rFonts w:ascii="Times New Roman" w:eastAsia="Times New Roman" w:hAnsi="Times New Roman" w:cs="Times New Roman"/>
+          <w:sz w:val="24"/>
+          <w:szCs w:val="24"/>
+        </w:rPr>
+      </w:pPr>
+      <w:r>
+        <w:rPr>
+          <w:rFonts w:ascii="Times New Roman" w:eastAsia="Times New Roman" w:hAnsi="Times New Roman" w:cs="Times New Roman"/>
+          <w:sz w:val="24"/>
+          <w:szCs w:val="24"/>
+        </w:rPr>
+        <w:t xml:space="preserve">Jain, R., Singh, M., Rao, A. R., &amp; Garg, R. (2024). Predicting hospital length of stay using machine learning on a large open health dataset. </w:t>
+      </w:r>
+      <w:r>
+        <w:rPr>
+          <w:rFonts w:ascii="Times New Roman" w:eastAsia="Times New Roman" w:hAnsi="Times New Roman" w:cs="Times New Roman"/>
+          <w:i/>
+          <w:sz w:val="24"/>
+          <w:szCs w:val="24"/>
+        </w:rPr>
+        <w:t>BMC Health Services Research, 24</w:t>
+      </w:r>
+      <w:r>
+        <w:rPr>
+          <w:rFonts w:ascii="Times New Roman" w:eastAsia="Times New Roman" w:hAnsi="Times New Roman" w:cs="Times New Roman"/>
+          <w:sz w:val="24"/>
+          <w:szCs w:val="24"/>
+        </w:rPr>
+        <w:t xml:space="preserve">, 860. </w:t>
+      </w:r>
+      <w:hyperlink r:id="rId36">
+        <w:r>
+          <w:rPr>
+            <w:rFonts w:ascii="Times New Roman" w:eastAsia="Times New Roman" w:hAnsi="Times New Roman" w:cs="Times New Roman"/>
+            <w:color w:val="1155CC"/>
+            <w:sz w:val="24"/>
+            <w:szCs w:val="24"/>
+            <w:u w:val="single"/>
+          </w:rPr>
+          <w:t>https://link.springer.com/article/10.1186/s12913-024-11238-y</w:t>
+        </w:r>
+      </w:hyperlink>
+      <w:r>
+        <w:rPr>
+          <w:rFonts w:ascii="Times New Roman" w:eastAsia="Times New Roman" w:hAnsi="Times New Roman" w:cs="Times New Roman"/>
+          <w:sz w:val="24"/>
+          <w:szCs w:val="24"/>
+        </w:rPr>
+        <w:t xml:space="preserve"> </w:t>
+      </w:r>
+    </w:p>
+    <w:p>
+      <w:pPr>
+        <w:spacing w:after="100"/>
+        <w:ind w:left="720" w:hanging="720"/>
+        <w:jc w:val="left"/>
+        <w:rPr>
+          <w:rFonts w:ascii="Times New Roman" w:eastAsia="Times New Roman" w:hAnsi="Times New Roman" w:cs="Times New Roman"/>
+          <w:sz w:val="24"/>
+          <w:szCs w:val="24"/>
+        </w:rPr>
+      </w:pPr>
+      <w:r>
+        <w:rPr>
+          <w:rFonts w:ascii="Times New Roman" w:eastAsia="Times New Roman" w:hAnsi="Times New Roman" w:cs="Times New Roman"/>
+          <w:sz w:val="24"/>
+          <w:szCs w:val="24"/>
+        </w:rPr>
+        <w:t xml:space="preserve">Karp, A. H., &amp; Flatt, H. P. (1990). Measuring parallel processor performance. </w:t>
+      </w:r>
+      <w:r>
+        <w:rPr>
+          <w:rFonts w:ascii="Times New Roman" w:eastAsia="Times New Roman" w:hAnsi="Times New Roman" w:cs="Times New Roman"/>
+          <w:i/>
+          <w:iCs/>
+          <w:sz w:val="24"/>
+          <w:szCs w:val="24"/>
+        </w:rPr>
+        <w:t>Communications of the ACM, 33</w:t>
+      </w:r>
+      <w:r>
+        <w:rPr>
+          <w:rFonts w:ascii="Times New Roman" w:eastAsia="Times New Roman" w:hAnsi="Times New Roman" w:cs="Times New Roman"/>
+          <w:sz w:val="24"/>
+          <w:szCs w:val="24"/>
+        </w:rPr>
+        <w:t>(5), 539–543. https://doi.org/10.1145/78607.78614</w:t>
+      </w:r>
+    </w:p>
+    <w:p>
+      <w:pPr>
+        <w:spacing w:after="160"/>
+        <w:ind w:left="720" w:hanging="720"/>
+        <w:jc w:val="left"/>
+        <w:rPr>
+          <w:rFonts w:ascii="Times New Roman" w:eastAsia="Times New Roman" w:hAnsi="Times New Roman" w:cs="Times New Roman"/>
+          <w:sz w:val="24"/>
+          <w:szCs w:val="24"/>
+        </w:rPr>
+      </w:pPr>
+      <w:r>
+        <w:rPr>
+          <w:rFonts w:ascii="Times New Roman" w:eastAsia="Times New Roman" w:hAnsi="Times New Roman" w:cs="Times New Roman"/>
+          <w:sz w:val="24"/>
+          <w:szCs w:val="24"/>
+        </w:rPr>
+        <w:t xml:space="preserve">New York State Department of Health. (2024). </w:t>
+      </w:r>
+      <w:r>
+        <w:rPr>
+          <w:rFonts w:ascii="Times New Roman" w:eastAsia="Times New Roman" w:hAnsi="Times New Roman" w:cs="Times New Roman"/>
+          <w:i/>
+          <w:sz w:val="24"/>
+          <w:szCs w:val="24"/>
+        </w:rPr>
+        <w:t>Hospital inpatient discharges (SPARCS De-Identified): 2022</w:t>
+      </w:r>
+      <w:r>
+        <w:rPr>
+          <w:rFonts w:ascii="Times New Roman" w:eastAsia="Times New Roman" w:hAnsi="Times New Roman" w:cs="Times New Roman"/>
+          <w:sz w:val="24"/>
+          <w:szCs w:val="24"/>
+        </w:rPr>
+        <w:t xml:space="preserve"> [Data set]. Health Data NY. </w:t>
+      </w:r>
+      <w:hyperlink r:id="rId37">
+        <w:r>
+          <w:rPr>
+            <w:rFonts w:ascii="Times New Roman" w:eastAsia="Times New Roman" w:hAnsi="Times New Roman" w:cs="Times New Roman"/>
+            <w:color w:val="1155CC"/>
+            <w:sz w:val="24"/>
+            <w:szCs w:val="24"/>
+            <w:u w:val="single"/>
+          </w:rPr>
+          <w:t>https://health.data.ny.gov/Health/Hospital-Inpatient-Discharges-SPARCS-De-Identified/5dtw-tffi/about_data</w:t>
+        </w:r>
+      </w:hyperlink>
+    </w:p>
+    <w:p>
+      <w:pPr>
+        <w:spacing w:after="160"/>
+        <w:ind w:left="720" w:hanging="720"/>
+        <w:jc w:val="left"/>
+        <w:rPr>
+          <w:rFonts w:ascii="Times New Roman" w:eastAsia="Times New Roman" w:hAnsi="Times New Roman" w:cs="Times New Roman"/>
+          <w:sz w:val="24"/>
+          <w:szCs w:val="24"/>
+        </w:rPr>
+      </w:pPr>
+      <w:r>
+        <w:rPr>
+          <w:rFonts w:ascii="Times New Roman" w:eastAsia="Times New Roman" w:hAnsi="Times New Roman" w:cs="Times New Roman"/>
+          <w:sz w:val="24"/>
+          <w:szCs w:val="24"/>
+        </w:rPr>
+        <w:t xml:space="preserve">Schüle, M. E., Lang, H., Springer, M., Kemper, A., Neumann, T., &amp; Günnemann, S. (2022). Recursive SQL and GPU-support for in-database machine learning. </w:t>
+      </w:r>
+      <w:r>
+        <w:rPr>
+          <w:rFonts w:ascii="Times New Roman" w:eastAsia="Times New Roman" w:hAnsi="Times New Roman" w:cs="Times New Roman"/>
+          <w:i/>
+          <w:iCs/>
+          <w:sz w:val="24"/>
+          <w:szCs w:val="24"/>
+        </w:rPr>
         <w:t>Distributed and Parallel Databases, 40(2–3)</w:t>
       </w:r>
       <w:r>
@@ -37996,7 +38339,7 @@
         </w:rPr>
         <w:t xml:space="preserve">, 205–259. </w:t>
       </w:r>
-      <w:hyperlink r:id="rId35">
+      <w:hyperlink r:id="rId38">
         <w:r>
           <w:rPr>
             <w:rFonts w:ascii="Times New Roman" w:eastAsia="Times New Roman" w:hAnsi="Times New Roman" w:cs="Times New Roman"/>
@@ -38008,164 +38351,6 @@
           <w:t>https://link.springer.com/article/10.1007/s10619-022-07417-7</w:t>
         </w:r>
       </w:hyperlink>
-    </w:p>
-    <w:p>
-      <w:pPr>
-        <w:spacing w:after="160"/>
-        <w:jc w:val="both"/>
-        <w:rPr>
-          <w:rFonts w:ascii="Times New Roman" w:eastAsia="Times New Roman" w:hAnsi="Times New Roman" w:cs="Times New Roman"/>
-          <w:sz w:val="24"/>
-          <w:szCs w:val="24"/>
-        </w:rPr>
-      </w:pPr>
-      <w:r>
-        <w:rPr>
-          <w:rFonts w:ascii="Times New Roman" w:eastAsia="Times New Roman" w:hAnsi="Times New Roman" w:cs="Times New Roman"/>
-          <w:sz w:val="24"/>
-          <w:szCs w:val="24"/>
-        </w:rPr>
-        <w:t xml:space="preserve">Bäckström, K., Walulya, I., Papatriantafilou, M., &amp; Tsigas, P. (2021). Consistent lock-free parallel stochastic gradient descent for fast and stable convergence. En 2021 IEEE International Parallel and Distributed Processing Symposium (IPDPS) (pp. 423–432). IEEE. </w:t>
-      </w:r>
-      <w:hyperlink r:id="rId36">
-        <w:r>
-          <w:rPr>
-            <w:rFonts w:ascii="Times New Roman" w:eastAsia="Times New Roman" w:hAnsi="Times New Roman" w:cs="Times New Roman"/>
-            <w:color w:val="1155CC"/>
-            <w:sz w:val="24"/>
-            <w:szCs w:val="24"/>
-            <w:u w:val="single"/>
-          </w:rPr>
-          <w:t>https://ieeexplore.ieee.org/document/9460457</w:t>
-        </w:r>
-      </w:hyperlink>
-      <w:r>
-        <w:rPr>
-          <w:rFonts w:ascii="Times New Roman" w:eastAsia="Times New Roman" w:hAnsi="Times New Roman" w:cs="Times New Roman"/>
-          <w:sz w:val="24"/>
-          <w:szCs w:val="24"/>
-        </w:rPr>
-        <w:t xml:space="preserve"> </w:t>
-      </w:r>
-    </w:p>
-    <w:p>
-      <w:pPr>
-        <w:spacing w:after="160"/>
-        <w:jc w:val="both"/>
-        <w:rPr>
-          <w:rFonts w:ascii="Times New Roman" w:eastAsia="Times New Roman" w:hAnsi="Times New Roman" w:cs="Times New Roman"/>
-          <w:sz w:val="24"/>
-          <w:szCs w:val="24"/>
-        </w:rPr>
-      </w:pPr>
-      <w:r>
-        <w:rPr>
-          <w:rFonts w:ascii="Times New Roman" w:eastAsia="Times New Roman" w:hAnsi="Times New Roman" w:cs="Times New Roman"/>
-          <w:sz w:val="24"/>
-          <w:szCs w:val="24"/>
-        </w:rPr>
-        <w:t xml:space="preserve">Jain, R., Singh, M., Rao, A. R., &amp; Garg, R. (2024). Predicting hospital length of stay using machine learning on a large open health dataset. BMC Health Services Research, 24, 860. </w:t>
-      </w:r>
-      <w:hyperlink r:id="rId37">
-        <w:r>
-          <w:rPr>
-            <w:rFonts w:ascii="Times New Roman" w:eastAsia="Times New Roman" w:hAnsi="Times New Roman" w:cs="Times New Roman"/>
-            <w:color w:val="1155CC"/>
-            <w:sz w:val="24"/>
-            <w:szCs w:val="24"/>
-            <w:u w:val="single"/>
-          </w:rPr>
-          <w:t>https://link.springer.com/article/10.1186/s12913-024-11238-y</w:t>
-        </w:r>
-      </w:hyperlink>
-      <w:r>
-        <w:rPr>
-          <w:rFonts w:ascii="Times New Roman" w:eastAsia="Times New Roman" w:hAnsi="Times New Roman" w:cs="Times New Roman"/>
-          <w:sz w:val="24"/>
-          <w:szCs w:val="24"/>
-        </w:rPr>
-        <w:t xml:space="preserve"> </w:t>
-      </w:r>
-    </w:p>
-    <w:p>
-      <w:pPr>
-        <w:spacing w:after="160"/>
-        <w:jc w:val="both"/>
-        <w:rPr>
-          <w:rFonts w:ascii="Times New Roman" w:eastAsia="Times New Roman" w:hAnsi="Times New Roman" w:cs="Times New Roman"/>
-          <w:sz w:val="24"/>
-          <w:szCs w:val="24"/>
-        </w:rPr>
-      </w:pPr>
-      <w:r>
-        <w:rPr>
-          <w:rFonts w:ascii="Times New Roman" w:eastAsia="Times New Roman" w:hAnsi="Times New Roman" w:cs="Times New Roman"/>
-          <w:sz w:val="24"/>
-          <w:szCs w:val="24"/>
-        </w:rPr>
-        <w:t xml:space="preserve">New York State Department of Health. (2024). Hospital inpatient discharges (SPARCS De-Identified): 2022 [Data set]. Health Data NY. </w:t>
-      </w:r>
-      <w:hyperlink r:id="rId38">
-        <w:r>
-          <w:rPr>
-            <w:rFonts w:ascii="Times New Roman" w:eastAsia="Times New Roman" w:hAnsi="Times New Roman" w:cs="Times New Roman"/>
-            <w:color w:val="1155CC"/>
-            <w:sz w:val="24"/>
-            <w:szCs w:val="24"/>
-            <w:u w:val="single"/>
-          </w:rPr>
-          <w:t>https://health.data.ny.gov/Health/Hospital-Inpatient-Discharges-SPARCS-De-Identified/5dtw-tffi/about_data</w:t>
-        </w:r>
-      </w:hyperlink>
-    </w:p>
-    <w:p>
-      <w:pPr>
-        <w:spacing w:after="160"/>
-        <w:jc w:val="both"/>
-        <w:rPr>
-          <w:rFonts w:ascii="Times New Roman" w:eastAsia="Times New Roman" w:hAnsi="Times New Roman" w:cs="Times New Roman"/>
-          <w:sz w:val="24"/>
-          <w:szCs w:val="24"/>
-        </w:rPr>
-      </w:pPr>
-    </w:p>
-    <w:p>
-      <w:pPr>
-        <w:spacing w:after="100"/>
-        <w:jc w:val="both"/>
-        <w:rPr>
-          <w:rFonts w:ascii="Times New Roman" w:eastAsia="Times New Roman" w:hAnsi="Times New Roman" w:cs="Times New Roman"/>
-          <w:sz w:val="24"/>
-          <w:szCs w:val="24"/>
-        </w:rPr>
-      </w:pPr>
-      <w:r>
-        <w:rPr>
-          <w:rFonts w:ascii="Times New Roman" w:eastAsia="Times New Roman" w:hAnsi="Times New Roman" w:cs="Times New Roman"/>
-          <w:sz w:val="24"/>
-          <w:szCs w:val="24"/>
-        </w:rPr>
-        <w:t>Karp, A. H., &amp; Flatt, H. P. (1990). Measuring parallel processor performance. Communications of the ACM, 33(5), 539–543. https://doi.org/10.1145/78607.78614</w:t>
-      </w:r>
-    </w:p>
-    <w:p>
-      <w:pPr>
-        <w:spacing w:after="100"/>
-        <w:jc w:val="both"/>
-        <w:rPr>
-          <w:rFonts w:ascii="Times New Roman" w:eastAsia="Times New Roman" w:hAnsi="Times New Roman" w:cs="Times New Roman"/>
-          <w:sz w:val="24"/>
-          <w:szCs w:val="24"/>
-        </w:rPr>
-      </w:pPr>
-      <w:r>
-        <w:rPr>
-          <w:rFonts w:ascii="Times New Roman" w:eastAsia="Times New Roman" w:hAnsi="Times New Roman" w:cs="Times New Roman"/>
-          <w:sz w:val="24"/>
-          <w:szCs w:val="24"/>
-        </w:rPr>
-        <w:t>Holzmann, G. J. (2003). The SPIN model checker: Primer and reference manual. Addison-Wesley.</w:t>
-      </w:r>
     </w:p>
     <w:sectPr>
       <w:pgSz w:w="11906" w:h="16838"/>

</xml_diff>

<commit_message>
docs(report): refresh GitHub evidence figures and deck after final merge
</commit_message>
<xml_diff>
--- a/Documentos/CC65-TP-202620-U201714492.docx
+++ b/Documentos/CC65-TP-202620-U201714492.docx
@@ -2772,6 +2772,7 @@
           <w:rFonts w:ascii="Times New Roman" w:eastAsia="Times New Roman" w:hAnsi="Times New Roman" w:cs="Times New Roman"/>
           <w:noProof/>
         </w:rPr>
+        <w:lastRenderedPageBreak/>
         <w:t>8.4 Cálculo de media recortada</w:t>
       </w:r>
       <w:r>
@@ -33627,7 +33628,7 @@
           <w:sz w:val="24"/>
           <w:szCs w:val="24"/>
         </w:rPr>
-        <w:t xml:space="preserve">docs/tp-final-delivery: </w:t>
+        <w:t xml:space="preserve">docs/tp-final-delivery (PR #19) y develop → main (PR #20): </w:t>
       </w:r>
       <w:r>
         <w:rPr>
@@ -33654,7 +33655,7 @@
           <w:sz w:val="24"/>
           <w:szCs w:val="24"/>
         </w:rPr>
-        <w:t>Las cuentas de GitHub de los integrantes son Jaed69 (Jhamil Brijan Peña Cardenas), SeuNg720p (José Antonio Mayhua Hinostroza) y YuhiTTo (Lucero Salome Manchay Paredes). La cuenta Littlepie4, que aparece en la Figura 16, registra el commit inicial del repositorio y el merge del PR #2.</w:t>
+        <w:t>Las cuentas de GitHub de los integrantes son Jaed69 (Jhamil Brijan Peña Cardenas), SeuNg720p (José Antonio Mayhua Hinostroza) y YuhiTTo (Lucero Salome Manchay Paredes). Los commits registrados como Littlepie4 en la Figura 16 también corresponden a Lucero Salome Manchay Paredes: GitHub firmó con el correo de esa identidad los merges realizados desde la cuenta YuhiTTo (por ejemplo, el del PR #18).</w:t>
       </w:r>
     </w:p>
     <w:p>
@@ -38010,7 +38011,6 @@
       <w:pPr>
         <w:spacing w:after="160"/>
         <w:ind w:left="720" w:hanging="720"/>
-        <w:jc w:val="left"/>
         <w:rPr>
           <w:rFonts w:ascii="Times New Roman" w:eastAsia="Times New Roman" w:hAnsi="Times New Roman" w:cs="Times New Roman"/>
           <w:sz w:val="24"/>
@@ -38067,7 +38067,6 @@
       <w:pPr>
         <w:spacing w:after="160"/>
         <w:ind w:left="720" w:hanging="720"/>
-        <w:jc w:val="left"/>
         <w:rPr>
           <w:rFonts w:ascii="Times New Roman" w:eastAsia="Times New Roman" w:hAnsi="Times New Roman" w:cs="Times New Roman"/>
           <w:sz w:val="24"/>
@@ -38124,7 +38123,6 @@
       <w:pPr>
         <w:spacing w:after="100"/>
         <w:ind w:left="720" w:hanging="720"/>
-        <w:jc w:val="left"/>
         <w:rPr>
           <w:rFonts w:ascii="Times New Roman" w:eastAsia="Times New Roman" w:hAnsi="Times New Roman" w:cs="Times New Roman"/>
           <w:sz w:val="24"/>
@@ -38162,7 +38160,6 @@
       <w:pPr>
         <w:spacing w:after="160"/>
         <w:ind w:left="720" w:hanging="720"/>
-        <w:jc w:val="left"/>
         <w:rPr>
           <w:rFonts w:ascii="Times New Roman" w:eastAsia="Times New Roman" w:hAnsi="Times New Roman" w:cs="Times New Roman"/>
           <w:sz w:val="24"/>
@@ -38219,7 +38216,6 @@
       <w:pPr>
         <w:spacing w:after="100"/>
         <w:ind w:left="720" w:hanging="720"/>
-        <w:jc w:val="left"/>
         <w:rPr>
           <w:rFonts w:ascii="Times New Roman" w:eastAsia="Times New Roman" w:hAnsi="Times New Roman" w:cs="Times New Roman"/>
           <w:sz w:val="24"/>
@@ -38257,7 +38253,6 @@
       <w:pPr>
         <w:spacing w:after="160"/>
         <w:ind w:left="720" w:hanging="720"/>
-        <w:jc w:val="left"/>
         <w:rPr>
           <w:rFonts w:ascii="Times New Roman" w:eastAsia="Times New Roman" w:hAnsi="Times New Roman" w:cs="Times New Roman"/>
           <w:sz w:val="24"/>
@@ -38306,7 +38301,6 @@
       <w:pPr>
         <w:spacing w:after="160"/>
         <w:ind w:left="720" w:hanging="720"/>
-        <w:jc w:val="left"/>
         <w:rPr>
           <w:rFonts w:ascii="Times New Roman" w:eastAsia="Times New Roman" w:hAnsi="Times New Roman" w:cs="Times New Roman"/>
           <w:sz w:val="24"/>

</xml_diff>